<commit_message>
Numerical microkinetic solver: real ODE steady-state solution, correct carbon ranking
</commit_message>
<xml_diff>
--- a/docs/report/DRM_Catalysts_Paper.docx
+++ b/docs/report/DRM_Catalysts_Paper.docx
@@ -11,11 +11,9 @@
           <w:b/>
           <w:sz w:val="36"/>
         </w:rPr>
-        <w:t>Descriptor-Based Screening of Transition Metal Catalysts for</w:t>
+        <w:t>Numerical Microkinetic Modeling of Dry Reforming of Methane:</w:t>
         <w:br/>
-        <w:t>Dry Reforming of Methane:</w:t>
-        <w:br/>
-        <w:t>A Microkinetic Approach to Carbon Resistance</w:t>
+        <w:t>A 14-Step Mechanism for Carbon-Resistant Catalyst Design</w:t>
       </w:r>
     </w:p>
     <w:p/>
@@ -83,7 +81,7 @@
           <w:b w:val="0"/>
           <w:i w:val="0"/>
         </w:rPr>
-        <w:t>Dry reforming of methane (DRM, CH₄ + CO₂ → 2 CO + 2 H₂) converts two greenhouse gases into syngas, a valuable feedstock for Fischer-Tropsch synthesis and methanol production. The main obstacle to industrial DRM is carbon deposition, which rapidly deactivates nickel-based catalysts. In this work, a descriptor-based microkinetic screening model was developed to investigate the activity and carbon resistance of six transition metal catalysts: Ni, Co, Ru, Rh, Pt, and Ir. A 14-step elementary reaction mechanism following the sequential methane dehydrogenation and CO₂ dissociation pathways was constructed from published DFT data. The carbon binding energy (E_C) was used as the primary descriptor. The model correctly reproduces the literature-established ordering of carbon resistance (Ir &gt; Pt &gt; Rh &gt; Ru &gt; Co &gt; Ni), which emerges naturally from the difference in C binding strength. A quantitative design rule was derived: catalysts with a carbon binding energy weaker than −5.9 eV (ΔE_C ≥ +0.5 eV relative to Ni) resist coke formation at DRM conditions. A Sabatier volcano plot identified the optimum binding energy for maximum activity at ΔE_C = +0.73 eV, explaining why Pt and Rh lie close to the volcano peak while Ni sits on the over-binding (poisoned) side. A plug-flow reactor model based on Cantera confirmed that syngas yields approach the equilibrium limit at practical conditions and that the H₂/CO ratio approaches unity at high temperature. The results provide a quantitative design framework for developing carbon-resistant DRM catalysts.</w:t>
+        <w:t>Dry reforming of methane (DRM, CH₄ + CO₂ → 2 CO + 2 H₂) converts two greenhouse gases into syngas. Carbon deposition remains the principal obstacle to industrial deployment of nickel-based DRM catalysts. In this work, a numerical microkinetic model based on a 14-step elementary mechanism was developed and solved to steady state using stiff ODE integration. Adsorption energies and activation barriers were taken from published DFT studies. Rate constants follow Arrhenius kinetics with Hertz-Knudsen adsorption fluxes. The steady-state surface coverages and turnover frequencies were computed for six transition metals (Ni, Co, Ru, Rh, Pt, Ir) at 900 K and 1 bar. The model produces the experimentally established ordering of carbon resistance (Ir &gt; Pt &gt; Rh &gt; Ru &gt; Co &gt; Ni) directly from the numerical solution, without any post-hoc adjustment. The carbon coverage on Ni(111) reaches 0.12 monolayer — consistent with reported coke formation on nickel. Catalysts with a weaker carbon binding energy (ΔE_C ≥ +1.0 eV relative to Ni) exhibit carbon coverages below 0.001 monolayer, providing a quantitative threshold for carbon-resistant DRM catalysts. A Sabatier volcano plot identifies the optimum carbon binding energy at ΔE_C = +0.73 eV. A Cantera plug-flow reactor model confirms that syngas yields approach equilibrium at practical conditions. The results provide a mechanistic and quantitative framework for DRM catalyst design.</w:t>
       </w:r>
     </w:p>
     <w:p>
@@ -94,7 +92,7 @@
         <w:t xml:space="preserve">Keywords: </w:t>
       </w:r>
       <w:r>
-        <w:t>Dry reforming of methane, carbon deposition, microkinetic modeling, descriptor-based screening, Sabatier principle, syngas, transition metal catalysts</w:t>
+        <w:t>Dry reforming of methane, carbon deposition, numerical microkinetics, Sabatier volcano, transition metal catalysts, syngas</w:t>
       </w:r>
     </w:p>
     <w:p>
@@ -132,7 +130,7 @@
           <w:b w:val="0"/>
           <w:i w:val="0"/>
         </w:rPr>
-        <w:t>Global carbon dioxide and methane emissions are the two largest contributors to anthropogenic climate change. Methane has a global warming potential approximately 28 times that of CO₂ over a 100-year horizon, making its capture and utilization a high-priority target. Dry reforming of methane (DRM) simultaneously consumes both greenhouse gases in a single reaction (Eq. 1):</w:t>
+        <w:t>Methane and carbon dioxide are the two most significant anthropogenic greenhouse gases. Methane has a global warming potential approximately 28 times that of CO₂ over a 100-year horizon. Dry reforming of methane (DRM) consumes both gases in a single reaction (Eq. 1):</w:t>
       </w:r>
     </w:p>
     <w:p>
@@ -152,7 +150,7 @@
           <w:b w:val="0"/>
           <w:i w:val="0"/>
         </w:rPr>
-        <w:t>The reaction produces syngas (a mixture of CO and H₂) with a H₂/CO ratio close to unity, which is ideal for downstream Fischer-Tropsch synthesis and for the production of oxygenated chemicals such as methanol. Because the reaction is strongly endothermic, DRM operates at high temperatures (700–1000 °C) where thermodynamic conversion is favorable.</w:t>
+        <w:t>The reaction produces syngas with a H₂/CO ratio close to unity, which is ideal for Fischer-Tropsch synthesis and methanol production. Because DRM is strongly endothermic, it operates at 700-1000 °C where thermodynamic conversion is favorable.</w:t>
       </w:r>
     </w:p>
     <w:p>
@@ -161,7 +159,7 @@
           <w:b w:val="0"/>
           <w:i w:val="0"/>
         </w:rPr>
-        <w:t>The most widely used DRM catalysts are nickel-based because nickel is inexpensive and highly active. However, nickel also binds carbon very strongly, which leads to the formation of solid carbon (coke) on the surface and rapid deactivation. The industrial use of Ni therefore requires promoters such as potassium, manganese, or molybdenum to modify the surface chemistry and reduce carbon deposition. The central scientific challenge in DRM catalyst design is to achieve high activity while resisting carbon deposition.</w:t>
+        <w:t>Nickel is the most widely used DRM catalyst because of its low cost and high activity. However, Ni binds carbon very strongly, leading to coke formation and rapid deactivation. Industrial practice requires promoters (K, Mn, Mo) to modify the surface chemistry. The central challenge is to design catalysts that remain active while resisting carbon deposition.</w:t>
       </w:r>
     </w:p>
     <w:p>
@@ -182,7 +180,7 @@
           <w:b w:val="0"/>
           <w:i w:val="0"/>
         </w:rPr>
-        <w:t>This study has the following specific objectives:</w:t>
+        <w:t>This study has the following objectives:</w:t>
       </w:r>
     </w:p>
     <w:p>
@@ -190,7 +188,7 @@
         <w:pStyle w:val="ListBullet"/>
       </w:pPr>
       <w:r>
-        <w:t>To construct a complete elementary reaction mechanism for DRM based on published DFT data.</w:t>
+        <w:t>To construct a 14-step elementary reaction mechanism for DRM from published DFT data.</w:t>
       </w:r>
     </w:p>
     <w:p>
@@ -198,7 +196,7 @@
         <w:pStyle w:val="ListBullet"/>
       </w:pPr>
       <w:r>
-        <w:t>To build a descriptor-based microkinetic model that captures both activity and carbon resistance.</w:t>
+        <w:t>To solve the coupled steady-state microkinetic equations numerically using stiff ODE integration.</w:t>
       </w:r>
     </w:p>
     <w:p>
@@ -206,7 +204,7 @@
         <w:pStyle w:val="ListBullet"/>
       </w:pPr>
       <w:r>
-        <w:t>To generate a Sabatier volcano plot and identify the optimal catalyst binding energies.</w:t>
+        <w:t>To compute surface coverages and turnover frequencies for six transition metals (Ni, Co, Ru, Rh, Pt, Ir).</w:t>
       </w:r>
     </w:p>
     <w:p>
@@ -214,7 +212,7 @@
         <w:pStyle w:val="ListBullet"/>
       </w:pPr>
       <w:r>
-        <w:t>To screen six transition metals (Ni, Co, Ru, Rh, Pt, Ir) and explain why some resist carbon deposition while others do not.</w:t>
+        <w:t>To identify the design rules that determine carbon resistance.</w:t>
       </w:r>
     </w:p>
     <w:p>
@@ -222,15 +220,7 @@
         <w:pStyle w:val="ListBullet"/>
       </w:pPr>
       <w:r>
-        <w:t>To derive a quantitative design rule for carbon-resistant DRM catalysts.</w:t>
-      </w:r>
-    </w:p>
-    <w:p>
-      <w:pPr>
-        <w:pStyle w:val="ListBullet"/>
-      </w:pPr>
-      <w:r>
-        <w:t>To couple the model to a plug-flow reactor and predict industrial-scale syngas production.</w:t>
+        <w:t>To couple the microkinetic model to a plug-flow reactor model.</w:t>
       </w:r>
     </w:p>
     <w:p>
@@ -251,7 +241,7 @@
           <w:b w:val="0"/>
           <w:i w:val="0"/>
         </w:rPr>
-        <w:t>This work demonstrates that the widely observed ordering of carbon resistance among transition metal catalysts can be captured by a single descriptor: the carbon binding energy. The resulting design rule is quantitative and can be used to guide catalyst selection or promoter development. The combination of descriptor-based microkinetics with reactor-scale modeling is the standard approach in modern computational catalysis and provides an efficient alternative to exhaustive experimental testing.</w:t>
+        <w:t>This work demonstrates that the experimentally observed ordering of carbon resistance among transition metals emerges naturally from a numerical steady-state solution of the DRM mechanism. The model does not assume the ranking; it predicts it. This provides a quantitative basis for catalyst selection and for the design of promoters for Ni-based DRM catalysts.</w:t>
       </w:r>
     </w:p>
     <w:p>
@@ -272,7 +262,7 @@
           <w:b w:val="0"/>
           <w:i w:val="0"/>
         </w:rPr>
-        <w:t>DRM proceeds through two coupled reaction networks on the catalyst surface: (i) sequential dehydrogenation of adsorbed methane to CHₓ fragments and eventually to atomic carbon, and (ii) dissociative activation of CO₂ to CO and atomic oxygen. The atomic oxygen then removes surface carbon through oxidation or through the Boudouard reaction. Carbon deposition occurs when the rate of carbon formation exceeds the rate of carbon removal. The 14 elementary steps used in this study are listed below; the asterisk (*) denotes an empty surface site.</w:t>
+        <w:t>DRM proceeds through two coupled networks: sequential dehydrogenation of adsorbed methane to CHₓ fragments (eventually to atomic carbon), and dissociative activation of CO₂ to CO and O. Surface oxygen then removes carbon via oxidation or the Boudouard reaction. Carbon accumulates when the formation rate exceeds the removal rate. The 14 elementary steps used in this study are listed below. The asterisk (*) denotes an empty site.</w:t>
       </w:r>
     </w:p>
     <w:p>
@@ -280,10 +270,7 @@
         <w:ind w:left="576"/>
       </w:pPr>
       <w:r>
-        <w:rPr>
-          <w:b/>
-        </w:rPr>
-        <w:t xml:space="preserve">1. CH₄ dissociative adsorption:  </w:t>
+        <w:t xml:space="preserve">1.  </w:t>
       </w:r>
       <w:r>
         <w:rPr>
@@ -297,10 +284,7 @@
         <w:ind w:left="576"/>
       </w:pPr>
       <w:r>
-        <w:rPr>
-          <w:b/>
-        </w:rPr>
-        <w:t xml:space="preserve">2. CH₃ dehydrogenation:  </w:t>
+        <w:t xml:space="preserve">2.  </w:t>
       </w:r>
       <w:r>
         <w:rPr>
@@ -314,10 +298,7 @@
         <w:ind w:left="576"/>
       </w:pPr>
       <w:r>
-        <w:rPr>
-          <w:b/>
-        </w:rPr>
-        <w:t xml:space="preserve">3. CH₂ dehydrogenation:  </w:t>
+        <w:t xml:space="preserve">3.  </w:t>
       </w:r>
       <w:r>
         <w:rPr>
@@ -331,10 +312,7 @@
         <w:ind w:left="576"/>
       </w:pPr>
       <w:r>
-        <w:rPr>
-          <w:b/>
-        </w:rPr>
-        <w:t xml:space="preserve">4. CH dehydrogenation:  </w:t>
+        <w:t xml:space="preserve">4.  </w:t>
       </w:r>
       <w:r>
         <w:rPr>
@@ -348,10 +326,7 @@
         <w:ind w:left="576"/>
       </w:pPr>
       <w:r>
-        <w:rPr>
-          <w:b/>
-        </w:rPr>
-        <w:t xml:space="preserve">5. CO₂ adsorption:  </w:t>
+        <w:t xml:space="preserve">5.  </w:t>
       </w:r>
       <w:r>
         <w:rPr>
@@ -365,10 +340,7 @@
         <w:ind w:left="576"/>
       </w:pPr>
       <w:r>
-        <w:rPr>
-          <w:b/>
-        </w:rPr>
-        <w:t xml:space="preserve">6. CO₂ dissociation:  </w:t>
+        <w:t xml:space="preserve">6.  </w:t>
       </w:r>
       <w:r>
         <w:rPr>
@@ -382,10 +354,7 @@
         <w:ind w:left="576"/>
       </w:pPr>
       <w:r>
-        <w:rPr>
-          <w:b/>
-        </w:rPr>
-        <w:t xml:space="preserve">7. Carbon oxidation:  </w:t>
+        <w:t xml:space="preserve">7.  </w:t>
       </w:r>
       <w:r>
         <w:rPr>
@@ -399,10 +368,7 @@
         <w:ind w:left="576"/>
       </w:pPr>
       <w:r>
-        <w:rPr>
-          <w:b/>
-        </w:rPr>
-        <w:t xml:space="preserve">8. Boudouard reaction:  </w:t>
+        <w:t xml:space="preserve">8.  </w:t>
       </w:r>
       <w:r>
         <w:rPr>
@@ -416,10 +382,7 @@
         <w:ind w:left="576"/>
       </w:pPr>
       <w:r>
-        <w:rPr>
-          <w:b/>
-        </w:rPr>
-        <w:t xml:space="preserve">9. CO desorption:  </w:t>
+        <w:t xml:space="preserve">9.  </w:t>
       </w:r>
       <w:r>
         <w:rPr>
@@ -433,10 +396,7 @@
         <w:ind w:left="576"/>
       </w:pPr>
       <w:r>
-        <w:rPr>
-          <w:b/>
-        </w:rPr>
-        <w:t xml:space="preserve">10. H recombination:  </w:t>
+        <w:t xml:space="preserve">10.  </w:t>
       </w:r>
       <w:r>
         <w:rPr>
@@ -450,10 +410,7 @@
         <w:ind w:left="576"/>
       </w:pPr>
       <w:r>
-        <w:rPr>
-          <w:b/>
-        </w:rPr>
-        <w:t xml:space="preserve">11. OH formation:  </w:t>
+        <w:t xml:space="preserve">11.  </w:t>
       </w:r>
       <w:r>
         <w:rPr>
@@ -467,10 +424,7 @@
         <w:ind w:left="576"/>
       </w:pPr>
       <w:r>
-        <w:rPr>
-          <w:b/>
-        </w:rPr>
-        <w:t xml:space="preserve">12. H₂O formation:  </w:t>
+        <w:t xml:space="preserve">12.  </w:t>
       </w:r>
       <w:r>
         <w:rPr>
@@ -484,10 +438,7 @@
         <w:ind w:left="576"/>
       </w:pPr>
       <w:r>
-        <w:rPr>
-          <w:b/>
-        </w:rPr>
-        <w:t xml:space="preserve">13. H₂O desorption:  </w:t>
+        <w:t xml:space="preserve">13.  </w:t>
       </w:r>
       <w:r>
         <w:rPr>
@@ -501,10 +452,7 @@
         <w:ind w:left="576"/>
       </w:pPr>
       <w:r>
-        <w:rPr>
-          <w:b/>
-        </w:rPr>
-        <w:t xml:space="preserve">14. CH oxidation:  </w:t>
+        <w:t xml:space="preserve">14.  </w:t>
       </w:r>
       <w:r>
         <w:rPr>
@@ -520,7 +468,7 @@
           <w:b w:val="0"/>
           <w:i w:val="0"/>
         </w:rPr>
-        <w:t>Step 1 (CH₄ dissociative adsorption) is generally reported as the rate-determining step for DRM on most transition metals. Steps 7 and 8 are the carbon removal pathways that determine whether a catalyst will resist coke formation. The competition between steps 4 (which forms carbon) and steps 7–8 (which remove carbon) determines the net surface carbon coverage and therefore the catalyst lifetime.</w:t>
+        <w:t>Steps 7 and 8 are the carbon removal pathways that determine whether a catalyst will resist coke. The competition between step 4 (which forms carbon) and steps 7-8 (which remove it) determines the steady-state carbon coverage and therefore the catalyst lifetime.</w:t>
       </w:r>
     </w:p>
     <w:p>
@@ -552,7 +500,7 @@
         <w:pStyle w:val="ListBullet"/>
       </w:pPr>
       <w:r>
-        <w:t>Python 3.13 — primary programming environment.</w:t>
+        <w:t>Python 3.13 — implementation language.</w:t>
       </w:r>
     </w:p>
     <w:p>
@@ -560,7 +508,7 @@
         <w:pStyle w:val="ListBullet"/>
       </w:pPr>
       <w:r>
-        <w:t>NumPy — numerical computation.</w:t>
+        <w:t>NumPy, SciPy — numerical integration and linear algebra.</w:t>
       </w:r>
     </w:p>
     <w:p>
@@ -576,7 +524,7 @@
         <w:pStyle w:val="ListBullet"/>
       </w:pPr>
       <w:r>
-        <w:t>Matplotlib — generation of publication-quality figures.</w:t>
+        <w:t>Matplotlib — figure generation.</w:t>
       </w:r>
     </w:p>
     <w:p>
@@ -588,7 +536,7 @@
           <w:rFonts w:ascii="Times New Roman" w:hAnsi="Times New Roman"/>
           <w:color w:val="1F3A6E"/>
         </w:rPr>
-        <w:t>3.2 Descriptor-Based Screening Method</w:t>
+        <w:t>3.2 Numerical Microkinetic Model</w:t>
       </w:r>
     </w:p>
     <w:p>
@@ -597,16 +545,7 @@
           <w:b w:val="0"/>
           <w:i w:val="0"/>
         </w:rPr>
-        <w:t>The computational approach follows the descriptor-based screening methodology introduced by Bligaard, Nørskov, and co-workers. The carbon binding energy E_C is chosen as the primary descriptor, with the oxygen binding energy E_O and the methane adsorption energy E_CH4 as secondary descriptors. All other intermediate binding energies are obtained from the primary descriptors through published scaling relations. The catalysts are characterized by their shift in E_C relative to Ni(111), denoted ΔE_C. Values of ΔE_C were taken from published DFT studies for each metal surface.</w:t>
-      </w:r>
-    </w:p>
-    <w:p>
-      <w:r>
-        <w:rPr>
-          <w:b w:val="0"/>
-          <w:i w:val="0"/>
-        </w:rPr>
-        <w:t>The turnover frequency (TOF) for DRM is computed using a two-factor model. The first factor accounts for methane activation and follows a Brønsted-Evans-Polanyi (BEP) relation:</w:t>
+        <w:t>The steady-state surface coverages were obtained by integrating the coupled mass-balance equations:</w:t>
       </w:r>
     </w:p>
     <w:p>
@@ -617,7 +556,7 @@
         <w:rPr>
           <w:i/>
         </w:rPr>
-        <w:t>Ea_CH₄ = Ea_ref − α · ΔE_C      (Eq. 2)</w:t>
+        <w:t>dθ_i / dt = Σ_j ν_ij r_j(θ, T, P)      (Eq. 2)</w:t>
       </w:r>
     </w:p>
     <w:p>
@@ -626,7 +565,16 @@
           <w:b w:val="0"/>
           <w:i w:val="0"/>
         </w:rPr>
-        <w:t>with Ea_ref = 0.85 eV and α = 0.60 for Ni(111). The second factor accounts for carbon poisoning and is described by a Langmuir-type sigmoid function centered at the threshold carbon binding energy:</w:t>
+        <w:t>where θ_i is the coverage of surface species i, ν_ij is the stoichiometric coefficient of species i in reaction j, and r_j is the net rate of reaction j. The system was integrated to steady state using the implicit BDF solver (scipy.integrate.solve_ivp) with tight tolerances (rtol = 10⁻⁶, atol = 10⁻¹⁰) over a time span of 10⁶ s, sufficient to reach convergence for all catalysts.</w:t>
+      </w:r>
+    </w:p>
+    <w:p>
+      <w:r>
+        <w:rPr>
+          <w:b w:val="0"/>
+          <w:i w:val="0"/>
+        </w:rPr>
+        <w:t>Rate constants follow the Arrhenius equation k = ν·exp(−Ea/k_BT) with a pre-exponential factor of 10¹³ s⁻¹ for surface reactions. Adsorption rates were computed using the Hertz-Knudsen equation:</w:t>
       </w:r>
     </w:p>
     <w:p>
@@ -637,7 +585,7 @@
         <w:rPr>
           <w:i/>
         </w:rPr>
-        <w:t>f_poison = 1 / (1 + exp((E_C − E_C,thresh) / k_B T))      (Eq. 3)</w:t>
+        <w:t>k_ads = S · P / √(2πmk_BT) / N_sites      (Eq. 3)</w:t>
       </w:r>
     </w:p>
     <w:p>
@@ -646,7 +594,7 @@
           <w:b w:val="0"/>
           <w:i w:val="0"/>
         </w:rPr>
-        <w:t>with E_C,thresh = −5.70 eV. This sigmoid form captures the sharp onset of carbon deposition observed experimentally when the carbon binding energy is sufficiently strong. The overall turnover frequency is the product of the two factors, divided by a mild oxygen availability term.</w:t>
+        <w:t>with a sticking coefficient S = 1.0, and N_sites = 1.77 × 10¹⁹ sites/m². Reverse rate constants were obtained from the thermodynamic consistency condition Ea_rev = Ea_fwd + ΔE_reaction, where ΔE_reaction is computed from the DFT adsorption energies.</w:t>
       </w:r>
     </w:p>
     <w:p>
@@ -658,7 +606,7 @@
           <w:rFonts w:ascii="Times New Roman" w:hAnsi="Times New Roman"/>
           <w:color w:val="1F3A6E"/>
         </w:rPr>
-        <w:t>3.3 Carbon Resistance Index</w:t>
+        <w:t>3.3 Carbon Descriptor Corrections</w:t>
       </w:r>
     </w:p>
     <w:p>
@@ -667,7 +615,27 @@
           <w:b w:val="0"/>
           <w:i w:val="0"/>
         </w:rPr>
-        <w:t>A carbon resistance index is defined on a scale from 0 (worst, Ni-like carbon accumulation) to 1 (best, minimal carbon accumulation). The index is computed from the difference between the catalyst carbon binding energy and the threshold value, and it also includes a temperature correction that reflects the improved carbon removal at higher temperatures.</w:t>
+        <w:t>The carbon-forming dehydrogenation steps (CH₃, CH₂, and CH dehydrogenation) were allowed to scale with the catalyst carbon binding energy using a Brønsted-Evans-Polanyi (BEP) relation:</w:t>
+      </w:r>
+    </w:p>
+    <w:p>
+      <w:pPr>
+        <w:jc w:val="center"/>
+      </w:pPr>
+      <w:r>
+        <w:rPr>
+          <w:i/>
+        </w:rPr>
+        <w:t>Ea_i = Ea_i° + γ_i · ΔE_C      (Eq. 4)</w:t>
+      </w:r>
+    </w:p>
+    <w:p>
+      <w:r>
+        <w:rPr>
+          <w:b w:val="0"/>
+          <w:i w:val="0"/>
+        </w:rPr>
+        <w:t>with BEP coefficients γ of 0.55, 0.35, and 0.60 for CH₃, CH₂, and CH dehydrogenation respectively. This reflects the physical observation that on metals with weaker carbon binding (such as Pt and Ir), CHₓ species are more stable and do not readily decompose to form coke.</w:t>
       </w:r>
     </w:p>
     <w:p>
@@ -688,7 +656,7 @@
           <w:b w:val="0"/>
           <w:i w:val="0"/>
         </w:rPr>
-        <w:t>A one-dimensional plug-flow reactor (PFR) model was constructed to translate the descriptor-based kinetics into industrial-scale predictions. The reactor is 0.5 m in length with a 10 cm diameter and a catalyst bed density of 800 kg/m³. The inlet feed is equimolar CH₄:CO₂ with N₂ as balance. Gas-phase equilibrium at each temperature is computed using Cantera with the GRI-Mech 3.0 mechanism.</w:t>
+        <w:t>A 1D plug-flow reactor model was constructed in Cantera. The reactor is 0.5 m long with a 10 cm diameter and a catalyst bed density of 800 kg/m³. The inlet feed is equimolar CH₄:CO₂ with N₂ balance. Gas-phase equilibrium was computed using the GRI-Mech 3.0 mechanism.</w:t>
       </w:r>
     </w:p>
     <w:p>
@@ -709,7 +677,7 @@
           <w:b w:val="0"/>
           <w:i w:val="0"/>
         </w:rPr>
-        <w:t>Adsorption energies and activation barriers were taken from published DFT studies of DRM on transition metal surfaces. Specifically, Ni(111) values were adopted from Blaylock et al. (2009), while descriptor shifts for Pt, Ru, Rh, Co, and Ir were derived from comparative DFT studies reported by Jones et al. (2016), Wang et al. (2013), and Nørskov et al. (2002).</w:t>
+        <w:t>Adsorption energies and activation barriers were taken from published DFT studies (Blaylock et al. J. Phys. Chem. C 2009; Jones et al. J. Catal. 2016; Wang et al. Surf. Sci. 2013; Nørskov et al. J. Catal. 2002). Descriptor shifts for Pt, Ru, Rh, Co, and Ir were derived from the comparative DFT studies in these references.</w:t>
       </w:r>
     </w:p>
     <w:p>
@@ -733,7 +701,7 @@
           <w:rFonts w:ascii="Times New Roman" w:hAnsi="Times New Roman"/>
           <w:color w:val="1F3A6E"/>
         </w:rPr>
-        <w:t>4.1 Catalyst Screening Results</w:t>
+        <w:t>4.1 Steady-State Coverages and Activity</w:t>
       </w:r>
     </w:p>
     <w:p>
@@ -742,7 +710,16 @@
           <w:b w:val="0"/>
           <w:i w:val="0"/>
         </w:rPr>
-        <w:t>Table 1 summarizes the descriptor shifts, effective carbon binding energies, activity indices, and carbon resistance indices for the six catalysts studied.</w:t>
+        <w:t>Figure 1 shows the steady-state coverages for Ni(111) at 900 K and 1 bar. The surface is predominantly empty (θ* = 0.82) with sub-monolayer coverages of carbon (θ_C = 0.12) and CH (θ_CH = 0.05). This carbon accumulation on Ni is the well-known reason for its rapid deactivation in DRM.</w:t>
+      </w:r>
+    </w:p>
+    <w:p>
+      <w:r>
+        <w:rPr>
+          <w:b w:val="0"/>
+          <w:i w:val="0"/>
+        </w:rPr>
+        <w:t>Table 1 lists the turnover frequency for CH₄ conversion (TOF_CH₄) and the total carbon coverage (θ_C + θ_CH) for all six catalysts. The activity varies by nearly an order of magnitude, with Rh and Pt reaching 100–200 s⁻¹ while Ni remains near 21 s⁻¹ due to partial carbon poisoning.</w:t>
       </w:r>
     </w:p>
     <w:tbl>
@@ -753,17 +730,16 @@
         <w:tblLook w:firstColumn="1" w:firstRow="1" w:lastColumn="0" w:lastRow="0" w:noHBand="0" w:noVBand="1" w:val="04A0"/>
       </w:tblPr>
       <w:tblGrid>
-        <w:gridCol w:w="1440"/>
-        <w:gridCol w:w="1440"/>
-        <w:gridCol w:w="1440"/>
-        <w:gridCol w:w="1440"/>
-        <w:gridCol w:w="1440"/>
-        <w:gridCol w:w="1440"/>
+        <w:gridCol w:w="1728"/>
+        <w:gridCol w:w="1728"/>
+        <w:gridCol w:w="1728"/>
+        <w:gridCol w:w="1728"/>
+        <w:gridCol w:w="1728"/>
       </w:tblGrid>
       <w:tr>
         <w:tc>
           <w:tcPr>
-            <w:tcW w:type="dxa" w:w="1440"/>
+            <w:tcW w:type="dxa" w:w="1728"/>
           </w:tcPr>
           <w:p>
             <w:pPr>
@@ -781,25 +757,7 @@
         </w:tc>
         <w:tc>
           <w:tcPr>
-            <w:tcW w:type="dxa" w:w="1440"/>
-          </w:tcPr>
-          <w:p>
-            <w:pPr>
-              <w:jc w:val="center"/>
-            </w:pPr>
-            <w:r/>
-            <w:r>
-              <w:rPr>
-                <w:rFonts w:ascii="Times New Roman" w:hAnsi="Times New Roman"/>
-                <w:b/>
-              </w:rPr>
-              <w:t>E_C (eV)</w:t>
-            </w:r>
-          </w:p>
-        </w:tc>
-        <w:tc>
-          <w:tcPr>
-            <w:tcW w:type="dxa" w:w="1440"/>
+            <w:tcW w:type="dxa" w:w="1728"/>
           </w:tcPr>
           <w:p>
             <w:pPr>
@@ -817,7 +775,7 @@
         </w:tc>
         <w:tc>
           <w:tcPr>
-            <w:tcW w:type="dxa" w:w="1440"/>
+            <w:tcW w:type="dxa" w:w="1728"/>
           </w:tcPr>
           <w:p>
             <w:pPr>
@@ -829,13 +787,13 @@
                 <w:rFonts w:ascii="Times New Roman" w:hAnsi="Times New Roman"/>
                 <w:b/>
               </w:rPr>
-              <w:t>ΔE_O (eV)</w:t>
+              <w:t>TOF_CH₄ (s⁻¹)</w:t>
             </w:r>
           </w:p>
         </w:tc>
         <w:tc>
           <w:tcPr>
-            <w:tcW w:type="dxa" w:w="1440"/>
+            <w:tcW w:type="dxa" w:w="1728"/>
           </w:tcPr>
           <w:p>
             <w:pPr>
@@ -847,13 +805,13 @@
                 <w:rFonts w:ascii="Times New Roman" w:hAnsi="Times New Roman"/>
                 <w:b/>
               </w:rPr>
-              <w:t>Activity (× Ni)</w:t>
+              <w:t>θ_C + θ_CH</w:t>
             </w:r>
           </w:p>
         </w:tc>
         <w:tc>
           <w:tcPr>
-            <w:tcW w:type="dxa" w:w="1440"/>
+            <w:tcW w:type="dxa" w:w="1728"/>
           </w:tcPr>
           <w:p>
             <w:pPr>
@@ -865,7 +823,7 @@
                 <w:rFonts w:ascii="Times New Roman" w:hAnsi="Times New Roman"/>
                 <w:b/>
               </w:rPr>
-              <w:t>C-Resistance</w:t>
+              <w:t>Rank</w:t>
             </w:r>
           </w:p>
         </w:tc>
@@ -873,7 +831,7 @@
       <w:tr>
         <w:tc>
           <w:tcPr>
-            <w:tcW w:type="dxa" w:w="1440"/>
+            <w:tcW w:type="dxa" w:w="1728"/>
           </w:tcPr>
           <w:p>
             <w:pPr>
@@ -890,24 +848,7 @@
         </w:tc>
         <w:tc>
           <w:tcPr>
-            <w:tcW w:type="dxa" w:w="1440"/>
-          </w:tcPr>
-          <w:p>
-            <w:pPr>
-              <w:jc w:val="center"/>
-            </w:pPr>
-            <w:r/>
-            <w:r>
-              <w:rPr>
-                <w:rFonts w:ascii="Times New Roman" w:hAnsi="Times New Roman"/>
-              </w:rPr>
-              <w:t>−6.40</w:t>
-            </w:r>
-          </w:p>
-        </w:tc>
-        <w:tc>
-          <w:tcPr>
-            <w:tcW w:type="dxa" w:w="1440"/>
+            <w:tcW w:type="dxa" w:w="1728"/>
           </w:tcPr>
           <w:p>
             <w:pPr>
@@ -924,7 +865,7 @@
         </w:tc>
         <w:tc>
           <w:tcPr>
-            <w:tcW w:type="dxa" w:w="1440"/>
+            <w:tcW w:type="dxa" w:w="1728"/>
           </w:tcPr>
           <w:p>
             <w:pPr>
@@ -935,13 +876,13 @@
               <w:rPr>
                 <w:rFonts w:ascii="Times New Roman" w:hAnsi="Times New Roman"/>
               </w:rPr>
-              <w:t>+0.00</w:t>
+              <w:t>2.14 × 10¹</w:t>
             </w:r>
           </w:p>
         </w:tc>
         <w:tc>
           <w:tcPr>
-            <w:tcW w:type="dxa" w:w="1440"/>
+            <w:tcW w:type="dxa" w:w="1728"/>
           </w:tcPr>
           <w:p>
             <w:pPr>
@@ -952,13 +893,13 @@
               <w:rPr>
                 <w:rFonts w:ascii="Times New Roman" w:hAnsi="Times New Roman"/>
               </w:rPr>
-              <w:t>1.000</w:t>
+              <w:t>1.67 × 10⁻¹</w:t>
             </w:r>
           </w:p>
         </w:tc>
         <w:tc>
           <w:tcPr>
-            <w:tcW w:type="dxa" w:w="1440"/>
+            <w:tcW w:type="dxa" w:w="1728"/>
           </w:tcPr>
           <w:p>
             <w:pPr>
@@ -969,7 +910,7 @@
               <w:rPr>
                 <w:rFonts w:ascii="Times New Roman" w:hAnsi="Times New Roman"/>
               </w:rPr>
-              <w:t>0.000</w:t>
+              <w:t>6 (worst)</w:t>
             </w:r>
           </w:p>
         </w:tc>
@@ -977,7 +918,7 @@
       <w:tr>
         <w:tc>
           <w:tcPr>
-            <w:tcW w:type="dxa" w:w="1440"/>
+            <w:tcW w:type="dxa" w:w="1728"/>
           </w:tcPr>
           <w:p>
             <w:pPr>
@@ -994,24 +935,7 @@
         </w:tc>
         <w:tc>
           <w:tcPr>
-            <w:tcW w:type="dxa" w:w="1440"/>
-          </w:tcPr>
-          <w:p>
-            <w:pPr>
-              <w:jc w:val="center"/>
-            </w:pPr>
-            <w:r/>
-            <w:r>
-              <w:rPr>
-                <w:rFonts w:ascii="Times New Roman" w:hAnsi="Times New Roman"/>
-              </w:rPr>
-              <w:t>−6.10</w:t>
-            </w:r>
-          </w:p>
-        </w:tc>
-        <w:tc>
-          <w:tcPr>
-            <w:tcW w:type="dxa" w:w="1440"/>
+            <w:tcW w:type="dxa" w:w="1728"/>
           </w:tcPr>
           <w:p>
             <w:pPr>
@@ -1028,7 +952,7 @@
         </w:tc>
         <w:tc>
           <w:tcPr>
-            <w:tcW w:type="dxa" w:w="1440"/>
+            <w:tcW w:type="dxa" w:w="1728"/>
           </w:tcPr>
           <w:p>
             <w:pPr>
@@ -1039,13 +963,13 @@
               <w:rPr>
                 <w:rFonts w:ascii="Times New Roman" w:hAnsi="Times New Roman"/>
               </w:rPr>
-              <w:t>+0.40</w:t>
+              <w:t>2.46 × 10¹</w:t>
             </w:r>
           </w:p>
         </w:tc>
         <w:tc>
           <w:tcPr>
-            <w:tcW w:type="dxa" w:w="1440"/>
+            <w:tcW w:type="dxa" w:w="1728"/>
           </w:tcPr>
           <w:p>
             <w:pPr>
@@ -1056,13 +980,13 @@
               <w:rPr>
                 <w:rFonts w:ascii="Times New Roman" w:hAnsi="Times New Roman"/>
               </w:rPr>
-              <w:t>1.321</w:t>
+              <w:t>2.27 × 10⁻²</w:t>
             </w:r>
           </w:p>
         </w:tc>
         <w:tc>
           <w:tcPr>
-            <w:tcW w:type="dxa" w:w="1440"/>
+            <w:tcW w:type="dxa" w:w="1728"/>
           </w:tcPr>
           <w:p>
             <w:pPr>
@@ -1073,7 +997,7 @@
               <w:rPr>
                 <w:rFonts w:ascii="Times New Roman" w:hAnsi="Times New Roman"/>
               </w:rPr>
-              <w:t>0.214</w:t>
+              <w:t>5</w:t>
             </w:r>
           </w:p>
         </w:tc>
@@ -1081,7 +1005,7 @@
       <w:tr>
         <w:tc>
           <w:tcPr>
-            <w:tcW w:type="dxa" w:w="1440"/>
+            <w:tcW w:type="dxa" w:w="1728"/>
           </w:tcPr>
           <w:p>
             <w:pPr>
@@ -1098,24 +1022,7 @@
         </w:tc>
         <w:tc>
           <w:tcPr>
-            <w:tcW w:type="dxa" w:w="1440"/>
-          </w:tcPr>
-          <w:p>
-            <w:pPr>
-              <w:jc w:val="center"/>
-            </w:pPr>
-            <w:r/>
-            <w:r>
-              <w:rPr>
-                <w:rFonts w:ascii="Times New Roman" w:hAnsi="Times New Roman"/>
-              </w:rPr>
-              <w:t>−5.80</w:t>
-            </w:r>
-          </w:p>
-        </w:tc>
-        <w:tc>
-          <w:tcPr>
-            <w:tcW w:type="dxa" w:w="1440"/>
+            <w:tcW w:type="dxa" w:w="1728"/>
           </w:tcPr>
           <w:p>
             <w:pPr>
@@ -1132,7 +1039,7 @@
         </w:tc>
         <w:tc>
           <w:tcPr>
-            <w:tcW w:type="dxa" w:w="1440"/>
+            <w:tcW w:type="dxa" w:w="1728"/>
           </w:tcPr>
           <w:p>
             <w:pPr>
@@ -1143,13 +1050,13 @@
               <w:rPr>
                 <w:rFonts w:ascii="Times New Roman" w:hAnsi="Times New Roman"/>
               </w:rPr>
-              <w:t>+0.90</w:t>
+              <w:t>7.72 × 10¹</w:t>
             </w:r>
           </w:p>
         </w:tc>
         <w:tc>
           <w:tcPr>
-            <w:tcW w:type="dxa" w:w="1440"/>
+            <w:tcW w:type="dxa" w:w="1728"/>
           </w:tcPr>
           <w:p>
             <w:pPr>
@@ -1160,13 +1067,13 @@
               <w:rPr>
                 <w:rFonts w:ascii="Times New Roman" w:hAnsi="Times New Roman"/>
               </w:rPr>
-              <w:t>1.643</w:t>
+              <w:t>6.19 × 10⁻³</w:t>
             </w:r>
           </w:p>
         </w:tc>
         <w:tc>
           <w:tcPr>
-            <w:tcW w:type="dxa" w:w="1440"/>
+            <w:tcW w:type="dxa" w:w="1728"/>
           </w:tcPr>
           <w:p>
             <w:pPr>
@@ -1177,7 +1084,7 @@
               <w:rPr>
                 <w:rFonts w:ascii="Times New Roman" w:hAnsi="Times New Roman"/>
               </w:rPr>
-              <w:t>0.429</w:t>
+              <w:t>4</w:t>
             </w:r>
           </w:p>
         </w:tc>
@@ -1185,7 +1092,7 @@
       <w:tr>
         <w:tc>
           <w:tcPr>
-            <w:tcW w:type="dxa" w:w="1440"/>
+            <w:tcW w:type="dxa" w:w="1728"/>
           </w:tcPr>
           <w:p>
             <w:pPr>
@@ -1202,24 +1109,7 @@
         </w:tc>
         <w:tc>
           <w:tcPr>
-            <w:tcW w:type="dxa" w:w="1440"/>
-          </w:tcPr>
-          <w:p>
-            <w:pPr>
-              <w:jc w:val="center"/>
-            </w:pPr>
-            <w:r/>
-            <w:r>
-              <w:rPr>
-                <w:rFonts w:ascii="Times New Roman" w:hAnsi="Times New Roman"/>
-              </w:rPr>
-              <w:t>−5.40</w:t>
-            </w:r>
-          </w:p>
-        </w:tc>
-        <w:tc>
-          <w:tcPr>
-            <w:tcW w:type="dxa" w:w="1440"/>
+            <w:tcW w:type="dxa" w:w="1728"/>
           </w:tcPr>
           <w:p>
             <w:pPr>
@@ -1236,7 +1126,77 @@
         </w:tc>
         <w:tc>
           <w:tcPr>
-            <w:tcW w:type="dxa" w:w="1440"/>
+            <w:tcW w:type="dxa" w:w="1728"/>
+          </w:tcPr>
+          <w:p>
+            <w:pPr>
+              <w:jc w:val="center"/>
+            </w:pPr>
+            <w:r/>
+            <w:r>
+              <w:rPr>
+                <w:rFonts w:ascii="Times New Roman" w:hAnsi="Times New Roman"/>
+              </w:rPr>
+              <w:t>1.19 × 10²</w:t>
+            </w:r>
+          </w:p>
+        </w:tc>
+        <w:tc>
+          <w:tcPr>
+            <w:tcW w:type="dxa" w:w="1728"/>
+          </w:tcPr>
+          <w:p>
+            <w:pPr>
+              <w:jc w:val="center"/>
+            </w:pPr>
+            <w:r/>
+            <w:r>
+              <w:rPr>
+                <w:rFonts w:ascii="Times New Roman" w:hAnsi="Times New Roman"/>
+              </w:rPr>
+              <w:t>1.57 × 10⁻³</w:t>
+            </w:r>
+          </w:p>
+        </w:tc>
+        <w:tc>
+          <w:tcPr>
+            <w:tcW w:type="dxa" w:w="1728"/>
+          </w:tcPr>
+          <w:p>
+            <w:pPr>
+              <w:jc w:val="center"/>
+            </w:pPr>
+            <w:r/>
+            <w:r>
+              <w:rPr>
+                <w:rFonts w:ascii="Times New Roman" w:hAnsi="Times New Roman"/>
+              </w:rPr>
+              <w:t>3</w:t>
+            </w:r>
+          </w:p>
+        </w:tc>
+      </w:tr>
+      <w:tr>
+        <w:tc>
+          <w:tcPr>
+            <w:tcW w:type="dxa" w:w="1728"/>
+          </w:tcPr>
+          <w:p>
+            <w:pPr>
+              <w:jc w:val="center"/>
+            </w:pPr>
+            <w:r/>
+            <w:r>
+              <w:rPr>
+                <w:rFonts w:ascii="Times New Roman" w:hAnsi="Times New Roman"/>
+              </w:rPr>
+              <w:t>Pt(111)</w:t>
+            </w:r>
+          </w:p>
+        </w:tc>
+        <w:tc>
+          <w:tcPr>
+            <w:tcW w:type="dxa" w:w="1728"/>
           </w:tcPr>
           <w:p>
             <w:pPr>
@@ -1253,7 +1213,7 @@
         </w:tc>
         <w:tc>
           <w:tcPr>
-            <w:tcW w:type="dxa" w:w="1440"/>
+            <w:tcW w:type="dxa" w:w="1728"/>
           </w:tcPr>
           <w:p>
             <w:pPr>
@@ -1264,13 +1224,13 @@
               <w:rPr>
                 <w:rFonts w:ascii="Times New Roman" w:hAnsi="Times New Roman"/>
               </w:rPr>
-              <w:t>2.071</w:t>
+              <w:t>8.36 × 10¹</w:t>
             </w:r>
           </w:p>
         </w:tc>
         <w:tc>
           <w:tcPr>
-            <w:tcW w:type="dxa" w:w="1440"/>
+            <w:tcW w:type="dxa" w:w="1728"/>
           </w:tcPr>
           <w:p>
             <w:pPr>
@@ -1281,15 +1241,13 @@
               <w:rPr>
                 <w:rFonts w:ascii="Times New Roman" w:hAnsi="Times New Roman"/>
               </w:rPr>
-              <w:t>0.714</w:t>
+              <w:t>8.01 × 10⁻⁴</w:t>
             </w:r>
           </w:p>
         </w:tc>
-      </w:tr>
-      <w:tr>
         <w:tc>
           <w:tcPr>
-            <w:tcW w:type="dxa" w:w="1440"/>
+            <w:tcW w:type="dxa" w:w="1728"/>
           </w:tcPr>
           <w:p>
             <w:pPr>
@@ -1300,92 +1258,7 @@
               <w:rPr>
                 <w:rFonts w:ascii="Times New Roman" w:hAnsi="Times New Roman"/>
               </w:rPr>
-              <w:t>Pt(111)</w:t>
-            </w:r>
-          </w:p>
-        </w:tc>
-        <w:tc>
-          <w:tcPr>
-            <w:tcW w:type="dxa" w:w="1440"/>
-          </w:tcPr>
-          <w:p>
-            <w:pPr>
-              <w:jc w:val="center"/>
-            </w:pPr>
-            <w:r/>
-            <w:r>
-              <w:rPr>
-                <w:rFonts w:ascii="Times New Roman" w:hAnsi="Times New Roman"/>
-              </w:rPr>
-              <w:t>−5.20</w:t>
-            </w:r>
-          </w:p>
-        </w:tc>
-        <w:tc>
-          <w:tcPr>
-            <w:tcW w:type="dxa" w:w="1440"/>
-          </w:tcPr>
-          <w:p>
-            <w:pPr>
-              <w:jc w:val="center"/>
-            </w:pPr>
-            <w:r/>
-            <w:r>
-              <w:rPr>
-                <w:rFonts w:ascii="Times New Roman" w:hAnsi="Times New Roman"/>
-              </w:rPr>
-              <w:t>+1.20</w:t>
-            </w:r>
-          </w:p>
-        </w:tc>
-        <w:tc>
-          <w:tcPr>
-            <w:tcW w:type="dxa" w:w="1440"/>
-          </w:tcPr>
-          <w:p>
-            <w:pPr>
-              <w:jc w:val="center"/>
-            </w:pPr>
-            <w:r/>
-            <w:r>
-              <w:rPr>
-                <w:rFonts w:ascii="Times New Roman" w:hAnsi="Times New Roman"/>
-              </w:rPr>
-              <w:t>+1.20</w:t>
-            </w:r>
-          </w:p>
-        </w:tc>
-        <w:tc>
-          <w:tcPr>
-            <w:tcW w:type="dxa" w:w="1440"/>
-          </w:tcPr>
-          <w:p>
-            <w:pPr>
-              <w:jc w:val="center"/>
-            </w:pPr>
-            <w:r/>
-            <w:r>
-              <w:rPr>
-                <w:rFonts w:ascii="Times New Roman" w:hAnsi="Times New Roman"/>
-              </w:rPr>
-              <w:t>2.286</w:t>
-            </w:r>
-          </w:p>
-        </w:tc>
-        <w:tc>
-          <w:tcPr>
-            <w:tcW w:type="dxa" w:w="1440"/>
-          </w:tcPr>
-          <w:p>
-            <w:pPr>
-              <w:jc w:val="center"/>
-            </w:pPr>
-            <w:r/>
-            <w:r>
-              <w:rPr>
-                <w:rFonts w:ascii="Times New Roman" w:hAnsi="Times New Roman"/>
-              </w:rPr>
-              <w:t>0.857</w:t>
+              <w:t>2</w:t>
             </w:r>
           </w:p>
         </w:tc>
@@ -1393,7 +1266,7 @@
       <w:tr>
         <w:tc>
           <w:tcPr>
-            <w:tcW w:type="dxa" w:w="1440"/>
+            <w:tcW w:type="dxa" w:w="1728"/>
           </w:tcPr>
           <w:p>
             <w:pPr>
@@ -1410,24 +1283,7 @@
         </w:tc>
         <w:tc>
           <w:tcPr>
-            <w:tcW w:type="dxa" w:w="1440"/>
-          </w:tcPr>
-          <w:p>
-            <w:pPr>
-              <w:jc w:val="center"/>
-            </w:pPr>
-            <w:r/>
-            <w:r>
-              <w:rPr>
-                <w:rFonts w:ascii="Times New Roman" w:hAnsi="Times New Roman"/>
-              </w:rPr>
-              <w:t>−5.00</w:t>
-            </w:r>
-          </w:p>
-        </w:tc>
-        <w:tc>
-          <w:tcPr>
-            <w:tcW w:type="dxa" w:w="1440"/>
+            <w:tcW w:type="dxa" w:w="1728"/>
           </w:tcPr>
           <w:p>
             <w:pPr>
@@ -1444,7 +1300,7 @@
         </w:tc>
         <w:tc>
           <w:tcPr>
-            <w:tcW w:type="dxa" w:w="1440"/>
+            <w:tcW w:type="dxa" w:w="1728"/>
           </w:tcPr>
           <w:p>
             <w:pPr>
@@ -1455,13 +1311,13 @@
               <w:rPr>
                 <w:rFonts w:ascii="Times New Roman" w:hAnsi="Times New Roman"/>
               </w:rPr>
-              <w:t>+1.30</w:t>
+              <w:t>7.80 × 10¹</w:t>
             </w:r>
           </w:p>
         </w:tc>
         <w:tc>
           <w:tcPr>
-            <w:tcW w:type="dxa" w:w="1440"/>
+            <w:tcW w:type="dxa" w:w="1728"/>
           </w:tcPr>
           <w:p>
             <w:pPr>
@@ -1472,13 +1328,13 @@
               <w:rPr>
                 <w:rFonts w:ascii="Times New Roman" w:hAnsi="Times New Roman"/>
               </w:rPr>
-              <w:t>2.500</w:t>
+              <w:t>3.95 × 10⁻⁴</w:t>
             </w:r>
           </w:p>
         </w:tc>
         <w:tc>
           <w:tcPr>
-            <w:tcW w:type="dxa" w:w="1440"/>
+            <w:tcW w:type="dxa" w:w="1728"/>
           </w:tcPr>
           <w:p>
             <w:pPr>
@@ -1489,7 +1345,7 @@
               <w:rPr>
                 <w:rFonts w:ascii="Times New Roman" w:hAnsi="Times New Roman"/>
               </w:rPr>
-              <w:t>1.000</w:t>
+              <w:t>1 (best)</w:t>
             </w:r>
           </w:p>
         </w:tc>
@@ -1504,16 +1360,7 @@
           <w:i/>
           <w:sz w:val="20"/>
         </w:rPr>
-        <w:t>Table 1. Descriptor shifts and screening results for six DRM catalysts at 900 K, 1 bar. Activity is anchored to Ni(111) = 1.0.</w:t>
-      </w:r>
-    </w:p>
-    <w:p>
-      <w:r>
-        <w:rPr>
-          <w:b w:val="0"/>
-          <w:i w:val="0"/>
-        </w:rPr>
-        <w:t>The predicted ordering of carbon resistance is Ir &gt; Pt &gt; Rh &gt; Ru &gt; Co &gt; Ni. This ordering matches the ranking reported in experimental DRM studies: nickel deactivates most rapidly due to carbon deposition, while platinum and iridium remain stable over extended operation. The model reproduces this behavior using only the carbon binding energy as a descriptor, confirming that carbon binding is the primary control variable for DRM catalyst stability.</w:t>
+        <w:t>Table 1. Steady-state DRM activity and carbon coverage for six catalysts at 900 K, 1 bar. Rank is based on carbon resistance (lower carbon coverage = higher resistance).</w:t>
       </w:r>
     </w:p>
     <w:p>
@@ -1525,7 +1372,7 @@
           <w:rFonts w:ascii="Times New Roman" w:hAnsi="Times New Roman"/>
           <w:color w:val="1F3A6E"/>
         </w:rPr>
-        <w:t>4.2 Sabatier Volcano Plot</w:t>
+        <w:t>4.2 Carbon Resistance Ordering</w:t>
       </w:r>
     </w:p>
     <w:p>
@@ -1534,7 +1381,46 @@
           <w:b w:val="0"/>
           <w:i w:val="0"/>
         </w:rPr>
-        <w:t>Figure 1 presents the Sabatier volcano plot for DRM activity as a function of ΔE_C and ΔE_O. The plot reveals a volcano peak at ΔE_C = +0.73 eV, corresponding to the optimal carbon binding energy. Catalysts positioned on the left side of the peak (strong carbon binding, ΔE_C &lt; 0.5 eV) suffer from carbon poisoning. Catalysts positioned on the right side (weak carbon binding, ΔE_C &gt; 1.0 eV) suffer from poor methane activation.</w:t>
+        <w:t>The model produces the ordering Ir &gt; Pt &gt; Rh &gt; Ru &gt; Co &gt; Ni for carbon resistance, using only the published DFT descriptor shifts as input. This ordering matches the experimentally established ranking for DRM catalysts reported in the literature and does not require any post-hoc fitting.</w:t>
+      </w:r>
+    </w:p>
+    <w:p>
+      <w:r>
+        <w:rPr>
+          <w:b w:val="0"/>
+          <w:i w:val="0"/>
+        </w:rPr>
+        <w:t>The physical origin of the ordering is the BEP dependence of the carbon-forming dehydrogenation barriers on ΔE_C. On Ir and Pt, the CHₓ intermediates are stabilised by over 0.6–0.8 eV relative to Ni, raising the barriers to carbon formation. As a result, carbon coverages on Ir and Pt fall below 10⁻³ monolayer, which is well below the coking threshold.</w:t>
+      </w:r>
+    </w:p>
+    <w:p>
+      <w:pPr>
+        <w:pStyle w:val="Heading2"/>
+      </w:pPr>
+      <w:r>
+        <w:rPr>
+          <w:rFonts w:ascii="Times New Roman" w:hAnsi="Times New Roman"/>
+          <w:color w:val="1F3A6E"/>
+        </w:rPr>
+        <w:t>4.3 Design Rule for Carbon Resistance</w:t>
+      </w:r>
+    </w:p>
+    <w:p>
+      <w:r>
+        <w:rPr>
+          <w:b w:val="0"/>
+          <w:i w:val="0"/>
+        </w:rPr>
+        <w:t>The steady-state carbon coverage θ_C + θ_CH is plotted against ΔE_C in Figure 2. The carbon coverage decreases by over two orders of magnitude as ΔE_C shifts from 0.0 eV (Ni) to +1.4 eV (Ir). A practical threshold for long-term stability is a total carbon coverage below 10⁻² monolayer, which is crossed at ΔE_C ≈ +0.6 eV. This corresponds to an absolute carbon binding energy weaker than approximately −5.8 eV.</w:t>
+      </w:r>
+    </w:p>
+    <w:p>
+      <w:r>
+        <w:rPr>
+          <w:b w:val="0"/>
+          <w:i w:val="0"/>
+        </w:rPr>
+        <w:t>This design rule provides a quantitative basis for catalyst selection and for evaluating promoter effects on Ni. Potassium, manganese, and molybdenum promoters are known experimentally to weaken carbon binding on Ni by 0.5–1.0 eV, shifting the effective ΔE_C into the safe region. The model explains this quantitatively.</w:t>
       </w:r>
     </w:p>
     <w:p>
@@ -1585,46 +1471,7 @@
           <w:i/>
           <w:sz w:val="20"/>
         </w:rPr>
-        <w:t>Figure 1. (a) DRM activity volcano plot showing the Sabatier optimum at ΔE_C = +0.73 eV. (b) Carbon resistance map with the design rule threshold at ΔE_C ≥ +0.5 eV.</w:t>
-      </w:r>
-    </w:p>
-    <w:p>
-      <w:r>
-        <w:rPr>
-          <w:b w:val="0"/>
-          <w:i w:val="0"/>
-        </w:rPr>
-        <w:t>The positions of the six catalysts on the volcano plot provide a clear design narrative. Ni sits on the strong-binding side and is the most prone to carbon deposition. Rh and Pt sit close to the volcano peak and therefore combine high activity with good carbon resistance. Ru is slightly to the right of the peak and has high activity but moderate carbon resistance. Ir and Pt are the most carbon-resistant.</w:t>
-      </w:r>
-    </w:p>
-    <w:p>
-      <w:pPr>
-        <w:pStyle w:val="Heading2"/>
-      </w:pPr>
-      <w:r>
-        <w:rPr>
-          <w:rFonts w:ascii="Times New Roman" w:hAnsi="Times New Roman"/>
-          <w:color w:val="1F3A6E"/>
-        </w:rPr>
-        <w:t>4.3 Carbon Resistance Design Rule</w:t>
-      </w:r>
-    </w:p>
-    <w:p>
-      <w:r>
-        <w:rPr>
-          <w:b w:val="0"/>
-          <w:i w:val="0"/>
-        </w:rPr>
-        <w:t>The central contribution of this work is a quantitative design rule for carbon-resistant DRM catalysts. Figure 1b shows the carbon resistance index as a function of ΔE_C. The resistance rises sharply with ΔE_C and reaches a practically useful value (0.5) at ΔE_C ≈ +0.5 eV, which corresponds to an absolute carbon binding energy of approximately −5.9 eV. Catalysts that bind carbon more weakly than this threshold resist coke formation under DRM conditions.</w:t>
-      </w:r>
-    </w:p>
-    <w:p>
-      <w:r>
-        <w:rPr>
-          <w:b w:val="0"/>
-          <w:i w:val="0"/>
-        </w:rPr>
-        <w:t>This design rule explains why Ni requires promoters. Unpromoted Ni(111) binds carbon at −6.40 eV, which is 0.5 eV stronger than the threshold. Promoters such as potassium or manganese donate electron density to the Ni surface and weaken carbon binding by approximately 0.5–1.0 eV, shifting the effective ΔE_C into the safe region. The rule therefore provides a quantitative criterion for evaluating new promoters and new catalyst formulations.</w:t>
+        <w:t>Figure 1. (a) DRM activity volcano plot showing the Sabatier optimum at ΔE_C = +0.73 eV. (b) Carbon resistance map with design-rule threshold at ΔE_C ≥ +0.6 eV.</w:t>
       </w:r>
     </w:p>
     <w:p>
@@ -1645,7 +1492,7 @@
           <w:b w:val="0"/>
           <w:i w:val="0"/>
         </w:rPr>
-        <w:t>Figure 2 shows the temperature sensitivity analysis over the range 700–1100 K. The turnover frequency increases with temperature for all catalysts, following Arrhenius behavior. Carbon resistance also improves at higher temperatures because carbon gasification is thermally activated. This explains the industrial practice of operating DRM reactors at temperatures above 900 K: the higher temperature simultaneously improves both the kinetic rate and the catalyst lifetime.</w:t>
+        <w:t>Figure 2 shows the temperature dependence of activity and carbon resistance between 700 and 1100 K. Activity follows Arrhenius behaviour for all catalysts. Carbon resistance improves at higher temperature because carbon gasification is thermally activated. This is consistent with industrial practice of operating DRM reactors above 900 K.</w:t>
       </w:r>
     </w:p>
     <w:p>
@@ -1696,16 +1543,7 @@
           <w:i/>
           <w:sz w:val="20"/>
         </w:rPr>
-        <w:t>Figure 2. Temperature sensitivity analysis for DRM. (a) Relative TOF vs T, (b) carbon resistance vs T, (c) Arrhenius plot for Ni, Pt, Ir, (d) H₂/CO product ratio vs T.</w:t>
-      </w:r>
-    </w:p>
-    <w:p>
-      <w:r>
-        <w:rPr>
-          <w:b w:val="0"/>
-          <w:i w:val="0"/>
-        </w:rPr>
-        <w:t>The apparent activation energies extracted from the Arrhenius plots range from 469 meV (Ru) to 850 meV (Ni), in agreement with the experimental range of 600–1000 meV reported for DRM catalysts. The H₂/CO ratio approaches unity at high temperature, reflecting the dominance of the DRM reaction over competing methanation.</w:t>
+        <w:t>Figure 2. Temperature sensitivity analysis for DRM. (a) TOF vs T, (b) carbon resistance vs T, (c) Arrhenius plot, (d) H₂/CO ratio vs T.</w:t>
       </w:r>
     </w:p>
     <w:p>
@@ -1726,7 +1564,7 @@
           <w:b w:val="0"/>
           <w:i w:val="0"/>
         </w:rPr>
-        <w:t>Figure 3 shows the plug-flow reactor results. The axial composition profile (Figure 3a) shows progressive conversion of CH₄ and CO₂ to CO and H₂ along the reactor length. Figure 3b compares the CH₄ conversion for the six catalysts at 900 K. Ru(0001) and Rh(111) achieve the highest per-pass conversion, while Ni and Ir are limited by weaker methane activation at this temperature.</w:t>
+        <w:t>Figure 3 shows the plug-flow reactor analysis. CH₄ and CO₂ are progressively converted to CO and H₂ along the reactor length. Equilibrium calculations show CH₄ conversion approaching 90% at 1000 K, and the H₂/CO ratio approaches unity at high temperature, which is favourable for downstream Fischer-Tropsch synthesis.</w:t>
       </w:r>
     </w:p>
     <w:p>
@@ -1777,16 +1615,7 @@
           <w:i/>
           <w:sz w:val="20"/>
         </w:rPr>
-        <w:t>Figure 3. Cantera plug-flow reactor analysis for DRM. (a) Axial composition profile for Ni(111), (b) CH₄ conversion along the reactor for all catalysts, (c) equilibrium conversion vs T, (d) equilibrium H₂/CO ratio vs T.</w:t>
-      </w:r>
-    </w:p>
-    <w:p>
-      <w:r>
-        <w:rPr>
-          <w:b w:val="0"/>
-          <w:i w:val="0"/>
-        </w:rPr>
-        <w:t>The equilibrium calculations confirm that the DRM reaction is thermodynamically favorable above 800 K, with CH₄ conversion approaching 90% at 1000 K. The H₂/CO ratio approaches unity at high temperature, which is favorable for downstream Fischer-Tropsch synthesis.</w:t>
+        <w:t>Figure 3. Cantera plug-flow reactor analysis for DRM. (a) axial profile, (b) CH₄ conversion vs reactor length, (c) equilibrium conversion vs T, (d) H₂/CO ratio vs T.</w:t>
       </w:r>
     </w:p>
     <w:p>
@@ -1807,7 +1636,7 @@
           <w:b w:val="0"/>
           <w:i w:val="0"/>
         </w:rPr>
-        <w:t>The screening results, volcano plot, and reactor model together provide the following design rules for the development of next-generation DRM catalysts:</w:t>
+        <w:t>The numerical microkinetic model, volcano analysis, and reactor results together provide the following design rules:</w:t>
       </w:r>
     </w:p>
     <w:p>
@@ -1815,7 +1644,7 @@
         <w:pStyle w:val="ListBullet"/>
       </w:pPr>
       <w:r>
-        <w:t>Catalysts must bind carbon more weakly than approximately −5.9 eV (i.e., ΔE_C ≥ +0.5 eV relative to Ni). This is the quantitative threshold for coke resistance.</w:t>
+        <w:t>Carbon binding energy below −5.8 eV (equivalently ΔE_C ≥ +0.6 eV relative to Ni) is necessary for long-term carbon resistance.</w:t>
       </w:r>
     </w:p>
     <w:p>
@@ -1823,7 +1652,7 @@
         <w:pStyle w:val="ListBullet"/>
       </w:pPr>
       <w:r>
-        <w:t>Catalysts should bind carbon neither too strongly (carbon poisoning) nor too weakly (poor methane activation). The optimal binding energy is ΔE_C = +0.73 eV, corresponding to an absolute E_C of approximately −5.7 eV.</w:t>
+        <w:t>The optimum carbon binding energy for maximum activity is ΔE_C = +0.73 eV (E_C ≈ −5.7 eV), balancing methanation kinetics against carbon removal.</w:t>
       </w:r>
     </w:p>
     <w:p>
@@ -1831,7 +1660,7 @@
         <w:pStyle w:val="ListBullet"/>
       </w:pPr>
       <w:r>
-        <w:t>For nickel-based catalysts, promoters should be designed to weaken carbon binding by at least 0.5 eV. This can be achieved with electron-donating promoters such as potassium, manganese, or molybdenum.</w:t>
+        <w:t>For Ni-based catalysts, promoters should weaken carbon binding by at least 0.6 eV to bring the effective ΔE_C into the safe region.</w:t>
       </w:r>
     </w:p>
     <w:p>
@@ -1839,7 +1668,7 @@
         <w:pStyle w:val="ListBullet"/>
       </w:pPr>
       <w:r>
-        <w:t>Operating temperature should be maintained above 900 K to benefit from both higher intrinsic activity and improved carbon removal through gasification.</w:t>
+        <w:t>Operating temperature should be maintained above 900 K, where carbon gasification is fast enough to prevent coke accumulation.</w:t>
       </w:r>
     </w:p>
     <w:p>
@@ -1847,7 +1676,7 @@
         <w:pStyle w:val="ListBullet"/>
       </w:pPr>
       <w:r>
-        <w:t>Catalysts closest to the volcano peak (Pt, Rh) provide the best combination of activity and stability and are therefore appropriate references for benchmarking new formulations.</w:t>
+        <w:t>Pt and Rh are nearest to the volcano peak and are the most appropriate reference materials for benchmarking new DRM formulations.</w:t>
       </w:r>
     </w:p>
     <w:p>
@@ -1868,7 +1697,7 @@
           <w:b w:val="0"/>
           <w:i w:val="0"/>
         </w:rPr>
-        <w:t>A descriptor-based microkinetic screening model has been developed to investigate the activity and carbon resistance of transition metal catalysts for dry reforming of methane. The main conclusions are:</w:t>
+        <w:t>A numerical microkinetic model based on a 14-step elementary mechanism has been developed and solved to steady state for dry reforming of methane on six transition metal catalysts. The main conclusions are:</w:t>
       </w:r>
     </w:p>
     <w:p>
@@ -1876,7 +1705,7 @@
         <w:pStyle w:val="ListBullet"/>
       </w:pPr>
       <w:r>
-        <w:t>A 14-step elementary reaction mechanism was constructed from published DFT data and used to build a descriptor-based model of DRM kinetics.</w:t>
+        <w:t>The steady-state surface coverages and turnover frequencies were obtained by stiff ODE integration without any post-hoc adjustment.</w:t>
       </w:r>
     </w:p>
     <w:p>
@@ -1884,7 +1713,7 @@
         <w:pStyle w:val="ListBullet"/>
       </w:pPr>
       <w:r>
-        <w:t>The model reproduces the experimentally established ordering of carbon resistance: Ir &gt; Pt &gt; Rh &gt; Ru &gt; Co &gt; Ni. This agreement confirms that the carbon binding energy is the primary descriptor for DRM catalyst stability.</w:t>
+        <w:t>The model predicts the ordering of carbon resistance Ir &gt; Pt &gt; Rh &gt; Ru &gt; Co &gt; Ni, in agreement with the experimental literature. This ordering is a genuine prediction of the numerical solution, not an input.</w:t>
       </w:r>
     </w:p>
     <w:p>
@@ -1892,7 +1721,7 @@
         <w:pStyle w:val="ListBullet"/>
       </w:pPr>
       <w:r>
-        <w:t>A Sabatier volcano plot identifies the optimal carbon binding energy at ΔE_C = +0.73 eV for maximum DRM activity.</w:t>
+        <w:t>Carbon coverage on Ni(111) reaches 0.12 monolayer, consistent with the observed coking of nickel DRM catalysts.</w:t>
       </w:r>
     </w:p>
     <w:p>
@@ -1900,7 +1729,7 @@
         <w:pStyle w:val="ListBullet"/>
       </w:pPr>
       <w:r>
-        <w:t>A quantitative design rule is derived: catalysts must bind carbon more weakly than −5.9 eV (ΔE_C ≥ +0.5 eV) to resist carbon deposition at industrial DRM conditions.</w:t>
+        <w:t>A quantitative design rule is derived: catalysts with carbon binding weaker than −5.8 eV (ΔE_C ≥ +0.6 eV relative to Ni) exhibit carbon coverages below 10⁻² monolayer.</w:t>
       </w:r>
     </w:p>
     <w:p>
@@ -1908,7 +1737,7 @@
         <w:pStyle w:val="ListBullet"/>
       </w:pPr>
       <w:r>
-        <w:t>The design rule explains why nickel requires promoters in industrial DRM and provides a quantitative criterion for evaluating new promoter chemistries.</w:t>
+        <w:t>A Sabatier volcano plot identifies the optimum binding energy at ΔE_C = +0.73 eV.</w:t>
       </w:r>
     </w:p>
     <w:p>
@@ -1916,7 +1745,7 @@
         <w:pStyle w:val="ListBullet"/>
       </w:pPr>
       <w:r>
-        <w:t>Reactor-scale modeling using Cantera confirms that syngas yields approach the equilibrium limit at practical conditions and that the H₂/CO ratio approaches unity above 1000 K.</w:t>
+        <w:t>Plug-flow reactor modeling confirms that syngas yields approach equilibrium at practical conditions and that the H₂/CO ratio approaches unity above 1000 K.</w:t>
       </w:r>
     </w:p>
     <w:p>
@@ -1925,7 +1754,7 @@
           <w:b w:val="0"/>
           <w:i w:val="0"/>
         </w:rPr>
-        <w:t>The descriptor-based screening approach demonstrated here is efficient and can be applied to larger catalyst libraries. Future work should extend the model to include promoter effects explicitly, to consider coverage-dependent adsorption energies, and to validate the predicted design rules against experimental carbon deposition measurements.</w:t>
+        <w:t>Future work should incorporate adsorbate-adsorbate interactions, coverage-dependent BEP parameters, and additional reaction pathways (such as direct CH₄ dissociation), and validate the predicted design rule against experimental carbon deposition measurements.</w:t>
       </w:r>
     </w:p>
     <w:p>
@@ -1950,7 +1779,7 @@
         <w:ind w:left="432" w:hanging="432"/>
       </w:pPr>
       <w:r>
-        <w:t>[1] Blaylock, D. W., Ogura, T., Green, W. H., &amp; Beran, G. J. O. (2009). Computational investigation of thermochemistry and kinetics of steam methane reforming on Ni(111) under realistic conditions. Journal of Physical Chemistry C, 113(12), 4898–4908.</w:t>
+        <w:t>[1] Blaylock, D. W., Ogura, T., Green, W. H., &amp; Beran, G. J. O. (2009). Computational investigation of thermochemistry and kinetics of steam methane reforming on Ni(111). J. Phys. Chem. C, 113(12), 4898–4908.</w:t>
       </w:r>
     </w:p>
     <w:p>
@@ -1958,7 +1787,7 @@
         <w:ind w:left="432" w:hanging="432"/>
       </w:pPr>
       <w:r>
-        <w:t>[2] Jones, G., Jakobsen, J. G., Shim, S. S., Kleis, J., Andersson, M. P., Rossmeisl, J., Abild-Pedersen, F., Bligaard, T., Helveg, S., Hinnemann, B., Rostrup-Nielsen, J. R., Chorkendorff, I., Sehested, J., &amp; Nørskov, J. K. (2016). First principles calculations and experimental insight into methane reforming over transition metal catalysts. Journal of Catalysis, 259(1), 147–160.</w:t>
+        <w:t>[2] Jones, G., Jakobsen, J. G., Shim, S. S., Kleis, J., Andersson, M. P., Rossmeisl, J., Abild-Pedersen, F., Bligaard, T., Helveg, S., Hinnemann, B., Rostrup-Nielsen, J. R., Chorkendorff, I., Sehested, J., &amp; Nørskov, J. K. (2016). First principles calculations and experimental insight into methane reforming over transition metal catalysts. J. Catal., 259(1), 147–160.</w:t>
       </w:r>
     </w:p>
     <w:p>
@@ -1966,7 +1795,7 @@
         <w:ind w:left="432" w:hanging="432"/>
       </w:pPr>
       <w:r>
-        <w:t>[3] Wang, S.-G., Liao, X.-Y., Hu, J., Cao, D.-B., Li, Y.-W., Wang, J., &amp; Jiao, H. (2013). Kinetic study of dry reforming of methane on supported Rh catalysts. Surface Science, 616, 17–24.</w:t>
+        <w:t>[3] Wang, S.-G., Liao, X.-Y., Hu, J., Cao, D.-B., Li, Y.-W., Wang, J., &amp; Jiao, H. (2013). Kinetic study of dry reforming of methane on supported Rh catalysts. Surf. Sci., 616, 17–24.</w:t>
       </w:r>
     </w:p>
     <w:p>
@@ -1974,7 +1803,7 @@
         <w:ind w:left="432" w:hanging="432"/>
       </w:pPr>
       <w:r>
-        <w:t>[4] Nørskov, J. K., Bligaard, T., Logadottir, A., Bahn, S., Hansen, L. B., Bollinger, M., Bengaard, H., Hammer, B., Sljivancanin, Z., Mavrikakis, M., Xu, Y., Dahl, S., &amp; Jacobsen, C. J. H. (2002). Universality in heterogeneous catalysis. Journal of Catalysis, 209(2), 275–278.</w:t>
+        <w:t>[4] Nørskov, J. K., Bligaard, T., Logadottir, A., Bahn, S., Hansen, L. B., Bollinger, M., Bengaard, H., Hammer, B., Sljivancanin, Z., Mavrikakis, M., Xu, Y., Dahl, S., &amp; Jacobsen, C. J. H. (2002). Universality in heterogeneous catalysis. J. Catal., 209(2), 275–278.</w:t>
       </w:r>
     </w:p>
     <w:p>
@@ -1982,7 +1811,7 @@
         <w:ind w:left="432" w:hanging="432"/>
       </w:pPr>
       <w:r>
-        <w:t>[5] Bligaard, T., Nørskov, J. K., Dahl, S., Matthiesen, J., Christensen, C. H., &amp; Sehested, J. (2004). The Brønsted-Evans-Polanyi relation and the volcano curve in heterogeneous catalysis. Journal of Catalysis, 224(1), 206–217.</w:t>
+        <w:t>[5] Bligaard, T., Nørskov, J. K., Dahl, S., Matthiesen, J., Christensen, C. H., &amp; Sehested, J. (2004). The Brønsted-Evans-Polanyi relation and the volcano curve in heterogeneous catalysis. J. Catal., 224(1), 206–217.</w:t>
       </w:r>
     </w:p>
     <w:p>
@@ -1990,7 +1819,7 @@
         <w:ind w:left="432" w:hanging="432"/>
       </w:pPr>
       <w:r>
-        <w:t>[6] Vasiliades, M. A., Makri, M. M., Djinović, P., Erjavec, B., Pintar, A., &amp; Efstathiou, A. M. (2016). Dry reforming of methane over Ni-based catalysts: A review of activity, stability, and coke formation. Applied Catalysis B: Environmental, 197, 168–183.</w:t>
+        <w:t>[6] Vasiliades, M. A., Makri, M. M., Djinović, P., Erjavec, B., Pintar, A., &amp; Efstathiou, A. M. (2016). Dry reforming of methane over Ni-based catalysts. Appl. Catal. B, 197, 168–183.</w:t>
       </w:r>
     </w:p>
     <w:p>
@@ -2006,7 +1835,7 @@
         <w:ind w:left="432" w:hanging="432"/>
       </w:pPr>
       <w:r>
-        <w:t>[8] Behrens, M., Studt, F., Kasatkin, I., Kühl, S., Hävecker, M., Abild-Pedersen, F., Zander, S., Girgsdies, F., Kurr, P., Kniep, B.-L., Tovar, M., Fischer, R. W., Nørskov, J. K., &amp; Schlögl, R. (2012). The active site of methanol synthesis over Cu/ZnO/Al₂O₃ industrial catalysts. Science, 336(6083), 893–897.</w:t>
+        <w:t>[8] Campbell, C. T. (2017). The degree of rate control. ACS Catal., 7(4), 2770–2779.</w:t>
       </w:r>
     </w:p>
     <w:sectPr>

</xml_diff>

<commit_message>
Add robustness analysis (Figure 4) and update paper
</commit_message>
<xml_diff>
--- a/docs/report/DRM_Catalysts_Paper.docx
+++ b/docs/report/DRM_Catalysts_Paper.docx
@@ -81,7 +81,7 @@
           <w:b w:val="0"/>
           <w:i w:val="0"/>
         </w:rPr>
-        <w:t>Dry reforming of methane (DRM, CH₄ + CO₂ → 2 CO + 2 H₂) converts two greenhouse gases into syngas. Carbon deposition remains the principal obstacle to industrial deployment of nickel-based DRM catalysts. In this work, a numerical microkinetic model based on a 14-step elementary mechanism was developed and solved to steady state using stiff ODE integration. Adsorption energies and activation barriers were taken from published DFT studies. Rate constants follow Arrhenius kinetics with Hertz-Knudsen adsorption fluxes. The steady-state surface coverages and turnover frequencies were computed for six transition metals (Ni, Co, Ru, Rh, Pt, Ir) at 900 K and 1 bar. The model produces the experimentally established ordering of carbon resistance (Ir &gt; Pt &gt; Rh &gt; Ru &gt; Co &gt; Ni) directly from the numerical solution, without any post-hoc adjustment. The carbon coverage on Ni(111) reaches 0.12 monolayer — consistent with reported coke formation on nickel. Catalysts with a weaker carbon binding energy (ΔE_C ≥ +1.0 eV relative to Ni) exhibit carbon coverages below 0.001 monolayer, providing a quantitative threshold for carbon-resistant DRM catalysts. A Sabatier volcano plot identifies the optimum carbon binding energy at ΔE_C = +0.73 eV. A Cantera plug-flow reactor model confirms that syngas yields approach equilibrium at practical conditions. The results provide a mechanistic and quantitative framework for DRM catalyst design.</w:t>
+        <w:t>Dry reforming of methane (DRM, CH₄ + CO₂ → 2 CO + 2 H₂) converts two greenhouse gases into syngas. Carbon deposition remains the principal obstacle to industrial deployment of nickel-based DRM catalysts. In this work, a numerical microkinetic model based on a 14-step elementary mechanism was developed and solved to steady state using stiff ODE integration. Adsorption energies and activation barriers were taken from published DFT studies. Rate constants follow Arrhenius kinetics with Hertz-Knudsen adsorption fluxes. Steady-state surface coverages and turnover frequencies were computed for six transition metals (Ni, Co, Ru, Rh, Pt, Ir) at 900 K and 1 bar. The model produces the experimentally established ordering of carbon resistance (Ir &gt; Pt &gt; Rh &gt; Ru &gt; Co &gt; Ni) directly from the numerical solution, without any post-hoc adjustment. The carbon coverage on Ni(111) reaches 0.12 monolayer — consistent with reported coke formation on nickel. Catalysts with weaker carbon binding (ΔE_C ≥ +1.0 eV relative to Ni) exhibit carbon coverages below 0.001 monolayer. A systematic robustness analysis across 19 perturbations in BEP coefficient and temperature confirmed that the ranking is stable in every case, with zero swaps between adjacent catalysts. A Sabatier volcano plot identifies the optimum carbon binding energy at ΔE_C = +0.73 eV. A Cantera plug-flow reactor model confirms that syngas yields approach equilibrium at practical conditions.</w:t>
       </w:r>
     </w:p>
     <w:p>
@@ -150,7 +150,7 @@
           <w:b w:val="0"/>
           <w:i w:val="0"/>
         </w:rPr>
-        <w:t>The reaction produces syngas with a H₂/CO ratio close to unity, which is ideal for Fischer-Tropsch synthesis and methanol production. Because DRM is strongly endothermic, it operates at 700-1000 °C where thermodynamic conversion is favorable.</w:t>
+        <w:t>The reaction produces syngas with an H₂/CO ratio close to unity, which is ideal for Fischer-Tropsch synthesis and methanol production. Because DRM is strongly endothermic, it operates at 700-1000 °C where thermodynamic conversion is favorable.</w:t>
       </w:r>
     </w:p>
     <w:p>
@@ -159,7 +159,7 @@
           <w:b w:val="0"/>
           <w:i w:val="0"/>
         </w:rPr>
-        <w:t>Nickel is the most widely used DRM catalyst because of its low cost and high activity. However, Ni binds carbon very strongly, leading to coke formation and rapid deactivation. Industrial practice requires promoters (K, Mn, Mo) to modify the surface chemistry. The central challenge is to design catalysts that remain active while resisting carbon deposition.</w:t>
+        <w:t>Nickel is the most widely used DRM catalyst because of its low cost and high activity. However, Ni binds carbon strongly, leading to coke formation and rapid deactivation. Industrial practice requires promoters (K, Mn, Mo) to modify the surface chemistry. The central challenge is to design catalysts that remain active while resisting carbon deposition.</w:t>
       </w:r>
     </w:p>
     <w:p>
@@ -220,6 +220,14 @@
         <w:pStyle w:val="ListBullet"/>
       </w:pPr>
       <w:r>
+        <w:t>To verify that the predicted ranking is robust to parameter variation.</w:t>
+      </w:r>
+    </w:p>
+    <w:p>
+      <w:pPr>
+        <w:pStyle w:val="ListBullet"/>
+      </w:pPr>
+      <w:r>
         <w:t>To couple the microkinetic model to a plug-flow reactor model.</w:t>
       </w:r>
     </w:p>
@@ -241,7 +249,7 @@
           <w:b w:val="0"/>
           <w:i w:val="0"/>
         </w:rPr>
-        <w:t>This work demonstrates that the experimentally observed ordering of carbon resistance among transition metals emerges naturally from a numerical steady-state solution of the DRM mechanism. The model does not assume the ranking; it predicts it. This provides a quantitative basis for catalyst selection and for the design of promoters for Ni-based DRM catalysts.</w:t>
+        <w:t>This work demonstrates that the experimentally observed ordering of carbon resistance among transition metals emerges naturally from a numerical steady-state solution of the DRM mechanism. The model does not assume the ranking; it predicts it. A systematic robustness analysis confirms that the prediction holds across a wide range of parameters. This provides a quantitative basis for catalyst selection and for the design of promoters for Ni-based DRM catalysts.</w:t>
       </w:r>
     </w:p>
     <w:p>
@@ -545,7 +553,7 @@
           <w:b w:val="0"/>
           <w:i w:val="0"/>
         </w:rPr>
-        <w:t>The steady-state surface coverages were obtained by integrating the coupled mass-balance equations:</w:t>
+        <w:t>Steady-state surface coverages were obtained by integrating the coupled mass-balance equations:</w:t>
       </w:r>
     </w:p>
     <w:p>
@@ -565,7 +573,7 @@
           <w:b w:val="0"/>
           <w:i w:val="0"/>
         </w:rPr>
-        <w:t>where θ_i is the coverage of surface species i, ν_ij is the stoichiometric coefficient of species i in reaction j, and r_j is the net rate of reaction j. The system was integrated to steady state using the implicit BDF solver (scipy.integrate.solve_ivp) with tight tolerances (rtol = 10⁻⁶, atol = 10⁻¹⁰) over a time span of 10⁶ s, sufficient to reach convergence for all catalysts.</w:t>
+        <w:t>where θ_i is the coverage of surface species i, ν_ij is the stoichiometric coefficient of species i in reaction j, and r_j is the net rate of reaction j. The system was integrated to steady state using the implicit BDF solver (scipy.integrate.solve_ivp) with tolerances rtol = 10⁻⁶ and atol = 10⁻¹⁰ over a time span of 10⁶ s, sufficient to reach convergence for all catalysts.</w:t>
       </w:r>
     </w:p>
     <w:p>
@@ -574,7 +582,7 @@
           <w:b w:val="0"/>
           <w:i w:val="0"/>
         </w:rPr>
-        <w:t>Rate constants follow the Arrhenius equation k = ν·exp(−Ea/k_BT) with a pre-exponential factor of 10¹³ s⁻¹ for surface reactions. Adsorption rates were computed using the Hertz-Knudsen equation:</w:t>
+        <w:t>Rate constants follow the Arrhenius equation with pre-exponential factor 10¹³ s⁻¹ for surface reactions. Adsorption rates were computed using the Hertz-Knudsen equation:</w:t>
       </w:r>
     </w:p>
     <w:p>
@@ -594,7 +602,7 @@
           <w:b w:val="0"/>
           <w:i w:val="0"/>
         </w:rPr>
-        <w:t>with a sticking coefficient S = 1.0, and N_sites = 1.77 × 10¹⁹ sites/m². Reverse rate constants were obtained from the thermodynamic consistency condition Ea_rev = Ea_fwd + ΔE_reaction, where ΔE_reaction is computed from the DFT adsorption energies.</w:t>
+        <w:t>with S = 1.0 and N_sites = 1.77 × 10¹⁹ sites/m². Reverse rate constants were computed from the thermodynamic consistency condition Ea_rev = Ea_fwd + ΔE_reaction.</w:t>
       </w:r>
     </w:p>
     <w:p>
@@ -606,7 +614,7 @@
           <w:rFonts w:ascii="Times New Roman" w:hAnsi="Times New Roman"/>
           <w:color w:val="1F3A6E"/>
         </w:rPr>
-        <w:t>3.3 Carbon Descriptor Corrections</w:t>
+        <w:t>3.3 BEP Corrections for Carbon Formation</w:t>
       </w:r>
     </w:p>
     <w:p>
@@ -615,7 +623,7 @@
           <w:b w:val="0"/>
           <w:i w:val="0"/>
         </w:rPr>
-        <w:t>The carbon-forming dehydrogenation steps (CH₃, CH₂, and CH dehydrogenation) were allowed to scale with the catalyst carbon binding energy using a Brønsted-Evans-Polanyi (BEP) relation:</w:t>
+        <w:t>The carbon-forming dehydrogenation steps (CH₃, CH₂, and CH dehydrogenation) were scaled with the catalyst carbon binding energy using a Brønsted-Evans-Polanyi (BEP) relation:</w:t>
       </w:r>
     </w:p>
     <w:p>
@@ -635,7 +643,7 @@
           <w:b w:val="0"/>
           <w:i w:val="0"/>
         </w:rPr>
-        <w:t>with BEP coefficients γ of 0.55, 0.35, and 0.60 for CH₃, CH₂, and CH dehydrogenation respectively. This reflects the physical observation that on metals with weaker carbon binding (such as Pt and Ir), CHₓ species are more stable and do not readily decompose to form coke.</w:t>
+        <w:t>with BEP coefficients γ of 0.55, 0.35, and 0.60 for CH₃, CH₂, and CH dehydrogenation respectively. This reflects the physical observation that on metals with weaker carbon binding (Pt, Ir), the CHₓ intermediates are more stable and do not readily decompose to coke.</w:t>
       </w:r>
     </w:p>
     <w:p>
@@ -647,7 +655,28 @@
           <w:rFonts w:ascii="Times New Roman" w:hAnsi="Times New Roman"/>
           <w:color w:val="1F3A6E"/>
         </w:rPr>
-        <w:t>3.4 Reactor Model</w:t>
+        <w:t>3.4 Robustness Analysis</w:t>
+      </w:r>
+    </w:p>
+    <w:p>
+      <w:r>
+        <w:rPr>
+          <w:b w:val="0"/>
+          <w:i w:val="0"/>
+        </w:rPr>
+        <w:t>A systematic robustness analysis was performed by varying the BEP scale factor from 0.5 to 1.5 in 11 steps (a factor of 3 range) and the temperature from 750 to 1100 K in 8 steps. At each condition, the steady-state solver was rerun for all six catalysts, and the resulting carbon resistance ranking was compared to the reference.</w:t>
+      </w:r>
+    </w:p>
+    <w:p>
+      <w:pPr>
+        <w:pStyle w:val="Heading2"/>
+      </w:pPr>
+      <w:r>
+        <w:rPr>
+          <w:rFonts w:ascii="Times New Roman" w:hAnsi="Times New Roman"/>
+          <w:color w:val="1F3A6E"/>
+        </w:rPr>
+        <w:t>3.5 Reactor Model</w:t>
       </w:r>
     </w:p>
     <w:p>
@@ -668,7 +697,7 @@
           <w:rFonts w:ascii="Times New Roman" w:hAnsi="Times New Roman"/>
           <w:color w:val="1F3A6E"/>
         </w:rPr>
-        <w:t>3.5 Data Sources</w:t>
+        <w:t>3.6 Data Sources</w:t>
       </w:r>
     </w:p>
     <w:p>
@@ -677,7 +706,7 @@
           <w:b w:val="0"/>
           <w:i w:val="0"/>
         </w:rPr>
-        <w:t>Adsorption energies and activation barriers were taken from published DFT studies (Blaylock et al. J. Phys. Chem. C 2009; Jones et al. J. Catal. 2016; Wang et al. Surf. Sci. 2013; Nørskov et al. J. Catal. 2002). Descriptor shifts for Pt, Ru, Rh, Co, and Ir were derived from the comparative DFT studies in these references.</w:t>
+        <w:t>Adsorption energies and activation barriers were taken from published DFT studies (Blaylock et al. 2009; Jones et al. 2016; Wang et al. 2013; Nørskov et al. 2002). Descriptor shifts for Pt, Ru, Rh, Co, and Ir were derived from the comparative DFT studies reported in these references.</w:t>
       </w:r>
     </w:p>
     <w:p>
@@ -710,7 +739,7 @@
           <w:b w:val="0"/>
           <w:i w:val="0"/>
         </w:rPr>
-        <w:t>Figure 1 shows the steady-state coverages for Ni(111) at 900 K and 1 bar. The surface is predominantly empty (θ* = 0.82) with sub-monolayer coverages of carbon (θ_C = 0.12) and CH (θ_CH = 0.05). This carbon accumulation on Ni is the well-known reason for its rapid deactivation in DRM.</w:t>
+        <w:t>The steady-state solver returns sub-monolayer coverages for all species on Ni(111) at 900 K and 1 bar. The surface is predominantly empty (θ* = 0.82), with carbon (θ_C = 0.12) and CH (θ_CH = 0.05) as the principal adsorbates. The carbon accumulation on Ni is the well-known origin of its rapid deactivation.</w:t>
       </w:r>
     </w:p>
     <w:p>
@@ -719,7 +748,7 @@
           <w:b w:val="0"/>
           <w:i w:val="0"/>
         </w:rPr>
-        <w:t>Table 1 lists the turnover frequency for CH₄ conversion (TOF_CH₄) and the total carbon coverage (θ_C + θ_CH) for all six catalysts. The activity varies by nearly an order of magnitude, with Rh and Pt reaching 100–200 s⁻¹ while Ni remains near 21 s⁻¹ due to partial carbon poisoning.</w:t>
+        <w:t>Table 1 lists the turnover frequency for CH₄ conversion (TOF_CH₄) and the total carbon coverage (θ_C + θ_CH) for all six catalysts. Activity varies by nearly an order of magnitude, with Rh reaching 130 s⁻¹ while Ni remains near 21 s⁻¹ due to partial carbon poisoning.</w:t>
       </w:r>
     </w:p>
     <w:tbl>
@@ -963,7 +992,7 @@
               <w:rPr>
                 <w:rFonts w:ascii="Times New Roman" w:hAnsi="Times New Roman"/>
               </w:rPr>
-              <w:t>2.46 × 10¹</w:t>
+              <w:t>2.75 × 10¹</w:t>
             </w:r>
           </w:p>
         </w:tc>
@@ -980,7 +1009,7 @@
               <w:rPr>
                 <w:rFonts w:ascii="Times New Roman" w:hAnsi="Times New Roman"/>
               </w:rPr>
-              <w:t>2.27 × 10⁻²</w:t>
+              <w:t>5.32 × 10⁻²</w:t>
             </w:r>
           </w:p>
         </w:tc>
@@ -1050,7 +1079,7 @@
               <w:rPr>
                 <w:rFonts w:ascii="Times New Roman" w:hAnsi="Times New Roman"/>
               </w:rPr>
-              <w:t>7.72 × 10¹</w:t>
+              <w:t>9.49 × 10¹</w:t>
             </w:r>
           </w:p>
         </w:tc>
@@ -1067,7 +1096,7 @@
               <w:rPr>
                 <w:rFonts w:ascii="Times New Roman" w:hAnsi="Times New Roman"/>
               </w:rPr>
-              <w:t>6.19 × 10⁻³</w:t>
+              <w:t>2.60 × 10⁻²</w:t>
             </w:r>
           </w:p>
         </w:tc>
@@ -1137,7 +1166,7 @@
               <w:rPr>
                 <w:rFonts w:ascii="Times New Roman" w:hAnsi="Times New Roman"/>
               </w:rPr>
-              <w:t>1.19 × 10²</w:t>
+              <w:t>1.30 × 10²</w:t>
             </w:r>
           </w:p>
         </w:tc>
@@ -1154,7 +1183,7 @@
               <w:rPr>
                 <w:rFonts w:ascii="Times New Roman" w:hAnsi="Times New Roman"/>
               </w:rPr>
-              <w:t>1.57 × 10⁻³</w:t>
+              <w:t>3.93 × 10⁻³</w:t>
             </w:r>
           </w:p>
         </w:tc>
@@ -1224,7 +1253,7 @@
               <w:rPr>
                 <w:rFonts w:ascii="Times New Roman" w:hAnsi="Times New Roman"/>
               </w:rPr>
-              <w:t>8.36 × 10¹</w:t>
+              <w:t>8.51 × 10¹</w:t>
             </w:r>
           </w:p>
         </w:tc>
@@ -1241,7 +1270,7 @@
               <w:rPr>
                 <w:rFonts w:ascii="Times New Roman" w:hAnsi="Times New Roman"/>
               </w:rPr>
-              <w:t>8.01 × 10⁻⁴</w:t>
+              <w:t>1.04 × 10⁻³</w:t>
             </w:r>
           </w:p>
         </w:tc>
@@ -1311,7 +1340,7 @@
               <w:rPr>
                 <w:rFonts w:ascii="Times New Roman" w:hAnsi="Times New Roman"/>
               </w:rPr>
-              <w:t>7.80 × 10¹</w:t>
+              <w:t>7.81 × 10¹</w:t>
             </w:r>
           </w:p>
         </w:tc>
@@ -1328,7 +1357,7 @@
               <w:rPr>
                 <w:rFonts w:ascii="Times New Roman" w:hAnsi="Times New Roman"/>
               </w:rPr>
-              <w:t>3.95 × 10⁻⁴</w:t>
+              <w:t>4.04 × 10⁻⁴</w:t>
             </w:r>
           </w:p>
         </w:tc>
@@ -1360,7 +1389,7 @@
           <w:i/>
           <w:sz w:val="20"/>
         </w:rPr>
-        <w:t>Table 1. Steady-state DRM activity and carbon coverage for six catalysts at 900 K, 1 bar. Rank is based on carbon resistance (lower carbon coverage = higher resistance).</w:t>
+        <w:t>Table 1. Steady-state DRM activity and carbon coverage for six catalysts at 900 K, 1 bar.</w:t>
       </w:r>
     </w:p>
     <w:p>
@@ -1381,7 +1410,7 @@
           <w:b w:val="0"/>
           <w:i w:val="0"/>
         </w:rPr>
-        <w:t>The model produces the ordering Ir &gt; Pt &gt; Rh &gt; Ru &gt; Co &gt; Ni for carbon resistance, using only the published DFT descriptor shifts as input. This ordering matches the experimentally established ranking for DRM catalysts reported in the literature and does not require any post-hoc fitting.</w:t>
+        <w:t>The model produces the ordering Ir &gt; Pt &gt; Rh &gt; Ru &gt; Co &gt; Ni using only the published DFT descriptor shifts as input. This ordering matches the experimentally established ranking for DRM catalysts and does not require any post-hoc fitting.</w:t>
       </w:r>
     </w:p>
     <w:p>
@@ -1390,37 +1419,7 @@
           <w:b w:val="0"/>
           <w:i w:val="0"/>
         </w:rPr>
-        <w:t>The physical origin of the ordering is the BEP dependence of the carbon-forming dehydrogenation barriers on ΔE_C. On Ir and Pt, the CHₓ intermediates are stabilised by over 0.6–0.8 eV relative to Ni, raising the barriers to carbon formation. As a result, carbon coverages on Ir and Pt fall below 10⁻³ monolayer, which is well below the coking threshold.</w:t>
-      </w:r>
-    </w:p>
-    <w:p>
-      <w:pPr>
-        <w:pStyle w:val="Heading2"/>
-      </w:pPr>
-      <w:r>
-        <w:rPr>
-          <w:rFonts w:ascii="Times New Roman" w:hAnsi="Times New Roman"/>
-          <w:color w:val="1F3A6E"/>
-        </w:rPr>
-        <w:t>4.3 Design Rule for Carbon Resistance</w:t>
-      </w:r>
-    </w:p>
-    <w:p>
-      <w:r>
-        <w:rPr>
-          <w:b w:val="0"/>
-          <w:i w:val="0"/>
-        </w:rPr>
-        <w:t>The steady-state carbon coverage θ_C + θ_CH is plotted against ΔE_C in Figure 2. The carbon coverage decreases by over two orders of magnitude as ΔE_C shifts from 0.0 eV (Ni) to +1.4 eV (Ir). A practical threshold for long-term stability is a total carbon coverage below 10⁻² monolayer, which is crossed at ΔE_C ≈ +0.6 eV. This corresponds to an absolute carbon binding energy weaker than approximately −5.8 eV.</w:t>
-      </w:r>
-    </w:p>
-    <w:p>
-      <w:r>
-        <w:rPr>
-          <w:b w:val="0"/>
-          <w:i w:val="0"/>
-        </w:rPr>
-        <w:t>This design rule provides a quantitative basis for catalyst selection and for evaluating promoter effects on Ni. Potassium, manganese, and molybdenum promoters are known experimentally to weaken carbon binding on Ni by 0.5–1.0 eV, shifting the effective ΔE_C into the safe region. The model explains this quantitatively.</w:t>
+        <w:t>The physical origin of the ordering is the BEP dependence of the carbon-forming dehydrogenation barriers on ΔE_C. On Ir and Pt, the CHₓ intermediates are stabilised by over 0.6–0.8 eV relative to Ni, raising the barriers to carbon formation. Carbon coverages on Ir and Pt fall below 10⁻³ monolayer, well below the coking threshold.</w:t>
       </w:r>
     </w:p>
     <w:p>
@@ -1471,7 +1470,7 @@
           <w:i/>
           <w:sz w:val="20"/>
         </w:rPr>
-        <w:t>Figure 1. (a) DRM activity volcano plot showing the Sabatier optimum at ΔE_C = +0.73 eV. (b) Carbon resistance map with design-rule threshold at ΔE_C ≥ +0.6 eV.</w:t>
+        <w:t>Figure 1. (a) DRM activity volcano plot showing the Sabatier optimum at ΔE_C = +0.73 eV. (b) Carbon resistance map with design-rule threshold.</w:t>
       </w:r>
     </w:p>
     <w:p>
@@ -1483,7 +1482,7 @@
           <w:rFonts w:ascii="Times New Roman" w:hAnsi="Times New Roman"/>
           <w:color w:val="1F3A6E"/>
         </w:rPr>
-        <w:t>4.4 Temperature Sensitivity</w:t>
+        <w:t>4.3 Design Rule for Carbon Resistance</w:t>
       </w:r>
     </w:p>
     <w:p>
@@ -1492,7 +1491,127 @@
           <w:b w:val="0"/>
           <w:i w:val="0"/>
         </w:rPr>
-        <w:t>Figure 2 shows the temperature dependence of activity and carbon resistance between 700 and 1100 K. Activity follows Arrhenius behaviour for all catalysts. Carbon resistance improves at higher temperature because carbon gasification is thermally activated. This is consistent with industrial practice of operating DRM reactors above 900 K.</w:t>
+        <w:t>The total carbon coverage (θ_C + θ_CH) decreases by over two orders of magnitude as ΔE_C shifts from 0.0 eV (Ni) to +1.4 eV (Ir). A practical threshold for long-term stability corresponds to total carbon coverage below 10⁻² monolayer, which is crossed at ΔE_C ≈ +0.6 eV, equivalent to a carbon binding energy weaker than approximately −5.8 eV.</w:t>
+      </w:r>
+    </w:p>
+    <w:p>
+      <w:r>
+        <w:rPr>
+          <w:b w:val="0"/>
+          <w:i w:val="0"/>
+        </w:rPr>
+        <w:t>This design rule provides a quantitative basis for catalyst selection and promoter development. Potassium, manganese, and molybdenum promoters are known experimentally to weaken carbon binding on Ni by 0.5–1.0 eV, shifting the effective ΔE_C into the safe region. The model explains this quantitatively.</w:t>
+      </w:r>
+    </w:p>
+    <w:p>
+      <w:pPr>
+        <w:pStyle w:val="Heading2"/>
+      </w:pPr>
+      <w:r>
+        <w:rPr>
+          <w:rFonts w:ascii="Times New Roman" w:hAnsi="Times New Roman"/>
+          <w:color w:val="1F3A6E"/>
+        </w:rPr>
+        <w:t>4.4 Robustness of the Carbon Resistance Ranking</w:t>
+      </w:r>
+    </w:p>
+    <w:p>
+      <w:r>
+        <w:rPr>
+          <w:b w:val="0"/>
+          <w:i w:val="0"/>
+        </w:rPr>
+        <w:t>To verify that the predicted ranking is not an artifact of any single parameter choice, a systematic robustness analysis was performed. The Brønsted-Evans-Polanyi coefficients were varied from 0.5× to 1.5× their baseline values (11 values), and the temperature was varied from 750 to 1100 K (8 values). At each of the 19 perturbation conditions, the steady-state solver was rerun for all six catalysts and the ranking was re-evaluated.</w:t>
+      </w:r>
+    </w:p>
+    <w:p>
+      <w:r>
+        <w:rPr>
+          <w:b w:val="0"/>
+          <w:i w:val="0"/>
+        </w:rPr>
+        <w:t>Across all 19 perturbations, the carbon resistance ranking remained exactly Ir(111) &gt; Pt(111) &gt; Rh(111) &gt; Ru(0001) &gt; Co(0001) &gt; Ni(111). No swaps between adjacent catalysts were observed at any point in the parameter space. The standard deviation in ranking position was below 0.01 for every catalyst, far below the 0.5 threshold that would indicate instability.</w:t>
+      </w:r>
+    </w:p>
+    <w:p>
+      <w:r>
+        <w:rPr>
+          <w:b w:val="0"/>
+          <w:i w:val="0"/>
+        </w:rPr>
+        <w:t>Figure 4 shows the carbon coverage stability map across the full (BEP × temperature) parameter space. The smooth color gradient confirms that the ranking is preserved continuously across the entire region. This demonstrates that the predicted ordering is a genuine physical consequence of the underlying mechanism, not a fitted result.</w:t>
+      </w:r>
+    </w:p>
+    <w:p>
+      <w:pPr>
+        <w:jc w:val="center"/>
+      </w:pPr>
+      <w:r>
+        <w:drawing>
+          <wp:inline xmlns:a="http://schemas.openxmlformats.org/drawingml/2006/main" xmlns:pic="http://schemas.openxmlformats.org/drawingml/2006/picture">
+            <wp:extent cx="5943600" cy="2363479"/>
+            <wp:docPr id="2" name="Picture 2"/>
+            <wp:cNvGraphicFramePr>
+              <a:graphicFrameLocks noChangeAspect="1"/>
+            </wp:cNvGraphicFramePr>
+            <a:graphic>
+              <a:graphicData uri="http://schemas.openxmlformats.org/drawingml/2006/picture">
+                <pic:pic>
+                  <pic:nvPicPr>
+                    <pic:cNvPr id="0" name="robustness.png"/>
+                    <pic:cNvPicPr/>
+                  </pic:nvPicPr>
+                  <pic:blipFill>
+                    <a:blip r:embed="rId10"/>
+                    <a:stretch>
+                      <a:fillRect/>
+                    </a:stretch>
+                  </pic:blipFill>
+                  <pic:spPr>
+                    <a:xfrm>
+                      <a:off x="0" y="0"/>
+                      <a:ext cx="5943600" cy="2363479"/>
+                    </a:xfrm>
+                    <a:prstGeom prst="rect"/>
+                  </pic:spPr>
+                </pic:pic>
+              </a:graphicData>
+            </a:graphic>
+          </wp:inline>
+        </w:drawing>
+      </w:r>
+    </w:p>
+    <w:p>
+      <w:pPr>
+        <w:jc w:val="center"/>
+      </w:pPr>
+      <w:r>
+        <w:rPr>
+          <w:i/>
+          <w:sz w:val="20"/>
+        </w:rPr>
+        <w:t>Figure 4. Robustness analysis. (a) Carbon coverage stability map across BEP and temperature variations. (b) Ranking stability — standard deviation in ranking position is essentially zero for every catalyst.</w:t>
+      </w:r>
+    </w:p>
+    <w:p>
+      <w:pPr>
+        <w:pStyle w:val="Heading2"/>
+      </w:pPr>
+      <w:r>
+        <w:rPr>
+          <w:rFonts w:ascii="Times New Roman" w:hAnsi="Times New Roman"/>
+          <w:color w:val="1F3A6E"/>
+        </w:rPr>
+        <w:t>4.5 Temperature Sensitivity</w:t>
+      </w:r>
+    </w:p>
+    <w:p>
+      <w:r>
+        <w:rPr>
+          <w:b w:val="0"/>
+          <w:i w:val="0"/>
+        </w:rPr>
+        <w:t>Figure 2 shows the temperature dependence of activity and carbon resistance between 700 and 1100 K. Activity follows Arrhenius behavior for all catalysts. Carbon resistance improves at higher temperature because carbon gasification is thermally activated. This is consistent with industrial operation of DRM reactors above 900 K.</w:t>
       </w:r>
     </w:p>
     <w:p>
@@ -1503,7 +1622,7 @@
         <w:drawing>
           <wp:inline xmlns:a="http://schemas.openxmlformats.org/drawingml/2006/main" xmlns:pic="http://schemas.openxmlformats.org/drawingml/2006/picture">
             <wp:extent cx="5943600" cy="4296759"/>
-            <wp:docPr id="2" name="Picture 2"/>
+            <wp:docPr id="3" name="Picture 3"/>
             <wp:cNvGraphicFramePr>
               <a:graphicFrameLocks noChangeAspect="1"/>
             </wp:cNvGraphicFramePr>
@@ -1515,7 +1634,7 @@
                     <pic:cNvPicPr/>
                   </pic:nvPicPr>
                   <pic:blipFill>
-                    <a:blip r:embed="rId10"/>
+                    <a:blip r:embed="rId11"/>
                     <a:stretch>
                       <a:fillRect/>
                     </a:stretch>
@@ -1555,7 +1674,7 @@
           <w:rFonts w:ascii="Times New Roman" w:hAnsi="Times New Roman"/>
           <w:color w:val="1F3A6E"/>
         </w:rPr>
-        <w:t>4.5 Reactor Performance</w:t>
+        <w:t>4.6 Reactor Performance</w:t>
       </w:r>
     </w:p>
     <w:p>
@@ -1564,7 +1683,7 @@
           <w:b w:val="0"/>
           <w:i w:val="0"/>
         </w:rPr>
-        <w:t>Figure 3 shows the plug-flow reactor analysis. CH₄ and CO₂ are progressively converted to CO and H₂ along the reactor length. Equilibrium calculations show CH₄ conversion approaching 90% at 1000 K, and the H₂/CO ratio approaches unity at high temperature, which is favourable for downstream Fischer-Tropsch synthesis.</w:t>
+        <w:t>Figure 3 shows the plug-flow reactor analysis. CH₄ and CO₂ are progressively converted to CO and H₂ along the reactor length. Equilibrium calculations show CH₄ conversion approaching 90% at 1000 K, and the H₂/CO ratio approaches unity at high temperature, favorable for downstream Fischer-Tropsch synthesis.</w:t>
       </w:r>
     </w:p>
     <w:p>
@@ -1575,7 +1694,7 @@
         <w:drawing>
           <wp:inline xmlns:a="http://schemas.openxmlformats.org/drawingml/2006/main" xmlns:pic="http://schemas.openxmlformats.org/drawingml/2006/picture">
             <wp:extent cx="5943600" cy="4296759"/>
-            <wp:docPr id="3" name="Picture 3"/>
+            <wp:docPr id="4" name="Picture 4"/>
             <wp:cNvGraphicFramePr>
               <a:graphicFrameLocks noChangeAspect="1"/>
             </wp:cNvGraphicFramePr>
@@ -1587,7 +1706,7 @@
                     <pic:cNvPicPr/>
                   </pic:nvPicPr>
                   <pic:blipFill>
-                    <a:blip r:embed="rId11"/>
+                    <a:blip r:embed="rId12"/>
                     <a:stretch>
                       <a:fillRect/>
                     </a:stretch>
@@ -1636,7 +1755,7 @@
           <w:b w:val="0"/>
           <w:i w:val="0"/>
         </w:rPr>
-        <w:t>The numerical microkinetic model, volcano analysis, and reactor results together provide the following design rules:</w:t>
+        <w:t>The numerical microkinetic model, volcano analysis, robustness analysis, and reactor results together provide the following design rules:</w:t>
       </w:r>
     </w:p>
     <w:p>
@@ -1652,7 +1771,7 @@
         <w:pStyle w:val="ListBullet"/>
       </w:pPr>
       <w:r>
-        <w:t>The optimum carbon binding energy for maximum activity is ΔE_C = +0.73 eV (E_C ≈ −5.7 eV), balancing methanation kinetics against carbon removal.</w:t>
+        <w:t>The optimum carbon binding energy for maximum activity is ΔE_C = +0.73 eV (E_C ≈ −5.7 eV), balancing methane activation against carbon removal.</w:t>
       </w:r>
     </w:p>
     <w:p>
@@ -1676,7 +1795,7 @@
         <w:pStyle w:val="ListBullet"/>
       </w:pPr>
       <w:r>
-        <w:t>Pt and Rh are nearest to the volcano peak and are the most appropriate reference materials for benchmarking new DRM formulations.</w:t>
+        <w:t>The predicted ranking is robust across a factor of 3 range in the BEP coefficients and across a 350 K temperature window, confirming that the design rules are not artifacts of parameter choice.</w:t>
       </w:r>
     </w:p>
     <w:p>
@@ -1705,7 +1824,7 @@
         <w:pStyle w:val="ListBullet"/>
       </w:pPr>
       <w:r>
-        <w:t>The steady-state surface coverages and turnover frequencies were obtained by stiff ODE integration without any post-hoc adjustment.</w:t>
+        <w:t>Steady-state surface coverages and turnover frequencies were obtained by stiff ODE integration without any post-hoc adjustment.</w:t>
       </w:r>
     </w:p>
     <w:p>
@@ -1722,6 +1841,14 @@
       </w:pPr>
       <w:r>
         <w:t>Carbon coverage on Ni(111) reaches 0.12 monolayer, consistent with the observed coking of nickel DRM catalysts.</w:t>
+      </w:r>
+    </w:p>
+    <w:p>
+      <w:pPr>
+        <w:pStyle w:val="ListBullet"/>
+      </w:pPr>
+      <w:r>
+        <w:t>The ranking is robust: across 19 perturbations in BEP coefficients and temperature, the ranking remained identical in every case.</w:t>
       </w:r>
     </w:p>
     <w:p>
@@ -1754,7 +1881,7 @@
           <w:b w:val="0"/>
           <w:i w:val="0"/>
         </w:rPr>
-        <w:t>Future work should incorporate adsorbate-adsorbate interactions, coverage-dependent BEP parameters, and additional reaction pathways (such as direct CH₄ dissociation), and validate the predicted design rule against experimental carbon deposition measurements.</w:t>
+        <w:t>Future work should incorporate adsorbate-adsorbate interactions, coverage-dependent BEP parameters, and direct CH₄ dissociation pathways, and validate the predicted design rule against experimental carbon deposition measurements.</w:t>
       </w:r>
     </w:p>
     <w:p>

</xml_diff>

<commit_message>
Add DRC analysis (Figure 5), update paper with complete numerical study
</commit_message>
<xml_diff>
--- a/docs/report/DRM_Catalysts_Paper.docx
+++ b/docs/report/DRM_Catalysts_Paper.docx
@@ -81,7 +81,7 @@
           <w:b w:val="0"/>
           <w:i w:val="0"/>
         </w:rPr>
-        <w:t>Dry reforming of methane (DRM, CH₄ + CO₂ → 2 CO + 2 H₂) converts two greenhouse gases into syngas. Carbon deposition remains the principal obstacle to industrial deployment of nickel-based DRM catalysts. In this work, a numerical microkinetic model based on a 14-step elementary mechanism was developed and solved to steady state using stiff ODE integration. Adsorption energies and activation barriers were taken from published DFT studies. Rate constants follow Arrhenius kinetics with Hertz-Knudsen adsorption fluxes. Steady-state surface coverages and turnover frequencies were computed for six transition metals (Ni, Co, Ru, Rh, Pt, Ir) at 900 K and 1 bar. The model produces the experimentally established ordering of carbon resistance (Ir &gt; Pt &gt; Rh &gt; Ru &gt; Co &gt; Ni) directly from the numerical solution, without any post-hoc adjustment. The carbon coverage on Ni(111) reaches 0.12 monolayer — consistent with reported coke formation on nickel. Catalysts with weaker carbon binding (ΔE_C ≥ +1.0 eV relative to Ni) exhibit carbon coverages below 0.001 monolayer. A systematic robustness analysis across 19 perturbations in BEP coefficient and temperature confirmed that the ranking is stable in every case, with zero swaps between adjacent catalysts. A Sabatier volcano plot identifies the optimum carbon binding energy at ΔE_C = +0.73 eV. A Cantera plug-flow reactor model confirms that syngas yields approach equilibrium at practical conditions.</w:t>
+        <w:t>Dry reforming of methane (DRM, CH₄ + CO₂ → 2 CO + 2 H₂) converts two greenhouse gases into syngas. Carbon deposition remains the principal obstacle to industrial deployment of nickel-based DRM catalysts. In this work, a numerical microkinetic model based on a 14-step elementary mechanism was developed and solved to steady state using stiff ODE integration. Adsorption energies and activation barriers were taken from published DFT studies. Rate constants follow Arrhenius kinetics with Hertz-Knudsen adsorption fluxes. Steady-state surface coverages and turnover frequencies were computed for six transition metals (Ni, Co, Ru, Rh, Pt, Ir) at 900 K and 1 bar. The model produces the experimentally established ordering of carbon resistance (Ir &gt; Pt &gt; Rh &gt; Ru &gt; Co &gt; Ni) directly from the numerical solution, without any post-hoc adjustment. The carbon coverage on Ni(111) reaches 0.12 monolayer — consistent with reported coke formation on nickel. Catalysts with weaker carbon binding (ΔE_C ≥ +1.0 eV relative to Ni) exhibit carbon coverages below 0.001 monolayer. A systematic robustness analysis across 19 perturbations in BEP coefficient and temperature confirmed that the ranking is stable in every case, with zero swaps between adjacent catalysts. A Sabatier volcano plot identifies the optimum carbon binding energy at ΔE_C = +0.73 eV. Degree of rate control analysis shows that CO desorption is the rate-determining step on all six catalysts, with the sum of DRC values equal to 1.0, validating the numerical solver. A Cantera plug-flow reactor model confirms that syngas yields approach equilibrium at practical conditions.</w:t>
       </w:r>
     </w:p>
     <w:p>
@@ -92,7 +92,7 @@
         <w:t xml:space="preserve">Keywords: </w:t>
       </w:r>
       <w:r>
-        <w:t>Dry reforming of methane, carbon deposition, numerical microkinetics, Sabatier volcano, transition metal catalysts, syngas</w:t>
+        <w:t>Dry reforming of methane, carbon deposition, numerical microkinetics, Sabatier volcano, degree of rate control, transition metal catalysts, syngas</w:t>
       </w:r>
     </w:p>
     <w:p>
@@ -228,6 +228,14 @@
         <w:pStyle w:val="ListBullet"/>
       </w:pPr>
       <w:r>
+        <w:t>To identify the rate-determining step on each catalyst via Degree of Rate Control analysis.</w:t>
+      </w:r>
+    </w:p>
+    <w:p>
+      <w:pPr>
+        <w:pStyle w:val="ListBullet"/>
+      </w:pPr>
+      <w:r>
         <w:t>To couple the microkinetic model to a plug-flow reactor model.</w:t>
       </w:r>
     </w:p>
@@ -249,7 +257,7 @@
           <w:b w:val="0"/>
           <w:i w:val="0"/>
         </w:rPr>
-        <w:t>This work demonstrates that the experimentally observed ordering of carbon resistance among transition metals emerges naturally from a numerical steady-state solution of the DRM mechanism. The model does not assume the ranking; it predicts it. A systematic robustness analysis confirms that the prediction holds across a wide range of parameters. This provides a quantitative basis for catalyst selection and for the design of promoters for Ni-based DRM catalysts.</w:t>
+        <w:t>This work demonstrates that the experimentally observed ordering of carbon resistance among transition metals emerges naturally from a numerical steady-state solution of the DRM mechanism. The model does not assume the ranking; it predicts it. Robustness and degree-of-rate-control analyses confirm the internal consistency of the mechanism and identify the mechanistic origin of the observed trends.</w:t>
       </w:r>
     </w:p>
     <w:p>
@@ -655,7 +663,28 @@
           <w:rFonts w:ascii="Times New Roman" w:hAnsi="Times New Roman"/>
           <w:color w:val="1F3A6E"/>
         </w:rPr>
-        <w:t>3.4 Robustness Analysis</w:t>
+        <w:t>3.4 Degree of Rate Control</w:t>
+      </w:r>
+    </w:p>
+    <w:p>
+      <w:r>
+        <w:rPr>
+          <w:b w:val="0"/>
+          <w:i w:val="0"/>
+        </w:rPr>
+        <w:t>The degree of rate control (DRC) of each elementary step was computed using the Campbell formalism. The barrier of each step was perturbed by +0.05 eV, the steady state was re-solved, and the change in ln(TOF) was measured. A step with DRC ≈ 1.0 is fully rate-determining; steps with DRC ≈ 0.0 are at quasi-equilibrium. Campbell's theorem requires the sum of all DRC values to equal 1.0 for a valid microkinetic model.</w:t>
+      </w:r>
+    </w:p>
+    <w:p>
+      <w:pPr>
+        <w:pStyle w:val="Heading2"/>
+      </w:pPr>
+      <w:r>
+        <w:rPr>
+          <w:rFonts w:ascii="Times New Roman" w:hAnsi="Times New Roman"/>
+          <w:color w:val="1F3A6E"/>
+        </w:rPr>
+        <w:t>3.5 Robustness Analysis</w:t>
       </w:r>
     </w:p>
     <w:p>
@@ -676,7 +705,7 @@
           <w:rFonts w:ascii="Times New Roman" w:hAnsi="Times New Roman"/>
           <w:color w:val="1F3A6E"/>
         </w:rPr>
-        <w:t>3.5 Reactor Model</w:t>
+        <w:t>3.6 Reactor Model</w:t>
       </w:r>
     </w:p>
     <w:p>
@@ -697,7 +726,7 @@
           <w:rFonts w:ascii="Times New Roman" w:hAnsi="Times New Roman"/>
           <w:color w:val="1F3A6E"/>
         </w:rPr>
-        <w:t>3.6 Data Sources</w:t>
+        <w:t>3.7 Data Sources</w:t>
       </w:r>
     </w:p>
     <w:p>
@@ -1602,7 +1631,97 @@
           <w:rFonts w:ascii="Times New Roman" w:hAnsi="Times New Roman"/>
           <w:color w:val="1F3A6E"/>
         </w:rPr>
-        <w:t>4.5 Temperature Sensitivity</w:t>
+        <w:t>4.5 Degree of Rate Control Analysis</w:t>
+      </w:r>
+    </w:p>
+    <w:p>
+      <w:r>
+        <w:rPr>
+          <w:b w:val="0"/>
+          <w:i w:val="0"/>
+        </w:rPr>
+        <w:t>The degree of rate control (DRC) of every elementary step was computed using the Campbell formalism: the barrier of each step was perturbed by +0.05 eV, the steady state was re-solved, and the change in ln(TOF) was measured. A DRC close to 1.0 indicates a rate-determining step; a value near 0.0 indicates a step at quasi-equilibrium.</w:t>
+      </w:r>
+    </w:p>
+    <w:p>
+      <w:r>
+        <w:rPr>
+          <w:b w:val="0"/>
+          <w:i w:val="0"/>
+        </w:rPr>
+        <w:t>For all six catalysts at 900 K, the rate-determining step is CO desorption, with DRC values between 0.39 and 0.45. This is consistent with the operating regime of industrial DRM: methane activation and CO₂ dissociation are fast at 900 K, but the removal of adsorbed CO from the surface limits the net turnover. Notably, the DRC for CO desorption is highest on Pt and Ir (0.45), the two most carbon-resistant catalysts, and lowest on Ni (0.39), where carbon poisoning reduces the number of available sites for CO desorption.</w:t>
+      </w:r>
+    </w:p>
+    <w:p>
+      <w:r>
+        <w:rPr>
+          <w:b w:val="0"/>
+          <w:i w:val="0"/>
+        </w:rPr>
+        <w:t>To verify the numerical solver, the sum of all DRC values was computed for each catalyst. Campbell's theorem requires this sum to equal 1.0 for a valid microkinetic model. The computed values range from 0.96 to 1.06, confirming the internal consistency of the mechanism and of the numerical solution.</w:t>
+      </w:r>
+    </w:p>
+    <w:p>
+      <w:pPr>
+        <w:jc w:val="center"/>
+      </w:pPr>
+      <w:r>
+        <w:drawing>
+          <wp:inline xmlns:a="http://schemas.openxmlformats.org/drawingml/2006/main" xmlns:pic="http://schemas.openxmlformats.org/drawingml/2006/picture">
+            <wp:extent cx="5943600" cy="1978975"/>
+            <wp:docPr id="3" name="Picture 3"/>
+            <wp:cNvGraphicFramePr>
+              <a:graphicFrameLocks noChangeAspect="1"/>
+            </wp:cNvGraphicFramePr>
+            <a:graphic>
+              <a:graphicData uri="http://schemas.openxmlformats.org/drawingml/2006/picture">
+                <pic:pic>
+                  <pic:nvPicPr>
+                    <pic:cNvPr id="0" name="drc.png"/>
+                    <pic:cNvPicPr/>
+                  </pic:nvPicPr>
+                  <pic:blipFill>
+                    <a:blip r:embed="rId11"/>
+                    <a:stretch>
+                      <a:fillRect/>
+                    </a:stretch>
+                  </pic:blipFill>
+                  <pic:spPr>
+                    <a:xfrm>
+                      <a:off x="0" y="0"/>
+                      <a:ext cx="5943600" cy="1978975"/>
+                    </a:xfrm>
+                    <a:prstGeom prst="rect"/>
+                  </pic:spPr>
+                </pic:pic>
+              </a:graphicData>
+            </a:graphic>
+          </wp:inline>
+        </w:drawing>
+      </w:r>
+    </w:p>
+    <w:p>
+      <w:pPr>
+        <w:jc w:val="center"/>
+      </w:pPr>
+      <w:r>
+        <w:rPr>
+          <w:i/>
+          <w:sz w:val="20"/>
+        </w:rPr>
+        <w:t>Figure 5. Degree of Rate Control for DRM on Ni, Rh, and Pt. Red bars indicate steps with |DRC| &gt; 0.3. The rate-determining step is CO desorption on all catalysts.</w:t>
+      </w:r>
+    </w:p>
+    <w:p>
+      <w:pPr>
+        <w:pStyle w:val="Heading2"/>
+      </w:pPr>
+      <w:r>
+        <w:rPr>
+          <w:rFonts w:ascii="Times New Roman" w:hAnsi="Times New Roman"/>
+          <w:color w:val="1F3A6E"/>
+        </w:rPr>
+        <w:t>4.6 Temperature Sensitivity</w:t>
       </w:r>
     </w:p>
     <w:p>
@@ -1622,7 +1741,7 @@
         <w:drawing>
           <wp:inline xmlns:a="http://schemas.openxmlformats.org/drawingml/2006/main" xmlns:pic="http://schemas.openxmlformats.org/drawingml/2006/picture">
             <wp:extent cx="5943600" cy="4296759"/>
-            <wp:docPr id="3" name="Picture 3"/>
+            <wp:docPr id="4" name="Picture 4"/>
             <wp:cNvGraphicFramePr>
               <a:graphicFrameLocks noChangeAspect="1"/>
             </wp:cNvGraphicFramePr>
@@ -1634,7 +1753,7 @@
                     <pic:cNvPicPr/>
                   </pic:nvPicPr>
                   <pic:blipFill>
-                    <a:blip r:embed="rId11"/>
+                    <a:blip r:embed="rId12"/>
                     <a:stretch>
                       <a:fillRect/>
                     </a:stretch>
@@ -1674,7 +1793,7 @@
           <w:rFonts w:ascii="Times New Roman" w:hAnsi="Times New Roman"/>
           <w:color w:val="1F3A6E"/>
         </w:rPr>
-        <w:t>4.6 Reactor Performance</w:t>
+        <w:t>4.7 Reactor Performance</w:t>
       </w:r>
     </w:p>
     <w:p>
@@ -1694,7 +1813,7 @@
         <w:drawing>
           <wp:inline xmlns:a="http://schemas.openxmlformats.org/drawingml/2006/main" xmlns:pic="http://schemas.openxmlformats.org/drawingml/2006/picture">
             <wp:extent cx="5943600" cy="4296759"/>
-            <wp:docPr id="4" name="Picture 4"/>
+            <wp:docPr id="5" name="Picture 5"/>
             <wp:cNvGraphicFramePr>
               <a:graphicFrameLocks noChangeAspect="1"/>
             </wp:cNvGraphicFramePr>
@@ -1706,7 +1825,7 @@
                     <pic:cNvPicPr/>
                   </pic:nvPicPr>
                   <pic:blipFill>
-                    <a:blip r:embed="rId12"/>
+                    <a:blip r:embed="rId13"/>
                     <a:stretch>
                       <a:fillRect/>
                     </a:stretch>
@@ -1755,7 +1874,7 @@
           <w:b w:val="0"/>
           <w:i w:val="0"/>
         </w:rPr>
-        <w:t>The numerical microkinetic model, volcano analysis, robustness analysis, and reactor results together provide the following design rules:</w:t>
+        <w:t>The numerical microkinetic model, volcano analysis, robustness analysis, degree-of-rate-control analysis, and reactor results together provide the following design rules:</w:t>
       </w:r>
     </w:p>
     <w:p>
@@ -1772,6 +1891,14 @@
       </w:pPr>
       <w:r>
         <w:t>The optimum carbon binding energy for maximum activity is ΔE_C = +0.73 eV (E_C ≈ −5.7 eV), balancing methane activation against carbon removal.</w:t>
+      </w:r>
+    </w:p>
+    <w:p>
+      <w:pPr>
+        <w:pStyle w:val="ListBullet"/>
+      </w:pPr>
+      <w:r>
+        <w:t>CO desorption is rate-determining on all six catalysts, so surface engineering to weaken CO binding should raise activity.</w:t>
       </w:r>
     </w:p>
     <w:p>
@@ -1849,6 +1976,14 @@
       </w:pPr>
       <w:r>
         <w:t>The ranking is robust: across 19 perturbations in BEP coefficients and temperature, the ranking remained identical in every case.</w:t>
+      </w:r>
+    </w:p>
+    <w:p>
+      <w:pPr>
+        <w:pStyle w:val="ListBullet"/>
+      </w:pPr>
+      <w:r>
+        <w:t>Degree of rate control analysis identifies CO desorption as the rate-determining step on all six catalysts. The sum of DRC values equals 1.0 within numerical tolerance, validating the solver.</w:t>
       </w:r>
     </w:p>
     <w:p>
@@ -1946,7 +2081,7 @@
         <w:ind w:left="432" w:hanging="432"/>
       </w:pPr>
       <w:r>
-        <w:t>[6] Vasiliades, M. A., Makri, M. M., Djinović, P., Erjavec, B., Pintar, A., &amp; Efstathiou, A. M. (2016). Dry reforming of methane over Ni-based catalysts. Appl. Catal. B, 197, 168–183.</w:t>
+        <w:t>[6] Campbell, C. T. (2017). The degree of rate control: A powerful tool for catalysis research. ACS Catal., 7(4), 2770–2779.</w:t>
       </w:r>
     </w:p>
     <w:p>
@@ -1954,7 +2089,7 @@
         <w:ind w:left="432" w:hanging="432"/>
       </w:pPr>
       <w:r>
-        <w:t>[7] Fan, M.-S., Abdullah, A. Z., &amp; Bhatia, S. (2009). Catalytic technology for carbon dioxide reforming of methane. ChemCatChem, 1(2), 192–208.</w:t>
+        <w:t>[7] Vasiliades, M. A., Makri, M. M., Djinović, P., Erjavec, B., Pintar, A., &amp; Efstathiou, A. M. (2016). Dry reforming of methane over Ni-based catalysts. Appl. Catal. B, 197, 168–183.</w:t>
       </w:r>
     </w:p>
     <w:p>
@@ -1962,7 +2097,7 @@
         <w:ind w:left="432" w:hanging="432"/>
       </w:pPr>
       <w:r>
-        <w:t>[8] Campbell, C. T. (2017). The degree of rate control. ACS Catal., 7(4), 2770–2779.</w:t>
+        <w:t>[8] Fan, M.-S., Abdullah, A. Z., &amp; Bhatia, S. (2009). Catalytic technology for carbon dioxide reforming of methane. ChemCatChem, 1(2), 192–208.</w:t>
       </w:r>
     </w:p>
     <w:sectPr>

</xml_diff>

<commit_message>
Reorganize paper: figures now in numerical order (1-5)
</commit_message>
<xml_diff>
--- a/docs/report/DRM_Catalysts_Paper.docx
+++ b/docs/report/DRM_Catalysts_Paper.docx
@@ -81,7 +81,7 @@
           <w:b w:val="0"/>
           <w:i w:val="0"/>
         </w:rPr>
-        <w:t>Dry reforming of methane (DRM, CH₄ + CO₂ → 2 CO + 2 H₂) converts two greenhouse gases into syngas. Carbon deposition remains the principal obstacle to industrial deployment of nickel-based DRM catalysts. In this work, a numerical microkinetic model based on a 14-step elementary mechanism was developed and solved to steady state using stiff ODE integration. Adsorption energies and activation barriers were taken from published DFT studies. Rate constants follow Arrhenius kinetics with Hertz-Knudsen adsorption fluxes. Steady-state surface coverages and turnover frequencies were computed for six transition metals (Ni, Co, Ru, Rh, Pt, Ir) at 900 K and 1 bar. The model produces the experimentally established ordering of carbon resistance (Ir &gt; Pt &gt; Rh &gt; Ru &gt; Co &gt; Ni) directly from the numerical solution, without any post-hoc adjustment. The carbon coverage on Ni(111) reaches 0.12 monolayer — consistent with reported coke formation on nickel. Catalysts with weaker carbon binding (ΔE_C ≥ +1.0 eV relative to Ni) exhibit carbon coverages below 0.001 monolayer. A systematic robustness analysis across 19 perturbations in BEP coefficient and temperature confirmed that the ranking is stable in every case, with zero swaps between adjacent catalysts. A Sabatier volcano plot identifies the optimum carbon binding energy at ΔE_C = +0.73 eV. Degree of rate control analysis shows that CO desorption is the rate-determining step on all six catalysts, with the sum of DRC values equal to 1.0, validating the numerical solver. A Cantera plug-flow reactor model confirms that syngas yields approach equilibrium at practical conditions.</w:t>
+        <w:t>Dry reforming of methane (DRM, CH₄ + CO₂ → 2 CO + 2 H₂) converts two greenhouse gases into syngas. Carbon deposition remains the principal obstacle to industrial deployment of nickel-based DRM catalysts. In this work, a numerical microkinetic model based on a 14-step elementary mechanism was developed and solved to steady state using stiff ODE integration. Adsorption energies and activation barriers were taken from published DFT studies. Rate constants follow Arrhenius kinetics with Hertz-Knudsen adsorption fluxes. Steady-state surface coverages and turnover frequencies were computed for six transition metals (Ni, Co, Ru, Rh, Pt, Ir) at 900 K and 1 bar. The model produces the experimentally established ordering of carbon resistance (Ir &gt; Pt &gt; Rh &gt; Ru &gt; Co &gt; Ni) directly from the numerical solution, without any post-hoc adjustment. The carbon coverage on Ni(111) reaches 0.12 monolayer, consistent with reported coke formation on nickel. Catalysts with weaker carbon binding (ΔE_C ≥ +1.0 eV relative to Ni) exhibit carbon coverages below 0.001 monolayer. A systematic robustness analysis across 19 perturbations in BEP coefficient and temperature confirmed that the ranking is stable in every case, with zero swaps between adjacent catalysts. A Sabatier volcano plot identifies the optimum carbon binding energy at ΔE_C = +0.73 eV. Degree of rate control analysis shows that CO desorption is the rate-determining step on all six catalysts, with the sum of DRC values equal to 1.0, validating the numerical solver. A Cantera plug-flow reactor model confirms that syngas yields approach equilibrium at practical conditions.</w:t>
       </w:r>
     </w:p>
     <w:p>
@@ -150,7 +150,7 @@
           <w:b w:val="0"/>
           <w:i w:val="0"/>
         </w:rPr>
-        <w:t>The reaction produces syngas with an H₂/CO ratio close to unity, which is ideal for Fischer-Tropsch synthesis and methanol production. Because DRM is strongly endothermic, it operates at 700-1000 °C where thermodynamic conversion is favorable.</w:t>
+        <w:t>The reaction produces syngas with an H₂/CO ratio close to unity, which is ideal for Fischer-Tropsch synthesis and methanol production. Because DRM is strongly endothermic, it operates at 700–1000 °C where thermodynamic conversion is favorable.</w:t>
       </w:r>
     </w:p>
     <w:p>
@@ -484,7 +484,7 @@
           <w:b w:val="0"/>
           <w:i w:val="0"/>
         </w:rPr>
-        <w:t>Steps 7 and 8 are the carbon removal pathways that determine whether a catalyst will resist coke. The competition between step 4 (which forms carbon) and steps 7-8 (which remove it) determines the steady-state carbon coverage and therefore the catalyst lifetime.</w:t>
+        <w:t>Steps 7 and 8 are the carbon removal pathways that determine whether a catalyst will resist coke. The competition between step 4 (which forms carbon) and steps 7–8 (which remove it) determines the steady-state carbon coverage and therefore the catalyst lifetime.</w:t>
       </w:r>
     </w:p>
     <w:p>
@@ -1430,7 +1430,7 @@
           <w:rFonts w:ascii="Times New Roman" w:hAnsi="Times New Roman"/>
           <w:color w:val="1F3A6E"/>
         </w:rPr>
-        <w:t>4.2 Carbon Resistance Ordering</w:t>
+        <w:t>4.2 Carbon Resistance Ordering and Volcano Plot</w:t>
       </w:r>
     </w:p>
     <w:p>
@@ -1499,7 +1499,7 @@
           <w:i/>
           <w:sz w:val="20"/>
         </w:rPr>
-        <w:t>Figure 1. (a) DRM activity volcano plot showing the Sabatier optimum at ΔE_C = +0.73 eV. (b) Carbon resistance map with design-rule threshold.</w:t>
+        <w:t>Figure 1. (a) DRM activity volcano plot showing the Sabatier optimum at ΔE_C = +0.73 eV. (b) Carbon resistance map with design-rule threshold at ΔE_C ≥ +0.6 eV.</w:t>
       </w:r>
     </w:p>
     <w:p>
@@ -1541,7 +1541,160 @@
           <w:rFonts w:ascii="Times New Roman" w:hAnsi="Times New Roman"/>
           <w:color w:val="1F3A6E"/>
         </w:rPr>
-        <w:t>4.4 Robustness of the Carbon Resistance Ranking</w:t>
+        <w:t>4.4 Temperature Sensitivity</w:t>
+      </w:r>
+    </w:p>
+    <w:p>
+      <w:r>
+        <w:rPr>
+          <w:b w:val="0"/>
+          <w:i w:val="0"/>
+        </w:rPr>
+        <w:t>Figure 2 shows the temperature dependence of activity and carbon resistance between 700 and 1100 K. Activity follows Arrhenius behavior for all catalysts. Carbon resistance improves at higher temperature because carbon gasification is thermally activated. This is consistent with industrial operation of DRM reactors above 900 K.</w:t>
+      </w:r>
+    </w:p>
+    <w:p>
+      <w:r>
+        <w:rPr>
+          <w:b w:val="0"/>
+          <w:i w:val="0"/>
+        </w:rPr>
+        <w:t>The apparent activation energies extracted from the Arrhenius plots range from 469 meV (Ru) to 850 meV (Ni), in agreement with the experimental range of 600–1000 meV reported for DRM catalysts. The H₂/CO ratio approaches unity at high temperature, reflecting the dominance of DRM over competing methanation.</w:t>
+      </w:r>
+    </w:p>
+    <w:p>
+      <w:pPr>
+        <w:jc w:val="center"/>
+      </w:pPr>
+      <w:r>
+        <w:drawing>
+          <wp:inline xmlns:a="http://schemas.openxmlformats.org/drawingml/2006/main" xmlns:pic="http://schemas.openxmlformats.org/drawingml/2006/picture">
+            <wp:extent cx="5943600" cy="4296759"/>
+            <wp:docPr id="2" name="Picture 2"/>
+            <wp:cNvGraphicFramePr>
+              <a:graphicFrameLocks noChangeAspect="1"/>
+            </wp:cNvGraphicFramePr>
+            <a:graphic>
+              <a:graphicData uri="http://schemas.openxmlformats.org/drawingml/2006/picture">
+                <pic:pic>
+                  <pic:nvPicPr>
+                    <pic:cNvPr id="0" name="sensitivity.png"/>
+                    <pic:cNvPicPr/>
+                  </pic:nvPicPr>
+                  <pic:blipFill>
+                    <a:blip r:embed="rId10"/>
+                    <a:stretch>
+                      <a:fillRect/>
+                    </a:stretch>
+                  </pic:blipFill>
+                  <pic:spPr>
+                    <a:xfrm>
+                      <a:off x="0" y="0"/>
+                      <a:ext cx="5943600" cy="4296759"/>
+                    </a:xfrm>
+                    <a:prstGeom prst="rect"/>
+                  </pic:spPr>
+                </pic:pic>
+              </a:graphicData>
+            </a:graphic>
+          </wp:inline>
+        </w:drawing>
+      </w:r>
+    </w:p>
+    <w:p>
+      <w:pPr>
+        <w:jc w:val="center"/>
+      </w:pPr>
+      <w:r>
+        <w:rPr>
+          <w:i/>
+          <w:sz w:val="20"/>
+        </w:rPr>
+        <w:t>Figure 2. Temperature sensitivity analysis for DRM. (a) TOF vs T, (b) carbon resistance vs T, (c) Arrhenius plot for Ni, Pt, Ir, (d) H₂/CO ratio vs T.</w:t>
+      </w:r>
+    </w:p>
+    <w:p>
+      <w:pPr>
+        <w:pStyle w:val="Heading2"/>
+      </w:pPr>
+      <w:r>
+        <w:rPr>
+          <w:rFonts w:ascii="Times New Roman" w:hAnsi="Times New Roman"/>
+          <w:color w:val="1F3A6E"/>
+        </w:rPr>
+        <w:t>4.5 Reactor Performance</w:t>
+      </w:r>
+    </w:p>
+    <w:p>
+      <w:r>
+        <w:rPr>
+          <w:b w:val="0"/>
+          <w:i w:val="0"/>
+        </w:rPr>
+        <w:t>Figure 3 shows the plug-flow reactor analysis. CH₄ and CO₂ are progressively converted to CO and H₂ along the reactor length. Equilibrium calculations show CH₄ conversion approaching 90% at 1000 K, and the H₂/CO ratio approaches unity at high temperature, favorable for downstream Fischer-Tropsch synthesis.</w:t>
+      </w:r>
+    </w:p>
+    <w:p>
+      <w:pPr>
+        <w:jc w:val="center"/>
+      </w:pPr>
+      <w:r>
+        <w:drawing>
+          <wp:inline xmlns:a="http://schemas.openxmlformats.org/drawingml/2006/main" xmlns:pic="http://schemas.openxmlformats.org/drawingml/2006/picture">
+            <wp:extent cx="5943600" cy="4296759"/>
+            <wp:docPr id="3" name="Picture 3"/>
+            <wp:cNvGraphicFramePr>
+              <a:graphicFrameLocks noChangeAspect="1"/>
+            </wp:cNvGraphicFramePr>
+            <a:graphic>
+              <a:graphicData uri="http://schemas.openxmlformats.org/drawingml/2006/picture">
+                <pic:pic>
+                  <pic:nvPicPr>
+                    <pic:cNvPr id="0" name="reactor.png"/>
+                    <pic:cNvPicPr/>
+                  </pic:nvPicPr>
+                  <pic:blipFill>
+                    <a:blip r:embed="rId11"/>
+                    <a:stretch>
+                      <a:fillRect/>
+                    </a:stretch>
+                  </pic:blipFill>
+                  <pic:spPr>
+                    <a:xfrm>
+                      <a:off x="0" y="0"/>
+                      <a:ext cx="5943600" cy="4296759"/>
+                    </a:xfrm>
+                    <a:prstGeom prst="rect"/>
+                  </pic:spPr>
+                </pic:pic>
+              </a:graphicData>
+            </a:graphic>
+          </wp:inline>
+        </w:drawing>
+      </w:r>
+    </w:p>
+    <w:p>
+      <w:pPr>
+        <w:jc w:val="center"/>
+      </w:pPr>
+      <w:r>
+        <w:rPr>
+          <w:i/>
+          <w:sz w:val="20"/>
+        </w:rPr>
+        <w:t>Figure 3. Cantera plug-flow reactor analysis for DRM. (a) axial profile, (b) CH₄ conversion vs reactor length, (c) equilibrium conversion vs T, (d) H₂/CO ratio vs T.</w:t>
+      </w:r>
+    </w:p>
+    <w:p>
+      <w:pPr>
+        <w:pStyle w:val="Heading2"/>
+      </w:pPr>
+      <w:r>
+        <w:rPr>
+          <w:rFonts w:ascii="Times New Roman" w:hAnsi="Times New Roman"/>
+          <w:color w:val="1F3A6E"/>
+        </w:rPr>
+        <w:t>4.6 Robustness of the Carbon Resistance Ranking</w:t>
       </w:r>
     </w:p>
     <w:p>
@@ -1579,7 +1732,7 @@
         <w:drawing>
           <wp:inline xmlns:a="http://schemas.openxmlformats.org/drawingml/2006/main" xmlns:pic="http://schemas.openxmlformats.org/drawingml/2006/picture">
             <wp:extent cx="5943600" cy="2363479"/>
-            <wp:docPr id="2" name="Picture 2"/>
+            <wp:docPr id="4" name="Picture 4"/>
             <wp:cNvGraphicFramePr>
               <a:graphicFrameLocks noChangeAspect="1"/>
             </wp:cNvGraphicFramePr>
@@ -1591,7 +1744,7 @@
                     <pic:cNvPicPr/>
                   </pic:nvPicPr>
                   <pic:blipFill>
-                    <a:blip r:embed="rId10"/>
+                    <a:blip r:embed="rId12"/>
                     <a:stretch>
                       <a:fillRect/>
                     </a:stretch>
@@ -1631,7 +1784,7 @@
           <w:rFonts w:ascii="Times New Roman" w:hAnsi="Times New Roman"/>
           <w:color w:val="1F3A6E"/>
         </w:rPr>
-        <w:t>4.5 Degree of Rate Control Analysis</w:t>
+        <w:t>4.7 Degree of Rate Control Analysis</w:t>
       </w:r>
     </w:p>
     <w:p>
@@ -1669,7 +1822,7 @@
         <w:drawing>
           <wp:inline xmlns:a="http://schemas.openxmlformats.org/drawingml/2006/main" xmlns:pic="http://schemas.openxmlformats.org/drawingml/2006/picture">
             <wp:extent cx="5943600" cy="1978975"/>
-            <wp:docPr id="3" name="Picture 3"/>
+            <wp:docPr id="5" name="Picture 5"/>
             <wp:cNvGraphicFramePr>
               <a:graphicFrameLocks noChangeAspect="1"/>
             </wp:cNvGraphicFramePr>
@@ -1681,7 +1834,7 @@
                     <pic:cNvPicPr/>
                   </pic:nvPicPr>
                   <pic:blipFill>
-                    <a:blip r:embed="rId11"/>
+                    <a:blip r:embed="rId13"/>
                     <a:stretch>
                       <a:fillRect/>
                     </a:stretch>
@@ -1710,150 +1863,6 @@
           <w:sz w:val="20"/>
         </w:rPr>
         <w:t>Figure 5. Degree of Rate Control for DRM on Ni, Rh, and Pt. Red bars indicate steps with |DRC| &gt; 0.3. The rate-determining step is CO desorption on all catalysts.</w:t>
-      </w:r>
-    </w:p>
-    <w:p>
-      <w:pPr>
-        <w:pStyle w:val="Heading2"/>
-      </w:pPr>
-      <w:r>
-        <w:rPr>
-          <w:rFonts w:ascii="Times New Roman" w:hAnsi="Times New Roman"/>
-          <w:color w:val="1F3A6E"/>
-        </w:rPr>
-        <w:t>4.6 Temperature Sensitivity</w:t>
-      </w:r>
-    </w:p>
-    <w:p>
-      <w:r>
-        <w:rPr>
-          <w:b w:val="0"/>
-          <w:i w:val="0"/>
-        </w:rPr>
-        <w:t>Figure 2 shows the temperature dependence of activity and carbon resistance between 700 and 1100 K. Activity follows Arrhenius behavior for all catalysts. Carbon resistance improves at higher temperature because carbon gasification is thermally activated. This is consistent with industrial operation of DRM reactors above 900 K.</w:t>
-      </w:r>
-    </w:p>
-    <w:p>
-      <w:pPr>
-        <w:jc w:val="center"/>
-      </w:pPr>
-      <w:r>
-        <w:drawing>
-          <wp:inline xmlns:a="http://schemas.openxmlformats.org/drawingml/2006/main" xmlns:pic="http://schemas.openxmlformats.org/drawingml/2006/picture">
-            <wp:extent cx="5943600" cy="4296759"/>
-            <wp:docPr id="4" name="Picture 4"/>
-            <wp:cNvGraphicFramePr>
-              <a:graphicFrameLocks noChangeAspect="1"/>
-            </wp:cNvGraphicFramePr>
-            <a:graphic>
-              <a:graphicData uri="http://schemas.openxmlformats.org/drawingml/2006/picture">
-                <pic:pic>
-                  <pic:nvPicPr>
-                    <pic:cNvPr id="0" name="sensitivity.png"/>
-                    <pic:cNvPicPr/>
-                  </pic:nvPicPr>
-                  <pic:blipFill>
-                    <a:blip r:embed="rId12"/>
-                    <a:stretch>
-                      <a:fillRect/>
-                    </a:stretch>
-                  </pic:blipFill>
-                  <pic:spPr>
-                    <a:xfrm>
-                      <a:off x="0" y="0"/>
-                      <a:ext cx="5943600" cy="4296759"/>
-                    </a:xfrm>
-                    <a:prstGeom prst="rect"/>
-                  </pic:spPr>
-                </pic:pic>
-              </a:graphicData>
-            </a:graphic>
-          </wp:inline>
-        </w:drawing>
-      </w:r>
-    </w:p>
-    <w:p>
-      <w:pPr>
-        <w:jc w:val="center"/>
-      </w:pPr>
-      <w:r>
-        <w:rPr>
-          <w:i/>
-          <w:sz w:val="20"/>
-        </w:rPr>
-        <w:t>Figure 2. Temperature sensitivity analysis for DRM. (a) TOF vs T, (b) carbon resistance vs T, (c) Arrhenius plot, (d) H₂/CO ratio vs T.</w:t>
-      </w:r>
-    </w:p>
-    <w:p>
-      <w:pPr>
-        <w:pStyle w:val="Heading2"/>
-      </w:pPr>
-      <w:r>
-        <w:rPr>
-          <w:rFonts w:ascii="Times New Roman" w:hAnsi="Times New Roman"/>
-          <w:color w:val="1F3A6E"/>
-        </w:rPr>
-        <w:t>4.7 Reactor Performance</w:t>
-      </w:r>
-    </w:p>
-    <w:p>
-      <w:r>
-        <w:rPr>
-          <w:b w:val="0"/>
-          <w:i w:val="0"/>
-        </w:rPr>
-        <w:t>Figure 3 shows the plug-flow reactor analysis. CH₄ and CO₂ are progressively converted to CO and H₂ along the reactor length. Equilibrium calculations show CH₄ conversion approaching 90% at 1000 K, and the H₂/CO ratio approaches unity at high temperature, favorable for downstream Fischer-Tropsch synthesis.</w:t>
-      </w:r>
-    </w:p>
-    <w:p>
-      <w:pPr>
-        <w:jc w:val="center"/>
-      </w:pPr>
-      <w:r>
-        <w:drawing>
-          <wp:inline xmlns:a="http://schemas.openxmlformats.org/drawingml/2006/main" xmlns:pic="http://schemas.openxmlformats.org/drawingml/2006/picture">
-            <wp:extent cx="5943600" cy="4296759"/>
-            <wp:docPr id="5" name="Picture 5"/>
-            <wp:cNvGraphicFramePr>
-              <a:graphicFrameLocks noChangeAspect="1"/>
-            </wp:cNvGraphicFramePr>
-            <a:graphic>
-              <a:graphicData uri="http://schemas.openxmlformats.org/drawingml/2006/picture">
-                <pic:pic>
-                  <pic:nvPicPr>
-                    <pic:cNvPr id="0" name="reactor.png"/>
-                    <pic:cNvPicPr/>
-                  </pic:nvPicPr>
-                  <pic:blipFill>
-                    <a:blip r:embed="rId13"/>
-                    <a:stretch>
-                      <a:fillRect/>
-                    </a:stretch>
-                  </pic:blipFill>
-                  <pic:spPr>
-                    <a:xfrm>
-                      <a:off x="0" y="0"/>
-                      <a:ext cx="5943600" cy="4296759"/>
-                    </a:xfrm>
-                    <a:prstGeom prst="rect"/>
-                  </pic:spPr>
-                </pic:pic>
-              </a:graphicData>
-            </a:graphic>
-          </wp:inline>
-        </w:drawing>
-      </w:r>
-    </w:p>
-    <w:p>
-      <w:pPr>
-        <w:jc w:val="center"/>
-      </w:pPr>
-      <w:r>
-        <w:rPr>
-          <w:i/>
-          <w:sz w:val="20"/>
-        </w:rPr>
-        <w:t>Figure 3. Cantera plug-flow reactor analysis for DRM. (a) axial profile, (b) CH₄ conversion vs reactor length, (c) equilibrium conversion vs T, (d) H₂/CO ratio vs T.</w:t>
       </w:r>
     </w:p>
     <w:p>

</xml_diff>

<commit_message>
Add parameter table, experimental comparison, and feed ratio study (Figure 6)
</commit_message>
<xml_diff>
--- a/docs/report/DRM_Catalysts_Paper.docx
+++ b/docs/report/DRM_Catalysts_Paper.docx
@@ -81,7 +81,7 @@
           <w:b w:val="0"/>
           <w:i w:val="0"/>
         </w:rPr>
-        <w:t>Dry reforming of methane (DRM, CH₄ + CO₂ → 2 CO + 2 H₂) converts two greenhouse gases into syngas. Carbon deposition remains the principal obstacle to industrial deployment of nickel-based DRM catalysts. In this work, a numerical microkinetic model based on a 14-step elementary mechanism was developed and solved to steady state using stiff ODE integration. Adsorption energies and activation barriers were taken from published DFT studies. Rate constants follow Arrhenius kinetics with Hertz-Knudsen adsorption fluxes. Steady-state surface coverages and turnover frequencies were computed for six transition metals (Ni, Co, Ru, Rh, Pt, Ir) at 900 K and 1 bar. The model produces the experimentally established ordering of carbon resistance (Ir &gt; Pt &gt; Rh &gt; Ru &gt; Co &gt; Ni) directly from the numerical solution, without any post-hoc adjustment. The carbon coverage on Ni(111) reaches 0.12 monolayer, consistent with reported coke formation on nickel. Catalysts with weaker carbon binding (ΔE_C ≥ +1.0 eV relative to Ni) exhibit carbon coverages below 0.001 monolayer. A systematic robustness analysis across 19 perturbations in BEP coefficient and temperature confirmed that the ranking is stable in every case, with zero swaps between adjacent catalysts. A Sabatier volcano plot identifies the optimum carbon binding energy at ΔE_C = +0.73 eV. Degree of rate control analysis shows that CO desorption is the rate-determining step on all six catalysts, with the sum of DRC values equal to 1.0, validating the numerical solver. A Cantera plug-flow reactor model confirms that syngas yields approach equilibrium at practical conditions.</w:t>
+        <w:t>Dry reforming of methane (DRM, CH₄ + CO₂ → 2 CO + 2 H₂) converts two greenhouse gases into syngas. Carbon deposition remains the principal obstacle to industrial deployment of nickel-based DRM catalysts. In this work, a numerical microkinetic model based on a 14-step elementary mechanism was developed and solved to steady state using stiff ODE integration. Adsorption energies and activation barriers were taken from published DFT studies. Rate constants follow Arrhenius kinetics with Hertz-Knudsen adsorption fluxes. Steady-state surface coverages and turnover frequencies were computed for six transition metals (Ni, Co, Ru, Rh, Pt, Ir) at 900 K and 1 bar. The model produces the experimentally established ordering of carbon resistance (Ir &gt; Pt &gt; Rh &gt; Ru &gt; Co &gt; Ni) directly from the numerical solution, without any post-hoc adjustment. The carbon coverage on Ni(111) reaches 0.12 monolayer, consistent with reported coke formation on nickel. Catalysts with weaker carbon binding (ΔE_C ≥ +1.0 eV relative to Ni) exhibit carbon coverages below 0.001 monolayer. A systematic robustness analysis across 19 perturbations in BEP coefficient and temperature confirmed that the ranking is stable in every case, with zero swaps between adjacent catalysts. A Sabatier volcano plot identifies the optimum carbon binding energy at ΔE_C = +0.73 eV. Degree of rate control analysis shows that CO desorption is the rate-determining step on all six catalysts, with the sum of DRC values equal to 1.0, validating the numerical solver. A Cantera plug-flow reactor model confirms that syngas yields approach equilibrium at practical conditions, and a feed-ratio study shows that CO₂-rich feeds improve CH₄ conversion and reduce carbon risk.</w:t>
       </w:r>
     </w:p>
     <w:p>
@@ -92,7 +92,7 @@
         <w:t xml:space="preserve">Keywords: </w:t>
       </w:r>
       <w:r>
-        <w:t>Dry reforming of methane, carbon deposition, numerical microkinetics, Sabatier volcano, degree of rate control, transition metal catalysts, syngas</w:t>
+        <w:t>Dry reforming of methane, carbon deposition, numerical microkinetics, Sabatier volcano, degree of rate control, feed ratio, syngas</w:t>
       </w:r>
     </w:p>
     <w:p>
@@ -236,7 +236,7 @@
         <w:pStyle w:val="ListBullet"/>
       </w:pPr>
       <w:r>
-        <w:t>To couple the microkinetic model to a plug-flow reactor model.</w:t>
+        <w:t>To couple the microkinetic model to a plug-flow reactor model and study the effect of feed ratio.</w:t>
       </w:r>
     </w:p>
     <w:p>
@@ -257,7 +257,7 @@
           <w:b w:val="0"/>
           <w:i w:val="0"/>
         </w:rPr>
-        <w:t>This work demonstrates that the experimentally observed ordering of carbon resistance among transition metals emerges naturally from a numerical steady-state solution of the DRM mechanism. The model does not assume the ranking; it predicts it. Robustness and degree-of-rate-control analyses confirm the internal consistency of the mechanism and identify the mechanistic origin of the observed trends.</w:t>
+        <w:t>This work demonstrates that the experimentally observed ordering of carbon resistance among transition metals emerges naturally from a numerical steady-state solution of the DRM mechanism. The model does not assume the ranking; it predicts it. Robustness, degree-of-rate-control, and feed-ratio analyses confirm the internal consistency of the mechanism and identify the mechanistic origin of the observed trends.</w:t>
       </w:r>
     </w:p>
     <w:p>
@@ -581,7 +581,7 @@
           <w:b w:val="0"/>
           <w:i w:val="0"/>
         </w:rPr>
-        <w:t>where θ_i is the coverage of surface species i, ν_ij is the stoichiometric coefficient of species i in reaction j, and r_j is the net rate of reaction j. The system was integrated to steady state using the implicit BDF solver (scipy.integrate.solve_ivp) with tolerances rtol = 10⁻⁶ and atol = 10⁻¹⁰ over a time span of 10⁶ s, sufficient to reach convergence for all catalysts.</w:t>
+        <w:t>where θ_i is the coverage of surface species i, ν_ij is the stoichiometric coefficient of species i in reaction j, and r_j is the net rate of reaction j. The system was integrated to steady state using the implicit BDF solver (scipy.integrate.solve_ivp) with rtol = 10⁻⁶ and atol = 10⁻¹⁰ over a time span of 10⁶ s. Rate constants follow the Arrhenius equation with a pre-exponential factor of 10¹³ s⁻¹ for surface reactions. Adsorption rates use the Hertz-Knudsen equation with a sticking coefficient of 1.0 and a site density of 1.77 × 10¹⁹ sites/m². Reverse barriers are computed from the thermodynamic consistency condition Ea_rev = Ea_fwd + ΔE_reaction.</w:t>
       </w:r>
     </w:p>
     <w:p>
@@ -590,9 +590,1137 @@
           <w:b w:val="0"/>
           <w:i w:val="0"/>
         </w:rPr>
-        <w:t>Rate constants follow the Arrhenius equation with pre-exponential factor 10¹³ s⁻¹ for surface reactions. Adsorption rates were computed using the Hertz-Knudsen equation:</w:t>
+        <w:t>Table 1 lists the full set of elementary steps, forward activation barriers, and literature sources.</w:t>
       </w:r>
     </w:p>
+    <w:tbl>
+      <w:tblPr>
+        <w:tblStyle w:val="LightGrid-Accent1"/>
+        <w:tblW w:type="auto" w:w="0"/>
+        <w:jc w:val="center"/>
+        <w:tblLook w:firstColumn="1" w:firstRow="1" w:lastColumn="0" w:lastRow="0" w:noHBand="0" w:noVBand="1" w:val="04A0"/>
+      </w:tblPr>
+      <w:tblGrid>
+        <w:gridCol w:w="2160"/>
+        <w:gridCol w:w="2160"/>
+        <w:gridCol w:w="2160"/>
+        <w:gridCol w:w="2160"/>
+      </w:tblGrid>
+      <w:tr>
+        <w:tc>
+          <w:tcPr>
+            <w:tcW w:type="dxa" w:w="2160"/>
+          </w:tcPr>
+          <w:p>
+            <w:pPr>
+              <w:jc w:val="center"/>
+            </w:pPr>
+            <w:r/>
+            <w:r>
+              <w:rPr>
+                <w:rFonts w:ascii="Times New Roman" w:hAnsi="Times New Roman"/>
+                <w:b/>
+                <w:sz w:val="18"/>
+              </w:rPr>
+              <w:t>#</w:t>
+            </w:r>
+          </w:p>
+        </w:tc>
+        <w:tc>
+          <w:tcPr>
+            <w:tcW w:type="dxa" w:w="2160"/>
+          </w:tcPr>
+          <w:p>
+            <w:pPr>
+              <w:jc w:val="center"/>
+            </w:pPr>
+            <w:r/>
+            <w:r>
+              <w:rPr>
+                <w:rFonts w:ascii="Times New Roman" w:hAnsi="Times New Roman"/>
+                <w:b/>
+                <w:sz w:val="18"/>
+              </w:rPr>
+              <w:t>Elementary Step</w:t>
+            </w:r>
+          </w:p>
+        </w:tc>
+        <w:tc>
+          <w:tcPr>
+            <w:tcW w:type="dxa" w:w="2160"/>
+          </w:tcPr>
+          <w:p>
+            <w:pPr>
+              <w:jc w:val="center"/>
+            </w:pPr>
+            <w:r/>
+            <w:r>
+              <w:rPr>
+                <w:rFonts w:ascii="Times New Roman" w:hAnsi="Times New Roman"/>
+                <w:b/>
+                <w:sz w:val="18"/>
+              </w:rPr>
+              <w:t>Ea_fwd (eV)</w:t>
+            </w:r>
+          </w:p>
+        </w:tc>
+        <w:tc>
+          <w:tcPr>
+            <w:tcW w:type="dxa" w:w="2160"/>
+          </w:tcPr>
+          <w:p>
+            <w:pPr>
+              <w:jc w:val="center"/>
+            </w:pPr>
+            <w:r/>
+            <w:r>
+              <w:rPr>
+                <w:rFonts w:ascii="Times New Roman" w:hAnsi="Times New Roman"/>
+                <w:b/>
+                <w:sz w:val="18"/>
+              </w:rPr>
+              <w:t>Source</w:t>
+            </w:r>
+          </w:p>
+        </w:tc>
+      </w:tr>
+      <w:tr>
+        <w:tc>
+          <w:tcPr>
+            <w:tcW w:type="dxa" w:w="2160"/>
+          </w:tcPr>
+          <w:p>
+            <w:pPr>
+              <w:jc w:val="center"/>
+            </w:pPr>
+            <w:r/>
+            <w:r>
+              <w:rPr>
+                <w:rFonts w:ascii="Times New Roman" w:hAnsi="Times New Roman"/>
+                <w:sz w:val="18"/>
+              </w:rPr>
+              <w:t>1</w:t>
+            </w:r>
+          </w:p>
+        </w:tc>
+        <w:tc>
+          <w:tcPr>
+            <w:tcW w:type="dxa" w:w="2160"/>
+          </w:tcPr>
+          <w:p>
+            <w:pPr>
+              <w:jc w:val="center"/>
+            </w:pPr>
+            <w:r/>
+            <w:r>
+              <w:rPr>
+                <w:rFonts w:ascii="Times New Roman" w:hAnsi="Times New Roman"/>
+                <w:sz w:val="18"/>
+              </w:rPr>
+              <w:t>CH₄ + 2* ⇌ CH₃* + H*</w:t>
+            </w:r>
+          </w:p>
+        </w:tc>
+        <w:tc>
+          <w:tcPr>
+            <w:tcW w:type="dxa" w:w="2160"/>
+          </w:tcPr>
+          <w:p>
+            <w:pPr>
+              <w:jc w:val="center"/>
+            </w:pPr>
+            <w:r/>
+            <w:r>
+              <w:rPr>
+                <w:rFonts w:ascii="Times New Roman" w:hAnsi="Times New Roman"/>
+                <w:sz w:val="18"/>
+              </w:rPr>
+              <w:t>0.85</w:t>
+            </w:r>
+          </w:p>
+        </w:tc>
+        <w:tc>
+          <w:tcPr>
+            <w:tcW w:type="dxa" w:w="2160"/>
+          </w:tcPr>
+          <w:p>
+            <w:pPr>
+              <w:jc w:val="center"/>
+            </w:pPr>
+            <w:r/>
+            <w:r>
+              <w:rPr>
+                <w:rFonts w:ascii="Times New Roman" w:hAnsi="Times New Roman"/>
+                <w:sz w:val="18"/>
+              </w:rPr>
+              <w:t>Blaylock 2009</w:t>
+            </w:r>
+          </w:p>
+        </w:tc>
+      </w:tr>
+      <w:tr>
+        <w:tc>
+          <w:tcPr>
+            <w:tcW w:type="dxa" w:w="2160"/>
+          </w:tcPr>
+          <w:p>
+            <w:pPr>
+              <w:jc w:val="center"/>
+            </w:pPr>
+            <w:r/>
+            <w:r>
+              <w:rPr>
+                <w:rFonts w:ascii="Times New Roman" w:hAnsi="Times New Roman"/>
+                <w:sz w:val="18"/>
+              </w:rPr>
+              <w:t>2</w:t>
+            </w:r>
+          </w:p>
+        </w:tc>
+        <w:tc>
+          <w:tcPr>
+            <w:tcW w:type="dxa" w:w="2160"/>
+          </w:tcPr>
+          <w:p>
+            <w:pPr>
+              <w:jc w:val="center"/>
+            </w:pPr>
+            <w:r/>
+            <w:r>
+              <w:rPr>
+                <w:rFonts w:ascii="Times New Roman" w:hAnsi="Times New Roman"/>
+                <w:sz w:val="18"/>
+              </w:rPr>
+              <w:t>CH₃* + * ⇌ CH₂* + H*</w:t>
+            </w:r>
+          </w:p>
+        </w:tc>
+        <w:tc>
+          <w:tcPr>
+            <w:tcW w:type="dxa" w:w="2160"/>
+          </w:tcPr>
+          <w:p>
+            <w:pPr>
+              <w:jc w:val="center"/>
+            </w:pPr>
+            <w:r/>
+            <w:r>
+              <w:rPr>
+                <w:rFonts w:ascii="Times New Roman" w:hAnsi="Times New Roman"/>
+                <w:sz w:val="18"/>
+              </w:rPr>
+              <w:t>0.55</w:t>
+            </w:r>
+          </w:p>
+        </w:tc>
+        <w:tc>
+          <w:tcPr>
+            <w:tcW w:type="dxa" w:w="2160"/>
+          </w:tcPr>
+          <w:p>
+            <w:pPr>
+              <w:jc w:val="center"/>
+            </w:pPr>
+            <w:r/>
+            <w:r>
+              <w:rPr>
+                <w:rFonts w:ascii="Times New Roman" w:hAnsi="Times New Roman"/>
+                <w:sz w:val="18"/>
+              </w:rPr>
+              <w:t>Blaylock 2009</w:t>
+            </w:r>
+          </w:p>
+        </w:tc>
+      </w:tr>
+      <w:tr>
+        <w:tc>
+          <w:tcPr>
+            <w:tcW w:type="dxa" w:w="2160"/>
+          </w:tcPr>
+          <w:p>
+            <w:pPr>
+              <w:jc w:val="center"/>
+            </w:pPr>
+            <w:r/>
+            <w:r>
+              <w:rPr>
+                <w:rFonts w:ascii="Times New Roman" w:hAnsi="Times New Roman"/>
+                <w:sz w:val="18"/>
+              </w:rPr>
+              <w:t>3</w:t>
+            </w:r>
+          </w:p>
+        </w:tc>
+        <w:tc>
+          <w:tcPr>
+            <w:tcW w:type="dxa" w:w="2160"/>
+          </w:tcPr>
+          <w:p>
+            <w:pPr>
+              <w:jc w:val="center"/>
+            </w:pPr>
+            <w:r/>
+            <w:r>
+              <w:rPr>
+                <w:rFonts w:ascii="Times New Roman" w:hAnsi="Times New Roman"/>
+                <w:sz w:val="18"/>
+              </w:rPr>
+              <w:t>CH₂* + * ⇌ CH* + H*</w:t>
+            </w:r>
+          </w:p>
+        </w:tc>
+        <w:tc>
+          <w:tcPr>
+            <w:tcW w:type="dxa" w:w="2160"/>
+          </w:tcPr>
+          <w:p>
+            <w:pPr>
+              <w:jc w:val="center"/>
+            </w:pPr>
+            <w:r/>
+            <w:r>
+              <w:rPr>
+                <w:rFonts w:ascii="Times New Roman" w:hAnsi="Times New Roman"/>
+                <w:sz w:val="18"/>
+              </w:rPr>
+              <w:t>0.35</w:t>
+            </w:r>
+          </w:p>
+        </w:tc>
+        <w:tc>
+          <w:tcPr>
+            <w:tcW w:type="dxa" w:w="2160"/>
+          </w:tcPr>
+          <w:p>
+            <w:pPr>
+              <w:jc w:val="center"/>
+            </w:pPr>
+            <w:r/>
+            <w:r>
+              <w:rPr>
+                <w:rFonts w:ascii="Times New Roman" w:hAnsi="Times New Roman"/>
+                <w:sz w:val="18"/>
+              </w:rPr>
+              <w:t>Blaylock 2009</w:t>
+            </w:r>
+          </w:p>
+        </w:tc>
+      </w:tr>
+      <w:tr>
+        <w:tc>
+          <w:tcPr>
+            <w:tcW w:type="dxa" w:w="2160"/>
+          </w:tcPr>
+          <w:p>
+            <w:pPr>
+              <w:jc w:val="center"/>
+            </w:pPr>
+            <w:r/>
+            <w:r>
+              <w:rPr>
+                <w:rFonts w:ascii="Times New Roman" w:hAnsi="Times New Roman"/>
+                <w:sz w:val="18"/>
+              </w:rPr>
+              <w:t>4</w:t>
+            </w:r>
+          </w:p>
+        </w:tc>
+        <w:tc>
+          <w:tcPr>
+            <w:tcW w:type="dxa" w:w="2160"/>
+          </w:tcPr>
+          <w:p>
+            <w:pPr>
+              <w:jc w:val="center"/>
+            </w:pPr>
+            <w:r/>
+            <w:r>
+              <w:rPr>
+                <w:rFonts w:ascii="Times New Roman" w:hAnsi="Times New Roman"/>
+                <w:sz w:val="18"/>
+              </w:rPr>
+              <w:t>CH* + * ⇌ C* + H*</w:t>
+            </w:r>
+          </w:p>
+        </w:tc>
+        <w:tc>
+          <w:tcPr>
+            <w:tcW w:type="dxa" w:w="2160"/>
+          </w:tcPr>
+          <w:p>
+            <w:pPr>
+              <w:jc w:val="center"/>
+            </w:pPr>
+            <w:r/>
+            <w:r>
+              <w:rPr>
+                <w:rFonts w:ascii="Times New Roman" w:hAnsi="Times New Roman"/>
+                <w:sz w:val="18"/>
+              </w:rPr>
+              <w:t>0.85</w:t>
+            </w:r>
+          </w:p>
+        </w:tc>
+        <w:tc>
+          <w:tcPr>
+            <w:tcW w:type="dxa" w:w="2160"/>
+          </w:tcPr>
+          <w:p>
+            <w:pPr>
+              <w:jc w:val="center"/>
+            </w:pPr>
+            <w:r/>
+            <w:r>
+              <w:rPr>
+                <w:rFonts w:ascii="Times New Roman" w:hAnsi="Times New Roman"/>
+                <w:sz w:val="18"/>
+              </w:rPr>
+              <w:t>Blaylock 2009</w:t>
+            </w:r>
+          </w:p>
+        </w:tc>
+      </w:tr>
+      <w:tr>
+        <w:tc>
+          <w:tcPr>
+            <w:tcW w:type="dxa" w:w="2160"/>
+          </w:tcPr>
+          <w:p>
+            <w:pPr>
+              <w:jc w:val="center"/>
+            </w:pPr>
+            <w:r/>
+            <w:r>
+              <w:rPr>
+                <w:rFonts w:ascii="Times New Roman" w:hAnsi="Times New Roman"/>
+                <w:sz w:val="18"/>
+              </w:rPr>
+              <w:t>5</w:t>
+            </w:r>
+          </w:p>
+        </w:tc>
+        <w:tc>
+          <w:tcPr>
+            <w:tcW w:type="dxa" w:w="2160"/>
+          </w:tcPr>
+          <w:p>
+            <w:pPr>
+              <w:jc w:val="center"/>
+            </w:pPr>
+            <w:r/>
+            <w:r>
+              <w:rPr>
+                <w:rFonts w:ascii="Times New Roman" w:hAnsi="Times New Roman"/>
+                <w:sz w:val="18"/>
+              </w:rPr>
+              <w:t>CO₂ + * ⇌ CO₂*</w:t>
+            </w:r>
+          </w:p>
+        </w:tc>
+        <w:tc>
+          <w:tcPr>
+            <w:tcW w:type="dxa" w:w="2160"/>
+          </w:tcPr>
+          <w:p>
+            <w:pPr>
+              <w:jc w:val="center"/>
+            </w:pPr>
+            <w:r/>
+            <w:r>
+              <w:rPr>
+                <w:rFonts w:ascii="Times New Roman" w:hAnsi="Times New Roman"/>
+                <w:sz w:val="18"/>
+              </w:rPr>
+              <w:t>0.00</w:t>
+            </w:r>
+          </w:p>
+        </w:tc>
+        <w:tc>
+          <w:tcPr>
+            <w:tcW w:type="dxa" w:w="2160"/>
+          </w:tcPr>
+          <w:p>
+            <w:pPr>
+              <w:jc w:val="center"/>
+            </w:pPr>
+            <w:r/>
+            <w:r>
+              <w:rPr>
+                <w:rFonts w:ascii="Times New Roman" w:hAnsi="Times New Roman"/>
+                <w:sz w:val="18"/>
+              </w:rPr>
+              <w:t>adsorption</w:t>
+            </w:r>
+          </w:p>
+        </w:tc>
+      </w:tr>
+      <w:tr>
+        <w:tc>
+          <w:tcPr>
+            <w:tcW w:type="dxa" w:w="2160"/>
+          </w:tcPr>
+          <w:p>
+            <w:pPr>
+              <w:jc w:val="center"/>
+            </w:pPr>
+            <w:r/>
+            <w:r>
+              <w:rPr>
+                <w:rFonts w:ascii="Times New Roman" w:hAnsi="Times New Roman"/>
+                <w:sz w:val="18"/>
+              </w:rPr>
+              <w:t>6</w:t>
+            </w:r>
+          </w:p>
+        </w:tc>
+        <w:tc>
+          <w:tcPr>
+            <w:tcW w:type="dxa" w:w="2160"/>
+          </w:tcPr>
+          <w:p>
+            <w:pPr>
+              <w:jc w:val="center"/>
+            </w:pPr>
+            <w:r/>
+            <w:r>
+              <w:rPr>
+                <w:rFonts w:ascii="Times New Roman" w:hAnsi="Times New Roman"/>
+                <w:sz w:val="18"/>
+              </w:rPr>
+              <w:t>CO₂* + * ⇌ CO* + O*</w:t>
+            </w:r>
+          </w:p>
+        </w:tc>
+        <w:tc>
+          <w:tcPr>
+            <w:tcW w:type="dxa" w:w="2160"/>
+          </w:tcPr>
+          <w:p>
+            <w:pPr>
+              <w:jc w:val="center"/>
+            </w:pPr>
+            <w:r/>
+            <w:r>
+              <w:rPr>
+                <w:rFonts w:ascii="Times New Roman" w:hAnsi="Times New Roman"/>
+                <w:sz w:val="18"/>
+              </w:rPr>
+              <w:t>0.80</w:t>
+            </w:r>
+          </w:p>
+        </w:tc>
+        <w:tc>
+          <w:tcPr>
+            <w:tcW w:type="dxa" w:w="2160"/>
+          </w:tcPr>
+          <w:p>
+            <w:pPr>
+              <w:jc w:val="center"/>
+            </w:pPr>
+            <w:r/>
+            <w:r>
+              <w:rPr>
+                <w:rFonts w:ascii="Times New Roman" w:hAnsi="Times New Roman"/>
+                <w:sz w:val="18"/>
+              </w:rPr>
+              <w:t>Wang 2013</w:t>
+            </w:r>
+          </w:p>
+        </w:tc>
+      </w:tr>
+      <w:tr>
+        <w:tc>
+          <w:tcPr>
+            <w:tcW w:type="dxa" w:w="2160"/>
+          </w:tcPr>
+          <w:p>
+            <w:pPr>
+              <w:jc w:val="center"/>
+            </w:pPr>
+            <w:r/>
+            <w:r>
+              <w:rPr>
+                <w:rFonts w:ascii="Times New Roman" w:hAnsi="Times New Roman"/>
+                <w:sz w:val="18"/>
+              </w:rPr>
+              <w:t>7</w:t>
+            </w:r>
+          </w:p>
+        </w:tc>
+        <w:tc>
+          <w:tcPr>
+            <w:tcW w:type="dxa" w:w="2160"/>
+          </w:tcPr>
+          <w:p>
+            <w:pPr>
+              <w:jc w:val="center"/>
+            </w:pPr>
+            <w:r/>
+            <w:r>
+              <w:rPr>
+                <w:rFonts w:ascii="Times New Roman" w:hAnsi="Times New Roman"/>
+                <w:sz w:val="18"/>
+              </w:rPr>
+              <w:t>C* + O* ⇌ CO* + *</w:t>
+            </w:r>
+          </w:p>
+        </w:tc>
+        <w:tc>
+          <w:tcPr>
+            <w:tcW w:type="dxa" w:w="2160"/>
+          </w:tcPr>
+          <w:p>
+            <w:pPr>
+              <w:jc w:val="center"/>
+            </w:pPr>
+            <w:r/>
+            <w:r>
+              <w:rPr>
+                <w:rFonts w:ascii="Times New Roman" w:hAnsi="Times New Roman"/>
+                <w:sz w:val="18"/>
+              </w:rPr>
+              <w:t>1.10</w:t>
+            </w:r>
+          </w:p>
+        </w:tc>
+        <w:tc>
+          <w:tcPr>
+            <w:tcW w:type="dxa" w:w="2160"/>
+          </w:tcPr>
+          <w:p>
+            <w:pPr>
+              <w:jc w:val="center"/>
+            </w:pPr>
+            <w:r/>
+            <w:r>
+              <w:rPr>
+                <w:rFonts w:ascii="Times New Roman" w:hAnsi="Times New Roman"/>
+                <w:sz w:val="18"/>
+              </w:rPr>
+              <w:t>Jones 2016</w:t>
+            </w:r>
+          </w:p>
+        </w:tc>
+      </w:tr>
+      <w:tr>
+        <w:tc>
+          <w:tcPr>
+            <w:tcW w:type="dxa" w:w="2160"/>
+          </w:tcPr>
+          <w:p>
+            <w:pPr>
+              <w:jc w:val="center"/>
+            </w:pPr>
+            <w:r/>
+            <w:r>
+              <w:rPr>
+                <w:rFonts w:ascii="Times New Roman" w:hAnsi="Times New Roman"/>
+                <w:sz w:val="18"/>
+              </w:rPr>
+              <w:t>8</w:t>
+            </w:r>
+          </w:p>
+        </w:tc>
+        <w:tc>
+          <w:tcPr>
+            <w:tcW w:type="dxa" w:w="2160"/>
+          </w:tcPr>
+          <w:p>
+            <w:pPr>
+              <w:jc w:val="center"/>
+            </w:pPr>
+            <w:r/>
+            <w:r>
+              <w:rPr>
+                <w:rFonts w:ascii="Times New Roman" w:hAnsi="Times New Roman"/>
+                <w:sz w:val="18"/>
+              </w:rPr>
+              <w:t>C* + CO₂* ⇌ 2 CO*</w:t>
+            </w:r>
+          </w:p>
+        </w:tc>
+        <w:tc>
+          <w:tcPr>
+            <w:tcW w:type="dxa" w:w="2160"/>
+          </w:tcPr>
+          <w:p>
+            <w:pPr>
+              <w:jc w:val="center"/>
+            </w:pPr>
+            <w:r/>
+            <w:r>
+              <w:rPr>
+                <w:rFonts w:ascii="Times New Roman" w:hAnsi="Times New Roman"/>
+                <w:sz w:val="18"/>
+              </w:rPr>
+              <w:t>1.30</w:t>
+            </w:r>
+          </w:p>
+        </w:tc>
+        <w:tc>
+          <w:tcPr>
+            <w:tcW w:type="dxa" w:w="2160"/>
+          </w:tcPr>
+          <w:p>
+            <w:pPr>
+              <w:jc w:val="center"/>
+            </w:pPr>
+            <w:r/>
+            <w:r>
+              <w:rPr>
+                <w:rFonts w:ascii="Times New Roman" w:hAnsi="Times New Roman"/>
+                <w:sz w:val="18"/>
+              </w:rPr>
+              <w:t>Jones 2016</w:t>
+            </w:r>
+          </w:p>
+        </w:tc>
+      </w:tr>
+      <w:tr>
+        <w:tc>
+          <w:tcPr>
+            <w:tcW w:type="dxa" w:w="2160"/>
+          </w:tcPr>
+          <w:p>
+            <w:pPr>
+              <w:jc w:val="center"/>
+            </w:pPr>
+            <w:r/>
+            <w:r>
+              <w:rPr>
+                <w:rFonts w:ascii="Times New Roman" w:hAnsi="Times New Roman"/>
+                <w:sz w:val="18"/>
+              </w:rPr>
+              <w:t>9</w:t>
+            </w:r>
+          </w:p>
+        </w:tc>
+        <w:tc>
+          <w:tcPr>
+            <w:tcW w:type="dxa" w:w="2160"/>
+          </w:tcPr>
+          <w:p>
+            <w:pPr>
+              <w:jc w:val="center"/>
+            </w:pPr>
+            <w:r/>
+            <w:r>
+              <w:rPr>
+                <w:rFonts w:ascii="Times New Roman" w:hAnsi="Times New Roman"/>
+                <w:sz w:val="18"/>
+              </w:rPr>
+              <w:t>CO* ⇌ CO(g) + *</w:t>
+            </w:r>
+          </w:p>
+        </w:tc>
+        <w:tc>
+          <w:tcPr>
+            <w:tcW w:type="dxa" w:w="2160"/>
+          </w:tcPr>
+          <w:p>
+            <w:pPr>
+              <w:jc w:val="center"/>
+            </w:pPr>
+            <w:r/>
+            <w:r>
+              <w:rPr>
+                <w:rFonts w:ascii="Times New Roman" w:hAnsi="Times New Roman"/>
+                <w:sz w:val="18"/>
+              </w:rPr>
+              <w:t>des.</w:t>
+            </w:r>
+          </w:p>
+        </w:tc>
+        <w:tc>
+          <w:tcPr>
+            <w:tcW w:type="dxa" w:w="2160"/>
+          </w:tcPr>
+          <w:p>
+            <w:pPr>
+              <w:jc w:val="center"/>
+            </w:pPr>
+            <w:r/>
+            <w:r>
+              <w:rPr>
+                <w:rFonts w:ascii="Times New Roman" w:hAnsi="Times New Roman"/>
+                <w:sz w:val="18"/>
+              </w:rPr>
+              <w:t>desorption</w:t>
+            </w:r>
+          </w:p>
+        </w:tc>
+      </w:tr>
+      <w:tr>
+        <w:tc>
+          <w:tcPr>
+            <w:tcW w:type="dxa" w:w="2160"/>
+          </w:tcPr>
+          <w:p>
+            <w:pPr>
+              <w:jc w:val="center"/>
+            </w:pPr>
+            <w:r/>
+            <w:r>
+              <w:rPr>
+                <w:rFonts w:ascii="Times New Roman" w:hAnsi="Times New Roman"/>
+                <w:sz w:val="18"/>
+              </w:rPr>
+              <w:t>10</w:t>
+            </w:r>
+          </w:p>
+        </w:tc>
+        <w:tc>
+          <w:tcPr>
+            <w:tcW w:type="dxa" w:w="2160"/>
+          </w:tcPr>
+          <w:p>
+            <w:pPr>
+              <w:jc w:val="center"/>
+            </w:pPr>
+            <w:r/>
+            <w:r>
+              <w:rPr>
+                <w:rFonts w:ascii="Times New Roman" w:hAnsi="Times New Roman"/>
+                <w:sz w:val="18"/>
+              </w:rPr>
+              <w:t>2 H* ⇌ H₂(g) + 2*</w:t>
+            </w:r>
+          </w:p>
+        </w:tc>
+        <w:tc>
+          <w:tcPr>
+            <w:tcW w:type="dxa" w:w="2160"/>
+          </w:tcPr>
+          <w:p>
+            <w:pPr>
+              <w:jc w:val="center"/>
+            </w:pPr>
+            <w:r/>
+            <w:r>
+              <w:rPr>
+                <w:rFonts w:ascii="Times New Roman" w:hAnsi="Times New Roman"/>
+                <w:sz w:val="18"/>
+              </w:rPr>
+              <w:t>0.85</w:t>
+            </w:r>
+          </w:p>
+        </w:tc>
+        <w:tc>
+          <w:tcPr>
+            <w:tcW w:type="dxa" w:w="2160"/>
+          </w:tcPr>
+          <w:p>
+            <w:pPr>
+              <w:jc w:val="center"/>
+            </w:pPr>
+            <w:r/>
+            <w:r>
+              <w:rPr>
+                <w:rFonts w:ascii="Times New Roman" w:hAnsi="Times New Roman"/>
+                <w:sz w:val="18"/>
+              </w:rPr>
+              <w:t>Blaylock 2009</w:t>
+            </w:r>
+          </w:p>
+        </w:tc>
+      </w:tr>
+      <w:tr>
+        <w:tc>
+          <w:tcPr>
+            <w:tcW w:type="dxa" w:w="2160"/>
+          </w:tcPr>
+          <w:p>
+            <w:pPr>
+              <w:jc w:val="center"/>
+            </w:pPr>
+            <w:r/>
+            <w:r>
+              <w:rPr>
+                <w:rFonts w:ascii="Times New Roman" w:hAnsi="Times New Roman"/>
+                <w:sz w:val="18"/>
+              </w:rPr>
+              <w:t>11</w:t>
+            </w:r>
+          </w:p>
+        </w:tc>
+        <w:tc>
+          <w:tcPr>
+            <w:tcW w:type="dxa" w:w="2160"/>
+          </w:tcPr>
+          <w:p>
+            <w:pPr>
+              <w:jc w:val="center"/>
+            </w:pPr>
+            <w:r/>
+            <w:r>
+              <w:rPr>
+                <w:rFonts w:ascii="Times New Roman" w:hAnsi="Times New Roman"/>
+                <w:sz w:val="18"/>
+              </w:rPr>
+              <w:t>O* + H* ⇌ OH* + *</w:t>
+            </w:r>
+          </w:p>
+        </w:tc>
+        <w:tc>
+          <w:tcPr>
+            <w:tcW w:type="dxa" w:w="2160"/>
+          </w:tcPr>
+          <w:p>
+            <w:pPr>
+              <w:jc w:val="center"/>
+            </w:pPr>
+            <w:r/>
+            <w:r>
+              <w:rPr>
+                <w:rFonts w:ascii="Times New Roman" w:hAnsi="Times New Roman"/>
+                <w:sz w:val="18"/>
+              </w:rPr>
+              <w:t>0.75</w:t>
+            </w:r>
+          </w:p>
+        </w:tc>
+        <w:tc>
+          <w:tcPr>
+            <w:tcW w:type="dxa" w:w="2160"/>
+          </w:tcPr>
+          <w:p>
+            <w:pPr>
+              <w:jc w:val="center"/>
+            </w:pPr>
+            <w:r/>
+            <w:r>
+              <w:rPr>
+                <w:rFonts w:ascii="Times New Roman" w:hAnsi="Times New Roman"/>
+                <w:sz w:val="18"/>
+              </w:rPr>
+              <w:t>Jones 2016</w:t>
+            </w:r>
+          </w:p>
+        </w:tc>
+      </w:tr>
+      <w:tr>
+        <w:tc>
+          <w:tcPr>
+            <w:tcW w:type="dxa" w:w="2160"/>
+          </w:tcPr>
+          <w:p>
+            <w:pPr>
+              <w:jc w:val="center"/>
+            </w:pPr>
+            <w:r/>
+            <w:r>
+              <w:rPr>
+                <w:rFonts w:ascii="Times New Roman" w:hAnsi="Times New Roman"/>
+                <w:sz w:val="18"/>
+              </w:rPr>
+              <w:t>12</w:t>
+            </w:r>
+          </w:p>
+        </w:tc>
+        <w:tc>
+          <w:tcPr>
+            <w:tcW w:type="dxa" w:w="2160"/>
+          </w:tcPr>
+          <w:p>
+            <w:pPr>
+              <w:jc w:val="center"/>
+            </w:pPr>
+            <w:r/>
+            <w:r>
+              <w:rPr>
+                <w:rFonts w:ascii="Times New Roman" w:hAnsi="Times New Roman"/>
+                <w:sz w:val="18"/>
+              </w:rPr>
+              <w:t>OH* + H* ⇌ H₂O* + *</w:t>
+            </w:r>
+          </w:p>
+        </w:tc>
+        <w:tc>
+          <w:tcPr>
+            <w:tcW w:type="dxa" w:w="2160"/>
+          </w:tcPr>
+          <w:p>
+            <w:pPr>
+              <w:jc w:val="center"/>
+            </w:pPr>
+            <w:r/>
+            <w:r>
+              <w:rPr>
+                <w:rFonts w:ascii="Times New Roman" w:hAnsi="Times New Roman"/>
+                <w:sz w:val="18"/>
+              </w:rPr>
+              <w:t>0.35</w:t>
+            </w:r>
+          </w:p>
+        </w:tc>
+        <w:tc>
+          <w:tcPr>
+            <w:tcW w:type="dxa" w:w="2160"/>
+          </w:tcPr>
+          <w:p>
+            <w:pPr>
+              <w:jc w:val="center"/>
+            </w:pPr>
+            <w:r/>
+            <w:r>
+              <w:rPr>
+                <w:rFonts w:ascii="Times New Roman" w:hAnsi="Times New Roman"/>
+                <w:sz w:val="18"/>
+              </w:rPr>
+              <w:t>Jones 2016</w:t>
+            </w:r>
+          </w:p>
+        </w:tc>
+      </w:tr>
+      <w:tr>
+        <w:tc>
+          <w:tcPr>
+            <w:tcW w:type="dxa" w:w="2160"/>
+          </w:tcPr>
+          <w:p>
+            <w:pPr>
+              <w:jc w:val="center"/>
+            </w:pPr>
+            <w:r/>
+            <w:r>
+              <w:rPr>
+                <w:rFonts w:ascii="Times New Roman" w:hAnsi="Times New Roman"/>
+                <w:sz w:val="18"/>
+              </w:rPr>
+              <w:t>13</w:t>
+            </w:r>
+          </w:p>
+        </w:tc>
+        <w:tc>
+          <w:tcPr>
+            <w:tcW w:type="dxa" w:w="2160"/>
+          </w:tcPr>
+          <w:p>
+            <w:pPr>
+              <w:jc w:val="center"/>
+            </w:pPr>
+            <w:r/>
+            <w:r>
+              <w:rPr>
+                <w:rFonts w:ascii="Times New Roman" w:hAnsi="Times New Roman"/>
+                <w:sz w:val="18"/>
+              </w:rPr>
+              <w:t>H₂O* ⇌ H₂O(g) + *</w:t>
+            </w:r>
+          </w:p>
+        </w:tc>
+        <w:tc>
+          <w:tcPr>
+            <w:tcW w:type="dxa" w:w="2160"/>
+          </w:tcPr>
+          <w:p>
+            <w:pPr>
+              <w:jc w:val="center"/>
+            </w:pPr>
+            <w:r/>
+            <w:r>
+              <w:rPr>
+                <w:rFonts w:ascii="Times New Roman" w:hAnsi="Times New Roman"/>
+                <w:sz w:val="18"/>
+              </w:rPr>
+              <w:t>des.</w:t>
+            </w:r>
+          </w:p>
+        </w:tc>
+        <w:tc>
+          <w:tcPr>
+            <w:tcW w:type="dxa" w:w="2160"/>
+          </w:tcPr>
+          <w:p>
+            <w:pPr>
+              <w:jc w:val="center"/>
+            </w:pPr>
+            <w:r/>
+            <w:r>
+              <w:rPr>
+                <w:rFonts w:ascii="Times New Roman" w:hAnsi="Times New Roman"/>
+                <w:sz w:val="18"/>
+              </w:rPr>
+              <w:t>desorption</w:t>
+            </w:r>
+          </w:p>
+        </w:tc>
+      </w:tr>
+      <w:tr>
+        <w:tc>
+          <w:tcPr>
+            <w:tcW w:type="dxa" w:w="2160"/>
+          </w:tcPr>
+          <w:p>
+            <w:pPr>
+              <w:jc w:val="center"/>
+            </w:pPr>
+            <w:r/>
+            <w:r>
+              <w:rPr>
+                <w:rFonts w:ascii="Times New Roman" w:hAnsi="Times New Roman"/>
+                <w:sz w:val="18"/>
+              </w:rPr>
+              <w:t>14</w:t>
+            </w:r>
+          </w:p>
+        </w:tc>
+        <w:tc>
+          <w:tcPr>
+            <w:tcW w:type="dxa" w:w="2160"/>
+          </w:tcPr>
+          <w:p>
+            <w:pPr>
+              <w:jc w:val="center"/>
+            </w:pPr>
+            <w:r/>
+            <w:r>
+              <w:rPr>
+                <w:rFonts w:ascii="Times New Roman" w:hAnsi="Times New Roman"/>
+                <w:sz w:val="18"/>
+              </w:rPr>
+              <w:t>CH* + O* ⇌ CO* + H*</w:t>
+            </w:r>
+          </w:p>
+        </w:tc>
+        <w:tc>
+          <w:tcPr>
+            <w:tcW w:type="dxa" w:w="2160"/>
+          </w:tcPr>
+          <w:p>
+            <w:pPr>
+              <w:jc w:val="center"/>
+            </w:pPr>
+            <w:r/>
+            <w:r>
+              <w:rPr>
+                <w:rFonts w:ascii="Times New Roman" w:hAnsi="Times New Roman"/>
+                <w:sz w:val="18"/>
+              </w:rPr>
+              <w:t>1.00</w:t>
+            </w:r>
+          </w:p>
+        </w:tc>
+        <w:tc>
+          <w:tcPr>
+            <w:tcW w:type="dxa" w:w="2160"/>
+          </w:tcPr>
+          <w:p>
+            <w:pPr>
+              <w:jc w:val="center"/>
+            </w:pPr>
+            <w:r/>
+            <w:r>
+              <w:rPr>
+                <w:rFonts w:ascii="Times New Roman" w:hAnsi="Times New Roman"/>
+                <w:sz w:val="18"/>
+              </w:rPr>
+              <w:t>Wang 2013</w:t>
+            </w:r>
+          </w:p>
+        </w:tc>
+      </w:tr>
+    </w:tbl>
     <w:p>
       <w:pPr>
         <w:jc w:val="center"/>
@@ -600,17 +1728,9 @@
       <w:r>
         <w:rPr>
           <w:i/>
+          <w:sz w:val="20"/>
         </w:rPr>
-        <w:t>k_ads = S · P / √(2πmk_BT) / N_sites      (Eq. 3)</w:t>
-      </w:r>
-    </w:p>
-    <w:p>
-      <w:r>
-        <w:rPr>
-          <w:b w:val="0"/>
-          <w:i w:val="0"/>
-        </w:rPr>
-        <w:t>with S = 1.0 and N_sites = 1.77 × 10¹⁹ sites/m². Reverse rate constants were computed from the thermodynamic consistency condition Ea_rev = Ea_fwd + ΔE_reaction.</w:t>
+        <w:t>Table 1. Full 14-step mechanism with activation barriers and literature sources.</w:t>
       </w:r>
     </w:p>
     <w:p>
@@ -642,7 +1762,7 @@
         <w:rPr>
           <w:i/>
         </w:rPr>
-        <w:t>Ea_i = Ea_i° + γ_i · ΔE_C      (Eq. 4)</w:t>
+        <w:t>Ea_i = Ea_i° + γ_i · ΔE_C      (Eq. 3)</w:t>
       </w:r>
     </w:p>
     <w:p>
@@ -651,7 +1771,7 @@
           <w:b w:val="0"/>
           <w:i w:val="0"/>
         </w:rPr>
-        <w:t>with BEP coefficients γ of 0.55, 0.35, and 0.60 for CH₃, CH₂, and CH dehydrogenation respectively. This reflects the physical observation that on metals with weaker carbon binding (Pt, Ir), the CHₓ intermediates are more stable and do not readily decompose to coke.</w:t>
+        <w:t>with BEP coefficients γ of 0.55, 0.35, and 0.60 for CH₃, CH₂, and CH dehydrogenation respectively.</w:t>
       </w:r>
     </w:p>
     <w:p>
@@ -672,7 +1792,7 @@
           <w:b w:val="0"/>
           <w:i w:val="0"/>
         </w:rPr>
-        <w:t>The degree of rate control (DRC) of each elementary step was computed using the Campbell formalism. The barrier of each step was perturbed by +0.05 eV, the steady state was re-solved, and the change in ln(TOF) was measured. A step with DRC ≈ 1.0 is fully rate-determining; steps with DRC ≈ 0.0 are at quasi-equilibrium. Campbell's theorem requires the sum of all DRC values to equal 1.0 for a valid microkinetic model.</w:t>
+        <w:t>The degree of rate control (DRC) of each step was computed using the Campbell formalism: the barrier of each step was perturbed by +0.05 eV, the steady state was re-solved, and the change in ln(TOF) was measured. Campbell's theorem requires the sum of all DRC values to equal 1.0 for a valid microkinetic model.</w:t>
       </w:r>
     </w:p>
     <w:p>
@@ -693,7 +1813,7 @@
           <w:b w:val="0"/>
           <w:i w:val="0"/>
         </w:rPr>
-        <w:t>A systematic robustness analysis was performed by varying the BEP scale factor from 0.5 to 1.5 in 11 steps (a factor of 3 range) and the temperature from 750 to 1100 K in 8 steps. At each condition, the steady-state solver was rerun for all six catalysts, and the resulting carbon resistance ranking was compared to the reference.</w:t>
+        <w:t>A systematic robustness analysis was performed by varying the BEP scale factor from 0.5 to 1.5 (11 values) and the temperature from 750 to 1100 K (8 values). At each of the 19 perturbation conditions, the steady-state solver was rerun for all six catalysts.</w:t>
       </w:r>
     </w:p>
     <w:p>
@@ -714,7 +1834,7 @@
           <w:b w:val="0"/>
           <w:i w:val="0"/>
         </w:rPr>
-        <w:t>A 1D plug-flow reactor model was constructed in Cantera. The reactor is 0.5 m long with a 10 cm diameter and a catalyst bed density of 800 kg/m³. The inlet feed is equimolar CH₄:CO₂ with N₂ balance. Gas-phase equilibrium was computed using the GRI-Mech 3.0 mechanism.</w:t>
+        <w:t>A 1D plug-flow reactor model was constructed in Cantera. The reactor is 0.5 m long with a 10 cm diameter and a catalyst bed density of 800 kg/m³. Gas-phase equilibrium was computed using the GRI-Mech 3.0 mechanism.</w:t>
       </w:r>
     </w:p>
     <w:p>
@@ -735,7 +1855,7 @@
           <w:b w:val="0"/>
           <w:i w:val="0"/>
         </w:rPr>
-        <w:t>Adsorption energies and activation barriers were taken from published DFT studies (Blaylock et al. 2009; Jones et al. 2016; Wang et al. 2013; Nørskov et al. 2002). Descriptor shifts for Pt, Ru, Rh, Co, and Ir were derived from the comparative DFT studies reported in these references.</w:t>
+        <w:t>Adsorption energies and activation barriers were taken from published DFT studies (Blaylock et al. 2009; Jones et al. 2016; Wang et al. 2013; Nørskov et al. 2002).</w:t>
       </w:r>
     </w:p>
     <w:p>
@@ -777,7 +1897,268 @@
           <w:b w:val="0"/>
           <w:i w:val="0"/>
         </w:rPr>
-        <w:t>Table 1 lists the turnover frequency for CH₄ conversion (TOF_CH₄) and the total carbon coverage (θ_C + θ_CH) for all six catalysts. Activity varies by nearly an order of magnitude, with Rh reaching 130 s⁻¹ while Ni remains near 21 s⁻¹ due to partial carbon poisoning.</w:t>
+        <w:t>Table 2 compares the predicted turnover frequencies with experimentally reported values for Ni and Rh from published kinetic studies. The predicted values are within the same order of magnitude as the experimental range, providing a first validation of the model.</w:t>
+      </w:r>
+    </w:p>
+    <w:tbl>
+      <w:tblPr>
+        <w:tblStyle w:val="LightGrid-Accent1"/>
+        <w:tblW w:type="auto" w:w="0"/>
+        <w:jc w:val="center"/>
+        <w:tblLook w:firstColumn="1" w:firstRow="1" w:lastColumn="0" w:lastRow="0" w:noHBand="0" w:noVBand="1" w:val="04A0"/>
+      </w:tblPr>
+      <w:tblGrid>
+        <w:gridCol w:w="2160"/>
+        <w:gridCol w:w="2160"/>
+        <w:gridCol w:w="2160"/>
+        <w:gridCol w:w="2160"/>
+      </w:tblGrid>
+      <w:tr>
+        <w:tc>
+          <w:tcPr>
+            <w:tcW w:type="dxa" w:w="2160"/>
+          </w:tcPr>
+          <w:p>
+            <w:pPr>
+              <w:jc w:val="center"/>
+            </w:pPr>
+            <w:r/>
+            <w:r>
+              <w:rPr>
+                <w:rFonts w:ascii="Times New Roman" w:hAnsi="Times New Roman"/>
+                <w:b/>
+                <w:sz w:val="20"/>
+              </w:rPr>
+              <w:t>Catalyst</w:t>
+            </w:r>
+          </w:p>
+        </w:tc>
+        <w:tc>
+          <w:tcPr>
+            <w:tcW w:type="dxa" w:w="2160"/>
+          </w:tcPr>
+          <w:p>
+            <w:pPr>
+              <w:jc w:val="center"/>
+            </w:pPr>
+            <w:r/>
+            <w:r>
+              <w:rPr>
+                <w:rFonts w:ascii="Times New Roman" w:hAnsi="Times New Roman"/>
+                <w:b/>
+                <w:sz w:val="20"/>
+              </w:rPr>
+              <w:t>Our predicted TOF (s⁻¹)</w:t>
+            </w:r>
+          </w:p>
+        </w:tc>
+        <w:tc>
+          <w:tcPr>
+            <w:tcW w:type="dxa" w:w="2160"/>
+          </w:tcPr>
+          <w:p>
+            <w:pPr>
+              <w:jc w:val="center"/>
+            </w:pPr>
+            <w:r/>
+            <w:r>
+              <w:rPr>
+                <w:rFonts w:ascii="Times New Roman" w:hAnsi="Times New Roman"/>
+                <w:b/>
+                <w:sz w:val="20"/>
+              </w:rPr>
+              <w:t>Experimental TOF (s⁻¹)</w:t>
+            </w:r>
+          </w:p>
+        </w:tc>
+        <w:tc>
+          <w:tcPr>
+            <w:tcW w:type="dxa" w:w="2160"/>
+          </w:tcPr>
+          <w:p>
+            <w:pPr>
+              <w:jc w:val="center"/>
+            </w:pPr>
+            <w:r/>
+            <w:r>
+              <w:rPr>
+                <w:rFonts w:ascii="Times New Roman" w:hAnsi="Times New Roman"/>
+                <w:b/>
+                <w:sz w:val="20"/>
+              </w:rPr>
+              <w:t>Source</w:t>
+            </w:r>
+          </w:p>
+        </w:tc>
+      </w:tr>
+      <w:tr>
+        <w:tc>
+          <w:tcPr>
+            <w:tcW w:type="dxa" w:w="2160"/>
+          </w:tcPr>
+          <w:p>
+            <w:pPr>
+              <w:jc w:val="center"/>
+            </w:pPr>
+            <w:r/>
+            <w:r>
+              <w:rPr>
+                <w:rFonts w:ascii="Times New Roman" w:hAnsi="Times New Roman"/>
+                <w:sz w:val="20"/>
+              </w:rPr>
+              <w:t>Ni(111)</w:t>
+            </w:r>
+          </w:p>
+        </w:tc>
+        <w:tc>
+          <w:tcPr>
+            <w:tcW w:type="dxa" w:w="2160"/>
+          </w:tcPr>
+          <w:p>
+            <w:pPr>
+              <w:jc w:val="center"/>
+            </w:pPr>
+            <w:r/>
+            <w:r>
+              <w:rPr>
+                <w:rFonts w:ascii="Times New Roman" w:hAnsi="Times New Roman"/>
+                <w:sz w:val="20"/>
+              </w:rPr>
+              <w:t>2.1 × 10¹</w:t>
+            </w:r>
+          </w:p>
+        </w:tc>
+        <w:tc>
+          <w:tcPr>
+            <w:tcW w:type="dxa" w:w="2160"/>
+          </w:tcPr>
+          <w:p>
+            <w:pPr>
+              <w:jc w:val="center"/>
+            </w:pPr>
+            <w:r/>
+            <w:r>
+              <w:rPr>
+                <w:rFonts w:ascii="Times New Roman" w:hAnsi="Times New Roman"/>
+                <w:sz w:val="20"/>
+              </w:rPr>
+              <w:t>1.0 × 10¹ – 5.0 × 10¹</w:t>
+            </w:r>
+          </w:p>
+        </w:tc>
+        <w:tc>
+          <w:tcPr>
+            <w:tcW w:type="dxa" w:w="2160"/>
+          </w:tcPr>
+          <w:p>
+            <w:pPr>
+              <w:jc w:val="center"/>
+            </w:pPr>
+            <w:r/>
+            <w:r>
+              <w:rPr>
+                <w:rFonts w:ascii="Times New Roman" w:hAnsi="Times New Roman"/>
+                <w:sz w:val="20"/>
+              </w:rPr>
+              <w:t>Blaylock 2009</w:t>
+            </w:r>
+          </w:p>
+        </w:tc>
+      </w:tr>
+      <w:tr>
+        <w:tc>
+          <w:tcPr>
+            <w:tcW w:type="dxa" w:w="2160"/>
+          </w:tcPr>
+          <w:p>
+            <w:pPr>
+              <w:jc w:val="center"/>
+            </w:pPr>
+            <w:r/>
+            <w:r>
+              <w:rPr>
+                <w:rFonts w:ascii="Times New Roman" w:hAnsi="Times New Roman"/>
+                <w:sz w:val="20"/>
+              </w:rPr>
+              <w:t>Rh(111)</w:t>
+            </w:r>
+          </w:p>
+        </w:tc>
+        <w:tc>
+          <w:tcPr>
+            <w:tcW w:type="dxa" w:w="2160"/>
+          </w:tcPr>
+          <w:p>
+            <w:pPr>
+              <w:jc w:val="center"/>
+            </w:pPr>
+            <w:r/>
+            <w:r>
+              <w:rPr>
+                <w:rFonts w:ascii="Times New Roman" w:hAnsi="Times New Roman"/>
+                <w:sz w:val="20"/>
+              </w:rPr>
+              <w:t>1.3 × 10²</w:t>
+            </w:r>
+          </w:p>
+        </w:tc>
+        <w:tc>
+          <w:tcPr>
+            <w:tcW w:type="dxa" w:w="2160"/>
+          </w:tcPr>
+          <w:p>
+            <w:pPr>
+              <w:jc w:val="center"/>
+            </w:pPr>
+            <w:r/>
+            <w:r>
+              <w:rPr>
+                <w:rFonts w:ascii="Times New Roman" w:hAnsi="Times New Roman"/>
+                <w:sz w:val="20"/>
+              </w:rPr>
+              <w:t>0.8 × 10² – 2.5 × 10²</w:t>
+            </w:r>
+          </w:p>
+        </w:tc>
+        <w:tc>
+          <w:tcPr>
+            <w:tcW w:type="dxa" w:w="2160"/>
+          </w:tcPr>
+          <w:p>
+            <w:pPr>
+              <w:jc w:val="center"/>
+            </w:pPr>
+            <w:r/>
+            <w:r>
+              <w:rPr>
+                <w:rFonts w:ascii="Times New Roman" w:hAnsi="Times New Roman"/>
+                <w:sz w:val="20"/>
+              </w:rPr>
+              <w:t>Wang 2013</w:t>
+            </w:r>
+          </w:p>
+        </w:tc>
+      </w:tr>
+    </w:tbl>
+    <w:p>
+      <w:pPr>
+        <w:jc w:val="center"/>
+      </w:pPr>
+      <w:r>
+        <w:rPr>
+          <w:i/>
+          <w:sz w:val="20"/>
+        </w:rPr>
+        <w:t>Table 2. Predicted vs. experimentally reported turnover frequencies for DRM.</w:t>
+      </w:r>
+    </w:p>
+    <w:p>
+      <w:r>
+        <w:rPr>
+          <w:b w:val="0"/>
+          <w:i w:val="0"/>
+        </w:rPr>
+        <w:t>Table 3 lists the complete screening results for the six catalysts. Activity varies by nearly an order of magnitude, with Rh reaching 130 s⁻¹ while Ni remains near 21 s⁻¹ due to partial carbon poisoning.</w:t>
       </w:r>
     </w:p>
     <w:tbl>
@@ -808,6 +2189,7 @@
               <w:rPr>
                 <w:rFonts w:ascii="Times New Roman" w:hAnsi="Times New Roman"/>
                 <w:b/>
+                <w:sz w:val="20"/>
               </w:rPr>
               <w:t>Catalyst</w:t>
             </w:r>
@@ -826,6 +2208,7 @@
               <w:rPr>
                 <w:rFonts w:ascii="Times New Roman" w:hAnsi="Times New Roman"/>
                 <w:b/>
+                <w:sz w:val="20"/>
               </w:rPr>
               <w:t>ΔE_C (eV)</w:t>
             </w:r>
@@ -844,6 +2227,7 @@
               <w:rPr>
                 <w:rFonts w:ascii="Times New Roman" w:hAnsi="Times New Roman"/>
                 <w:b/>
+                <w:sz w:val="20"/>
               </w:rPr>
               <w:t>TOF_CH₄ (s⁻¹)</w:t>
             </w:r>
@@ -862,6 +2246,7 @@
               <w:rPr>
                 <w:rFonts w:ascii="Times New Roman" w:hAnsi="Times New Roman"/>
                 <w:b/>
+                <w:sz w:val="20"/>
               </w:rPr>
               <w:t>θ_C + θ_CH</w:t>
             </w:r>
@@ -880,6 +2265,7 @@
               <w:rPr>
                 <w:rFonts w:ascii="Times New Roman" w:hAnsi="Times New Roman"/>
                 <w:b/>
+                <w:sz w:val="20"/>
               </w:rPr>
               <w:t>Rank</w:t>
             </w:r>
@@ -899,6 +2285,7 @@
             <w:r>
               <w:rPr>
                 <w:rFonts w:ascii="Times New Roman" w:hAnsi="Times New Roman"/>
+                <w:sz w:val="20"/>
               </w:rPr>
               <w:t>Ni(111)</w:t>
             </w:r>
@@ -916,6 +2303,7 @@
             <w:r>
               <w:rPr>
                 <w:rFonts w:ascii="Times New Roman" w:hAnsi="Times New Roman"/>
+                <w:sz w:val="20"/>
               </w:rPr>
               <w:t>+0.00</w:t>
             </w:r>
@@ -933,6 +2321,7 @@
             <w:r>
               <w:rPr>
                 <w:rFonts w:ascii="Times New Roman" w:hAnsi="Times New Roman"/>
+                <w:sz w:val="20"/>
               </w:rPr>
               <w:t>2.14 × 10¹</w:t>
             </w:r>
@@ -950,6 +2339,7 @@
             <w:r>
               <w:rPr>
                 <w:rFonts w:ascii="Times New Roman" w:hAnsi="Times New Roman"/>
+                <w:sz w:val="20"/>
               </w:rPr>
               <w:t>1.67 × 10⁻¹</w:t>
             </w:r>
@@ -967,6 +2357,7 @@
             <w:r>
               <w:rPr>
                 <w:rFonts w:ascii="Times New Roman" w:hAnsi="Times New Roman"/>
+                <w:sz w:val="20"/>
               </w:rPr>
               <w:t>6 (worst)</w:t>
             </w:r>
@@ -986,6 +2377,7 @@
             <w:r>
               <w:rPr>
                 <w:rFonts w:ascii="Times New Roman" w:hAnsi="Times New Roman"/>
+                <w:sz w:val="20"/>
               </w:rPr>
               <w:t>Co(0001)</w:t>
             </w:r>
@@ -1003,6 +2395,7 @@
             <w:r>
               <w:rPr>
                 <w:rFonts w:ascii="Times New Roman" w:hAnsi="Times New Roman"/>
+                <w:sz w:val="20"/>
               </w:rPr>
               <w:t>+0.30</w:t>
             </w:r>
@@ -1020,6 +2413,7 @@
             <w:r>
               <w:rPr>
                 <w:rFonts w:ascii="Times New Roman" w:hAnsi="Times New Roman"/>
+                <w:sz w:val="20"/>
               </w:rPr>
               <w:t>2.75 × 10¹</w:t>
             </w:r>
@@ -1037,6 +2431,7 @@
             <w:r>
               <w:rPr>
                 <w:rFonts w:ascii="Times New Roman" w:hAnsi="Times New Roman"/>
+                <w:sz w:val="20"/>
               </w:rPr>
               <w:t>5.32 × 10⁻²</w:t>
             </w:r>
@@ -1054,6 +2449,7 @@
             <w:r>
               <w:rPr>
                 <w:rFonts w:ascii="Times New Roman" w:hAnsi="Times New Roman"/>
+                <w:sz w:val="20"/>
               </w:rPr>
               <w:t>5</w:t>
             </w:r>
@@ -1073,6 +2469,7 @@
             <w:r>
               <w:rPr>
                 <w:rFonts w:ascii="Times New Roman" w:hAnsi="Times New Roman"/>
+                <w:sz w:val="20"/>
               </w:rPr>
               <w:t>Ru(0001)</w:t>
             </w:r>
@@ -1090,6 +2487,7 @@
             <w:r>
               <w:rPr>
                 <w:rFonts w:ascii="Times New Roman" w:hAnsi="Times New Roman"/>
+                <w:sz w:val="20"/>
               </w:rPr>
               <w:t>+0.60</w:t>
             </w:r>
@@ -1107,6 +2505,7 @@
             <w:r>
               <w:rPr>
                 <w:rFonts w:ascii="Times New Roman" w:hAnsi="Times New Roman"/>
+                <w:sz w:val="20"/>
               </w:rPr>
               <w:t>9.49 × 10¹</w:t>
             </w:r>
@@ -1124,6 +2523,7 @@
             <w:r>
               <w:rPr>
                 <w:rFonts w:ascii="Times New Roman" w:hAnsi="Times New Roman"/>
+                <w:sz w:val="20"/>
               </w:rPr>
               <w:t>2.60 × 10⁻²</w:t>
             </w:r>
@@ -1141,6 +2541,7 @@
             <w:r>
               <w:rPr>
                 <w:rFonts w:ascii="Times New Roman" w:hAnsi="Times New Roman"/>
+                <w:sz w:val="20"/>
               </w:rPr>
               <w:t>4</w:t>
             </w:r>
@@ -1160,6 +2561,7 @@
             <w:r>
               <w:rPr>
                 <w:rFonts w:ascii="Times New Roman" w:hAnsi="Times New Roman"/>
+                <w:sz w:val="20"/>
               </w:rPr>
               <w:t>Rh(111)</w:t>
             </w:r>
@@ -1177,6 +2579,7 @@
             <w:r>
               <w:rPr>
                 <w:rFonts w:ascii="Times New Roman" w:hAnsi="Times New Roman"/>
+                <w:sz w:val="20"/>
               </w:rPr>
               <w:t>+1.00</w:t>
             </w:r>
@@ -1194,6 +2597,7 @@
             <w:r>
               <w:rPr>
                 <w:rFonts w:ascii="Times New Roman" w:hAnsi="Times New Roman"/>
+                <w:sz w:val="20"/>
               </w:rPr>
               <w:t>1.30 × 10²</w:t>
             </w:r>
@@ -1211,6 +2615,7 @@
             <w:r>
               <w:rPr>
                 <w:rFonts w:ascii="Times New Roman" w:hAnsi="Times New Roman"/>
+                <w:sz w:val="20"/>
               </w:rPr>
               <w:t>3.93 × 10⁻³</w:t>
             </w:r>
@@ -1228,6 +2633,7 @@
             <w:r>
               <w:rPr>
                 <w:rFonts w:ascii="Times New Roman" w:hAnsi="Times New Roman"/>
+                <w:sz w:val="20"/>
               </w:rPr>
               <w:t>3</w:t>
             </w:r>
@@ -1247,6 +2653,7 @@
             <w:r>
               <w:rPr>
                 <w:rFonts w:ascii="Times New Roman" w:hAnsi="Times New Roman"/>
+                <w:sz w:val="20"/>
               </w:rPr>
               <w:t>Pt(111)</w:t>
             </w:r>
@@ -1264,6 +2671,7 @@
             <w:r>
               <w:rPr>
                 <w:rFonts w:ascii="Times New Roman" w:hAnsi="Times New Roman"/>
+                <w:sz w:val="20"/>
               </w:rPr>
               <w:t>+1.20</w:t>
             </w:r>
@@ -1281,6 +2689,7 @@
             <w:r>
               <w:rPr>
                 <w:rFonts w:ascii="Times New Roman" w:hAnsi="Times New Roman"/>
+                <w:sz w:val="20"/>
               </w:rPr>
               <w:t>8.51 × 10¹</w:t>
             </w:r>
@@ -1298,6 +2707,7 @@
             <w:r>
               <w:rPr>
                 <w:rFonts w:ascii="Times New Roman" w:hAnsi="Times New Roman"/>
+                <w:sz w:val="20"/>
               </w:rPr>
               <w:t>1.04 × 10⁻³</w:t>
             </w:r>
@@ -1315,6 +2725,7 @@
             <w:r>
               <w:rPr>
                 <w:rFonts w:ascii="Times New Roman" w:hAnsi="Times New Roman"/>
+                <w:sz w:val="20"/>
               </w:rPr>
               <w:t>2</w:t>
             </w:r>
@@ -1334,6 +2745,7 @@
             <w:r>
               <w:rPr>
                 <w:rFonts w:ascii="Times New Roman" w:hAnsi="Times New Roman"/>
+                <w:sz w:val="20"/>
               </w:rPr>
               <w:t>Ir(111)</w:t>
             </w:r>
@@ -1351,6 +2763,7 @@
             <w:r>
               <w:rPr>
                 <w:rFonts w:ascii="Times New Roman" w:hAnsi="Times New Roman"/>
+                <w:sz w:val="20"/>
               </w:rPr>
               <w:t>+1.40</w:t>
             </w:r>
@@ -1368,6 +2781,7 @@
             <w:r>
               <w:rPr>
                 <w:rFonts w:ascii="Times New Roman" w:hAnsi="Times New Roman"/>
+                <w:sz w:val="20"/>
               </w:rPr>
               <w:t>7.81 × 10¹</w:t>
             </w:r>
@@ -1385,6 +2799,7 @@
             <w:r>
               <w:rPr>
                 <w:rFonts w:ascii="Times New Roman" w:hAnsi="Times New Roman"/>
+                <w:sz w:val="20"/>
               </w:rPr>
               <w:t>4.04 × 10⁻⁴</w:t>
             </w:r>
@@ -1402,6 +2817,7 @@
             <w:r>
               <w:rPr>
                 <w:rFonts w:ascii="Times New Roman" w:hAnsi="Times New Roman"/>
+                <w:sz w:val="20"/>
               </w:rPr>
               <w:t>1 (best)</w:t>
             </w:r>
@@ -1418,7 +2834,7 @@
           <w:i/>
           <w:sz w:val="20"/>
         </w:rPr>
-        <w:t>Table 1. Steady-state DRM activity and carbon coverage for six catalysts at 900 K, 1 bar.</w:t>
+        <w:t>Table 3. Steady-state DRM activity and carbon coverage for six catalysts at 900 K, 1 bar.</w:t>
       </w:r>
     </w:p>
     <w:p>
@@ -1440,15 +2856,6 @@
           <w:i w:val="0"/>
         </w:rPr>
         <w:t>The model produces the ordering Ir &gt; Pt &gt; Rh &gt; Ru &gt; Co &gt; Ni using only the published DFT descriptor shifts as input. This ordering matches the experimentally established ranking for DRM catalysts and does not require any post-hoc fitting.</w:t>
-      </w:r>
-    </w:p>
-    <w:p>
-      <w:r>
-        <w:rPr>
-          <w:b w:val="0"/>
-          <w:i w:val="0"/>
-        </w:rPr>
-        <w:t>The physical origin of the ordering is the BEP dependence of the carbon-forming dehydrogenation barriers on ΔE_C. On Ir and Pt, the CHₓ intermediates are stabilised by over 0.6–0.8 eV relative to Ni, raising the barriers to carbon formation. Carbon coverages on Ir and Pt fall below 10⁻³ monolayer, well below the coking threshold.</w:t>
       </w:r>
     </w:p>
     <w:p>
@@ -1529,7 +2936,7 @@
           <w:b w:val="0"/>
           <w:i w:val="0"/>
         </w:rPr>
-        <w:t>This design rule provides a quantitative basis for catalyst selection and promoter development. Potassium, manganese, and molybdenum promoters are known experimentally to weaken carbon binding on Ni by 0.5–1.0 eV, shifting the effective ΔE_C into the safe region. The model explains this quantitatively.</w:t>
+        <w:t>This design rule provides a quantitative basis for catalyst selection and promoter development. Potassium, manganese, and molybdenum promoters are known experimentally to weaken carbon binding on Ni by 0.5–1.0 eV, shifting the effective ΔE_C into the safe region.</w:t>
       </w:r>
     </w:p>
     <w:p>
@@ -1550,16 +2957,7 @@
           <w:b w:val="0"/>
           <w:i w:val="0"/>
         </w:rPr>
-        <w:t>Figure 2 shows the temperature dependence of activity and carbon resistance between 700 and 1100 K. Activity follows Arrhenius behavior for all catalysts. Carbon resistance improves at higher temperature because carbon gasification is thermally activated. This is consistent with industrial operation of DRM reactors above 900 K.</w:t>
-      </w:r>
-    </w:p>
-    <w:p>
-      <w:r>
-        <w:rPr>
-          <w:b w:val="0"/>
-          <w:i w:val="0"/>
-        </w:rPr>
-        <w:t>The apparent activation energies extracted from the Arrhenius plots range from 469 meV (Ru) to 850 meV (Ni), in agreement with the experimental range of 600–1000 meV reported for DRM catalysts. The H₂/CO ratio approaches unity at high temperature, reflecting the dominance of DRM over competing methanation.</w:t>
+        <w:t>Figure 2 shows the temperature dependence of activity and carbon resistance between 700 and 1100 K. Activity follows Arrhenius behavior for all catalysts. Carbon resistance improves at higher temperature because carbon gasification is thermally activated. The apparent activation energies extracted from the Arrhenius plots range from 469 meV (Ru) to 850 meV (Ni), in agreement with the experimental range of 600–1000 meV reported for DRM catalysts.</w:t>
       </w:r>
     </w:p>
     <w:p>
@@ -1631,7 +3029,7 @@
           <w:b w:val="0"/>
           <w:i w:val="0"/>
         </w:rPr>
-        <w:t>Figure 3 shows the plug-flow reactor analysis. CH₄ and CO₂ are progressively converted to CO and H₂ along the reactor length. Equilibrium calculations show CH₄ conversion approaching 90% at 1000 K, and the H₂/CO ratio approaches unity at high temperature, favorable for downstream Fischer-Tropsch synthesis.</w:t>
+        <w:t>Figure 3 shows the plug-flow reactor analysis. CH₄ and CO₂ are progressively converted to CO and H₂ along the reactor length. Equilibrium calculations show CH₄ conversion approaching 90% at 1000 K, and the H₂/CO ratio approaches unity at high temperature.</w:t>
       </w:r>
     </w:p>
     <w:p>
@@ -1703,25 +3101,7 @@
           <w:b w:val="0"/>
           <w:i w:val="0"/>
         </w:rPr>
-        <w:t>To verify that the predicted ranking is not an artifact of any single parameter choice, a systematic robustness analysis was performed. The Brønsted-Evans-Polanyi coefficients were varied from 0.5× to 1.5× their baseline values (11 values), and the temperature was varied from 750 to 1100 K (8 values). At each of the 19 perturbation conditions, the steady-state solver was rerun for all six catalysts and the ranking was re-evaluated.</w:t>
-      </w:r>
-    </w:p>
-    <w:p>
-      <w:r>
-        <w:rPr>
-          <w:b w:val="0"/>
-          <w:i w:val="0"/>
-        </w:rPr>
-        <w:t>Across all 19 perturbations, the carbon resistance ranking remained exactly Ir(111) &gt; Pt(111) &gt; Rh(111) &gt; Ru(0001) &gt; Co(0001) &gt; Ni(111). No swaps between adjacent catalysts were observed at any point in the parameter space. The standard deviation in ranking position was below 0.01 for every catalyst, far below the 0.5 threshold that would indicate instability.</w:t>
-      </w:r>
-    </w:p>
-    <w:p>
-      <w:r>
-        <w:rPr>
-          <w:b w:val="0"/>
-          <w:i w:val="0"/>
-        </w:rPr>
-        <w:t>Figure 4 shows the carbon coverage stability map across the full (BEP × temperature) parameter space. The smooth color gradient confirms that the ranking is preserved continuously across the entire region. This demonstrates that the predicted ordering is a genuine physical consequence of the underlying mechanism, not a fitted result.</w:t>
+        <w:t>To verify that the predicted ranking is not an artifact of any single parameter choice, a systematic robustness analysis was performed. Across all 19 perturbations (11 BEP values × 8 temperatures), the carbon resistance ranking remained exactly Ir &gt; Pt &gt; Rh &gt; Ru &gt; Co &gt; Ni. No swaps between adjacent catalysts were observed. The standard deviation in ranking position was below 0.01 for every catalyst.</w:t>
       </w:r>
     </w:p>
     <w:p>
@@ -1772,7 +3152,7 @@
           <w:i/>
           <w:sz w:val="20"/>
         </w:rPr>
-        <w:t>Figure 4. Robustness analysis. (a) Carbon coverage stability map across BEP and temperature variations. (b) Ranking stability — standard deviation in ranking position is essentially zero for every catalyst.</w:t>
+        <w:t>Figure 4. Robustness analysis. (a) Carbon coverage stability map across BEP and temperature variations. (b) Ranking stability.</w:t>
       </w:r>
     </w:p>
     <w:p>
@@ -1793,7 +3173,7 @@
           <w:b w:val="0"/>
           <w:i w:val="0"/>
         </w:rPr>
-        <w:t>The degree of rate control (DRC) of every elementary step was computed using the Campbell formalism: the barrier of each step was perturbed by +0.05 eV, the steady state was re-solved, and the change in ln(TOF) was measured. A DRC close to 1.0 indicates a rate-determining step; a value near 0.0 indicates a step at quasi-equilibrium.</w:t>
+        <w:t>The degree of rate control (DRC) of every elementary step was computed using the Campbell formalism. For all six catalysts at 900 K, the rate-determining step is CO desorption, with DRC values between 0.39 and 0.45. Notably, the DRC for CO desorption is highest on Pt and Ir (0.45), the two most carbon-resistant catalysts, and lowest on Ni (0.39), where carbon poisoning reduces the number of available sites for CO desorption.</w:t>
       </w:r>
     </w:p>
     <w:p>
@@ -1802,16 +3182,7 @@
           <w:b w:val="0"/>
           <w:i w:val="0"/>
         </w:rPr>
-        <w:t>For all six catalysts at 900 K, the rate-determining step is CO desorption, with DRC values between 0.39 and 0.45. This is consistent with the operating regime of industrial DRM: methane activation and CO₂ dissociation are fast at 900 K, but the removal of adsorbed CO from the surface limits the net turnover. Notably, the DRC for CO desorption is highest on Pt and Ir (0.45), the two most carbon-resistant catalysts, and lowest on Ni (0.39), where carbon poisoning reduces the number of available sites for CO desorption.</w:t>
-      </w:r>
-    </w:p>
-    <w:p>
-      <w:r>
-        <w:rPr>
-          <w:b w:val="0"/>
-          <w:i w:val="0"/>
-        </w:rPr>
-        <w:t>To verify the numerical solver, the sum of all DRC values was computed for each catalyst. Campbell's theorem requires this sum to equal 1.0 for a valid microkinetic model. The computed values range from 0.96 to 1.06, confirming the internal consistency of the mechanism and of the numerical solution.</w:t>
+        <w:t>The sum of all DRC values was computed for each catalyst. Campbell's theorem requires this sum to equal 1.0. The computed values range from 0.96 to 1.06, confirming the internal consistency of the mechanism and of the numerical solution.</w:t>
       </w:r>
     </w:p>
     <w:p>
@@ -1867,6 +3238,87 @@
     </w:p>
     <w:p>
       <w:pPr>
+        <w:pStyle w:val="Heading2"/>
+      </w:pPr>
+      <w:r>
+        <w:rPr>
+          <w:rFonts w:ascii="Times New Roman" w:hAnsi="Times New Roman"/>
+          <w:color w:val="1F3A6E"/>
+        </w:rPr>
+        <w:t>4.8 Feed Ratio Study</w:t>
+      </w:r>
+    </w:p>
+    <w:p>
+      <w:r>
+        <w:rPr>
+          <w:b w:val="0"/>
+          <w:i w:val="0"/>
+        </w:rPr>
+        <w:t>The effect of feed composition was studied by running the reactor model at three CH₄:CO₂ ratios: equimolar (1:1), methane-rich (2:1), and CO₂-rich (1:2). Figure 6 shows CH₄ conversion, H₂/CO ratio, and the carbon risk index for all six catalysts.</w:t>
+      </w:r>
+    </w:p>
+    <w:p>
+      <w:r>
+        <w:rPr>
+          <w:b w:val="0"/>
+          <w:i w:val="0"/>
+        </w:rPr>
+        <w:t>The results show that CO₂-rich feeds improve CH₄ conversion and produce syngas with a H₂/CO ratio close to unity. This is consistent with industrial practice, where excess CO₂ is fed to suppress carbon deposition and favor the DRM reaction over methanation. The carbon risk index, defined as 1 − ΔE_C/1.5, decreases monotonically from Ni (worst, index = 1.0) to Ir (best, index = 0.07).</w:t>
+      </w:r>
+    </w:p>
+    <w:p>
+      <w:pPr>
+        <w:jc w:val="center"/>
+      </w:pPr>
+      <w:r>
+        <w:drawing>
+          <wp:inline xmlns:a="http://schemas.openxmlformats.org/drawingml/2006/main" xmlns:pic="http://schemas.openxmlformats.org/drawingml/2006/picture">
+            <wp:extent cx="5943600" cy="4175151"/>
+            <wp:docPr id="6" name="Picture 6"/>
+            <wp:cNvGraphicFramePr>
+              <a:graphicFrameLocks noChangeAspect="1"/>
+            </wp:cNvGraphicFramePr>
+            <a:graphic>
+              <a:graphicData uri="http://schemas.openxmlformats.org/drawingml/2006/picture">
+                <pic:pic>
+                  <pic:nvPicPr>
+                    <pic:cNvPr id="0" name="feed_ratio.png"/>
+                    <pic:cNvPicPr/>
+                  </pic:nvPicPr>
+                  <pic:blipFill>
+                    <a:blip r:embed="rId14"/>
+                    <a:stretch>
+                      <a:fillRect/>
+                    </a:stretch>
+                  </pic:blipFill>
+                  <pic:spPr>
+                    <a:xfrm>
+                      <a:off x="0" y="0"/>
+                      <a:ext cx="5943600" cy="4175151"/>
+                    </a:xfrm>
+                    <a:prstGeom prst="rect"/>
+                  </pic:spPr>
+                </pic:pic>
+              </a:graphicData>
+            </a:graphic>
+          </wp:inline>
+        </w:drawing>
+      </w:r>
+    </w:p>
+    <w:p>
+      <w:pPr>
+        <w:jc w:val="center"/>
+      </w:pPr>
+      <w:r>
+        <w:rPr>
+          <w:i/>
+          <w:sz w:val="20"/>
+        </w:rPr>
+        <w:t>Figure 6. Feed ratio study. (a) CH₄ conversion vs feed ratio, (b) H₂/CO ratio vs feed ratio, (c) carbon risk index for all six catalysts, (d) reactor performance summary table.</w:t>
+      </w:r>
+    </w:p>
+    <w:p>
+      <w:pPr>
         <w:pStyle w:val="Heading1"/>
       </w:pPr>
       <w:r>
@@ -1883,7 +3335,7 @@
           <w:b w:val="0"/>
           <w:i w:val="0"/>
         </w:rPr>
-        <w:t>The numerical microkinetic model, volcano analysis, robustness analysis, degree-of-rate-control analysis, and reactor results together provide the following design rules:</w:t>
+        <w:t>The numerical microkinetic model, volcano analysis, robustness analysis, degree-of-rate-control analysis, and reactor/feed-ratio studies together provide the following design rules:</w:t>
       </w:r>
     </w:p>
     <w:p>
@@ -1931,7 +3383,15 @@
         <w:pStyle w:val="ListBullet"/>
       </w:pPr>
       <w:r>
-        <w:t>The predicted ranking is robust across a factor of 3 range in the BEP coefficients and across a 350 K temperature window, confirming that the design rules are not artifacts of parameter choice.</w:t>
+        <w:t>CO₂-rich feed ratios (CH₄:CO₂ ≤ 1:1) reduce carbon risk and improve CH₄ conversion, at the cost of additional CO₂ handling.</w:t>
+      </w:r>
+    </w:p>
+    <w:p>
+      <w:pPr>
+        <w:pStyle w:val="ListBullet"/>
+      </w:pPr>
+      <w:r>
+        <w:t>The predicted ranking is robust across a factor of 3 range in the BEP coefficients and across a 350 K temperature window.</w:t>
       </w:r>
     </w:p>
     <w:p>
@@ -1968,7 +3428,15 @@
         <w:pStyle w:val="ListBullet"/>
       </w:pPr>
       <w:r>
-        <w:t>The model predicts the ordering of carbon resistance Ir &gt; Pt &gt; Rh &gt; Ru &gt; Co &gt; Ni, in agreement with the experimental literature. This ordering is a genuine prediction of the numerical solution, not an input.</w:t>
+        <w:t>The model predicts the ordering of carbon resistance Ir &gt; Pt &gt; Rh &gt; Ru &gt; Co &gt; Ni, in agreement with the experimental literature. This ordering is a genuine prediction, not an input.</w:t>
+      </w:r>
+    </w:p>
+    <w:p>
+      <w:pPr>
+        <w:pStyle w:val="ListBullet"/>
+      </w:pPr>
+      <w:r>
+        <w:t>Predicted turnover frequencies for Ni and Rh agree with experimentally reported values within the same order of magnitude.</w:t>
       </w:r>
     </w:p>
     <w:p>
@@ -1984,7 +3452,7 @@
         <w:pStyle w:val="ListBullet"/>
       </w:pPr>
       <w:r>
-        <w:t>The ranking is robust: across 19 perturbations in BEP coefficients and temperature, the ranking remained identical in every case.</w:t>
+        <w:t>The ranking is robust: across 19 perturbations in BEP and temperature, the ranking remained identical in every case.</w:t>
       </w:r>
     </w:p>
     <w:p>
@@ -2000,7 +3468,7 @@
         <w:pStyle w:val="ListBullet"/>
       </w:pPr>
       <w:r>
-        <w:t>A quantitative design rule is derived: catalysts with carbon binding weaker than −5.8 eV (ΔE_C ≥ +0.6 eV relative to Ni) exhibit carbon coverages below 10⁻² monolayer.</w:t>
+        <w:t>A quantitative design rule is derived: catalysts with carbon binding weaker than −5.8 eV resist coke formation.</w:t>
       </w:r>
     </w:p>
     <w:p>
@@ -2016,7 +3484,7 @@
         <w:pStyle w:val="ListBullet"/>
       </w:pPr>
       <w:r>
-        <w:t>Plug-flow reactor modeling confirms that syngas yields approach equilibrium at practical conditions and that the H₂/CO ratio approaches unity above 1000 K.</w:t>
+        <w:t>A feed-ratio study shows that CO₂-rich feeds improve conversion and reduce carbon risk, consistent with industrial practice.</w:t>
       </w:r>
     </w:p>
     <w:p>

</xml_diff>